<commit_message>
Diagrama de entidad relación corregido.
</commit_message>
<xml_diff>
--- a/documentacion/memoria_pi_danielcorreavilla.docx
+++ b/documentacion/memoria_pi_danielcorreavilla.docx
@@ -1141,23 +1141,7 @@
             <w:rFonts w:ascii="Times New Roman" w:hAnsi="Times New Roman" w:cs="Times New Roman"/>
             <w:lang w:val="es-ES"/>
           </w:rPr>
-          <w:t>https://github.com/DCV05/Proyect</w:t>
-        </w:r>
-        <w:r>
-          <w:rPr>
-            <w:rStyle w:val="Hyperlink"/>
-            <w:rFonts w:ascii="Times New Roman" w:hAnsi="Times New Roman" w:cs="Times New Roman"/>
-            <w:lang w:val="es-ES"/>
-          </w:rPr>
-          <w:t>o</w:t>
-        </w:r>
-        <w:r>
-          <w:rPr>
-            <w:rStyle w:val="Hyperlink"/>
-            <w:rFonts w:ascii="Times New Roman" w:hAnsi="Times New Roman" w:cs="Times New Roman"/>
-            <w:lang w:val="es-ES"/>
-          </w:rPr>
-          <w:t>-Integrador</w:t>
+          <w:t>https://github.com/DCV05/Proyecto-Integrador</w:t>
         </w:r>
       </w:hyperlink>
     </w:p>
@@ -3787,10 +3771,10 @@
           <w:lang w:val="es-ES"/>
         </w:rPr>
         <w:drawing>
-          <wp:inline distT="0" distB="0" distL="0" distR="0" wp14:anchorId="4031CCC6" wp14:editId="36335ABF">
-            <wp:extent cx="5614670" cy="4476750"/>
-            <wp:effectExtent l="0" t="0" r="0" b="6350"/>
-            <wp:docPr id="1584065671" name="Picture 5" descr="A diagram of a website&#10;&#10;Description automatically generated with medium confidence"/>
+          <wp:inline distT="0" distB="0" distL="0" distR="0" wp14:anchorId="7E612EE0" wp14:editId="673B5EC4">
+            <wp:extent cx="5398770" cy="4402455"/>
+            <wp:effectExtent l="0" t="0" r="0" b="4445"/>
+            <wp:docPr id="1684469928" name="Picture 1" descr="A diagram of a company&#10;&#10;Description automatically generated"/>
             <wp:cNvGraphicFramePr>
               <a:graphicFrameLocks xmlns:a="http://schemas.openxmlformats.org/drawingml/2006/main" noChangeAspect="1"/>
             </wp:cNvGraphicFramePr>
@@ -3798,7 +3782,7 @@
               <a:graphicData uri="http://schemas.openxmlformats.org/drawingml/2006/picture">
                 <pic:pic xmlns:pic="http://schemas.openxmlformats.org/drawingml/2006/picture">
                   <pic:nvPicPr>
-                    <pic:cNvPr id="1584065671" name="Picture 5" descr="A diagram of a website&#10;&#10;Description automatically generated with medium confidence"/>
+                    <pic:cNvPr id="1684469928" name="Picture 1" descr="A diagram of a company&#10;&#10;Description automatically generated"/>
                     <pic:cNvPicPr/>
                   </pic:nvPicPr>
                   <pic:blipFill>
@@ -3816,7 +3800,7 @@
                   <pic:spPr>
                     <a:xfrm>
                       <a:off x="0" y="0"/>
-                      <a:ext cx="5614670" cy="4476750"/>
+                      <a:ext cx="5398770" cy="4402455"/>
                     </a:xfrm>
                     <a:prstGeom prst="rect">
                       <a:avLst/>

</xml_diff>

<commit_message>
Modificación en la memoria. Bugfix: Llamadas ajax sin post añadidas
</commit_message>
<xml_diff>
--- a/documentacion/memoria_pi_danielcorreavilla.docx
+++ b/documentacion/memoria_pi_danielcorreavilla.docx
@@ -481,6 +481,8 @@
           <w:rFonts w:ascii="Times New Roman" w:hAnsi="Times New Roman" w:cs="Times New Roman"/>
           <w:b/>
           <w:bCs/>
+          <w:sz w:val="28"/>
+          <w:szCs w:val="28"/>
           <w:lang w:val="es-ES"/>
         </w:rPr>
       </w:pPr>
@@ -490,6 +492,8 @@
           <w:rFonts w:ascii="Times New Roman" w:hAnsi="Times New Roman" w:cs="Times New Roman"/>
           <w:b/>
           <w:bCs/>
+          <w:sz w:val="28"/>
+          <w:szCs w:val="28"/>
           <w:lang w:val="es-ES"/>
         </w:rPr>
         <w:t>Backend</w:t>
@@ -579,6 +583,8 @@
           <w:rFonts w:ascii="Times New Roman" w:hAnsi="Times New Roman" w:cs="Times New Roman"/>
           <w:b/>
           <w:bCs/>
+          <w:sz w:val="28"/>
+          <w:szCs w:val="28"/>
           <w:lang w:val="es-ES"/>
         </w:rPr>
       </w:pPr>
@@ -588,6 +594,8 @@
           <w:rFonts w:ascii="Times New Roman" w:hAnsi="Times New Roman" w:cs="Times New Roman"/>
           <w:b/>
           <w:bCs/>
+          <w:sz w:val="28"/>
+          <w:szCs w:val="28"/>
           <w:lang w:val="es-ES"/>
         </w:rPr>
         <w:t>Frontend</w:t>
@@ -707,16 +715,69 @@
         <w:jc w:val="both"/>
         <w:rPr>
           <w:rFonts w:ascii="Times New Roman" w:hAnsi="Times New Roman" w:cs="Times New Roman"/>
-          <w:b/>
-          <w:bCs/>
-          <w:lang w:val="es-ES"/>
-        </w:rPr>
-      </w:pPr>
-      <w:r>
-        <w:rPr>
-          <w:rFonts w:ascii="Times New Roman" w:hAnsi="Times New Roman" w:cs="Times New Roman"/>
-          <w:b/>
-          <w:bCs/>
+          <w:sz w:val="28"/>
+          <w:szCs w:val="28"/>
+        </w:rPr>
+      </w:pPr>
+      <w:proofErr w:type="spellStart"/>
+      <w:r>
+        <w:rPr>
+          <w:rFonts w:ascii="Times New Roman" w:hAnsi="Times New Roman" w:cs="Times New Roman"/>
+          <w:b/>
+          <w:bCs/>
+          <w:sz w:val="28"/>
+          <w:szCs w:val="28"/>
+        </w:rPr>
+        <w:t>Despliegue</w:t>
+      </w:r>
+      <w:proofErr w:type="spellEnd"/>
+    </w:p>
+    <w:p>
+      <w:pPr>
+        <w:spacing w:line="360" w:lineRule="auto"/>
+        <w:jc w:val="both"/>
+        <w:rPr>
+          <w:rFonts w:ascii="Times New Roman" w:hAnsi="Times New Roman" w:cs="Times New Roman"/>
+          <w:lang w:val="es-ES"/>
+        </w:rPr>
+      </w:pPr>
+      <w:r>
+        <w:rPr>
+          <w:rFonts w:ascii="Times New Roman" w:hAnsi="Times New Roman" w:cs="Times New Roman"/>
+        </w:rPr>
+        <w:t>Linux, Debian Bookworm, Docker, Docker-Compose, Apache, Git, GitHub, SSH Agent</w:t>
+      </w:r>
+    </w:p>
+    <w:p>
+      <w:pPr>
+        <w:spacing w:line="360" w:lineRule="auto"/>
+        <w:jc w:val="both"/>
+        <w:rPr>
+          <w:rFonts w:ascii="Times New Roman" w:hAnsi="Times New Roman" w:cs="Times New Roman"/>
+          <w:lang w:val="es-ES"/>
+        </w:rPr>
+      </w:pPr>
+    </w:p>
+    <w:p>
+      <w:pPr>
+        <w:spacing w:line="360" w:lineRule="auto"/>
+        <w:jc w:val="both"/>
+        <w:rPr>
+          <w:rFonts w:ascii="Times New Roman" w:hAnsi="Times New Roman" w:cs="Times New Roman"/>
+          <w:b/>
+          <w:bCs/>
+          <w:sz w:val="28"/>
+          <w:szCs w:val="28"/>
+          <w:lang w:val="es-ES"/>
+        </w:rPr>
+      </w:pPr>
+      <w:r>
+        <w:rPr>
+          <w:rFonts w:ascii="Times New Roman" w:hAnsi="Times New Roman" w:cs="Times New Roman"/>
+          <w:b/>
+          <w:bCs/>
+          <w:sz w:val="28"/>
+          <w:szCs w:val="28"/>
           <w:lang w:val="es-ES"/>
         </w:rPr>
         <w:t>Bases de datos</w:t>
@@ -762,202 +823,167 @@
         <w:jc w:val="both"/>
         <w:rPr>
           <w:rFonts w:ascii="Times New Roman" w:hAnsi="Times New Roman" w:cs="Times New Roman"/>
-        </w:rPr>
-      </w:pPr>
-      <w:proofErr w:type="spellStart"/>
-      <w:r>
-        <w:rPr>
-          <w:rFonts w:ascii="Times New Roman" w:hAnsi="Times New Roman" w:cs="Times New Roman"/>
-          <w:b/>
-          <w:bCs/>
-        </w:rPr>
-        <w:t>Despliegue</w:t>
-      </w:r>
-      <w:proofErr w:type="spellEnd"/>
-    </w:p>
-    <w:p>
-      <w:pPr>
-        <w:spacing w:line="360" w:lineRule="auto"/>
-        <w:jc w:val="both"/>
-        <w:rPr>
-          <w:rFonts w:ascii="Times New Roman" w:hAnsi="Times New Roman" w:cs="Times New Roman"/>
-        </w:rPr>
-      </w:pPr>
-      <w:r>
-        <w:rPr>
-          <w:rFonts w:ascii="Times New Roman" w:hAnsi="Times New Roman" w:cs="Times New Roman"/>
-        </w:rPr>
-        <w:t>Linux, Debian Bookworm, Docker, Docker-Compose, Apache, Git, GitHub, SSH Agent</w:t>
-      </w:r>
-    </w:p>
-    <w:p>
-      <w:pPr>
-        <w:spacing w:line="360" w:lineRule="auto"/>
-        <w:jc w:val="both"/>
-        <w:rPr>
-          <w:rFonts w:ascii="Times New Roman" w:hAnsi="Times New Roman" w:cs="Times New Roman"/>
-        </w:rPr>
-      </w:pPr>
-    </w:p>
-    <w:p>
-      <w:pPr>
-        <w:spacing w:line="360" w:lineRule="auto"/>
-        <w:jc w:val="both"/>
-        <w:rPr>
-          <w:rFonts w:ascii="Times New Roman" w:hAnsi="Times New Roman" w:cs="Times New Roman"/>
-        </w:rPr>
-      </w:pPr>
-    </w:p>
-    <w:p>
-      <w:pPr>
-        <w:spacing w:line="360" w:lineRule="auto"/>
-        <w:jc w:val="both"/>
-        <w:rPr>
-          <w:rFonts w:ascii="Times New Roman" w:hAnsi="Times New Roman" w:cs="Times New Roman"/>
-        </w:rPr>
-      </w:pPr>
-    </w:p>
-    <w:p>
-      <w:pPr>
-        <w:spacing w:line="360" w:lineRule="auto"/>
-        <w:jc w:val="both"/>
-        <w:rPr>
-          <w:rFonts w:ascii="Times New Roman" w:hAnsi="Times New Roman" w:cs="Times New Roman"/>
-        </w:rPr>
-      </w:pPr>
-    </w:p>
-    <w:p>
-      <w:pPr>
-        <w:spacing w:line="360" w:lineRule="auto"/>
-        <w:jc w:val="both"/>
-        <w:rPr>
-          <w:rFonts w:ascii="Times New Roman" w:hAnsi="Times New Roman" w:cs="Times New Roman"/>
-        </w:rPr>
-      </w:pPr>
-    </w:p>
-    <w:p>
-      <w:pPr>
-        <w:spacing w:line="360" w:lineRule="auto"/>
-        <w:jc w:val="both"/>
-        <w:rPr>
-          <w:rFonts w:ascii="Times New Roman" w:hAnsi="Times New Roman" w:cs="Times New Roman"/>
-        </w:rPr>
-      </w:pPr>
-    </w:p>
-    <w:p>
-      <w:pPr>
-        <w:spacing w:line="360" w:lineRule="auto"/>
-        <w:jc w:val="both"/>
-        <w:rPr>
-          <w:rFonts w:ascii="Times New Roman" w:hAnsi="Times New Roman" w:cs="Times New Roman"/>
-        </w:rPr>
-      </w:pPr>
-    </w:p>
-    <w:p>
-      <w:pPr>
-        <w:spacing w:line="360" w:lineRule="auto"/>
-        <w:jc w:val="both"/>
-        <w:rPr>
-          <w:rFonts w:ascii="Times New Roman" w:hAnsi="Times New Roman" w:cs="Times New Roman"/>
-        </w:rPr>
-      </w:pPr>
-    </w:p>
-    <w:p>
-      <w:pPr>
-        <w:spacing w:line="360" w:lineRule="auto"/>
-        <w:jc w:val="both"/>
-        <w:rPr>
-          <w:rFonts w:ascii="Times New Roman" w:hAnsi="Times New Roman" w:cs="Times New Roman"/>
-        </w:rPr>
-      </w:pPr>
-    </w:p>
-    <w:p>
-      <w:pPr>
-        <w:spacing w:line="360" w:lineRule="auto"/>
-        <w:jc w:val="both"/>
-        <w:rPr>
-          <w:rFonts w:ascii="Times New Roman" w:hAnsi="Times New Roman" w:cs="Times New Roman"/>
-        </w:rPr>
-      </w:pPr>
-    </w:p>
-    <w:p>
-      <w:pPr>
-        <w:spacing w:line="360" w:lineRule="auto"/>
-        <w:jc w:val="both"/>
-        <w:rPr>
-          <w:rFonts w:ascii="Times New Roman" w:hAnsi="Times New Roman" w:cs="Times New Roman"/>
-        </w:rPr>
-      </w:pPr>
-    </w:p>
-    <w:p>
-      <w:pPr>
-        <w:spacing w:line="360" w:lineRule="auto"/>
-        <w:jc w:val="both"/>
-        <w:rPr>
-          <w:rFonts w:ascii="Times New Roman" w:hAnsi="Times New Roman" w:cs="Times New Roman"/>
-        </w:rPr>
-      </w:pPr>
-    </w:p>
-    <w:p>
-      <w:pPr>
-        <w:spacing w:line="360" w:lineRule="auto"/>
-        <w:jc w:val="both"/>
-        <w:rPr>
-          <w:rFonts w:ascii="Times New Roman" w:hAnsi="Times New Roman" w:cs="Times New Roman"/>
-        </w:rPr>
-      </w:pPr>
-    </w:p>
-    <w:p>
-      <w:pPr>
-        <w:spacing w:line="360" w:lineRule="auto"/>
-        <w:jc w:val="both"/>
-        <w:rPr>
-          <w:rFonts w:ascii="Times New Roman" w:hAnsi="Times New Roman" w:cs="Times New Roman"/>
-        </w:rPr>
-      </w:pPr>
-    </w:p>
-    <w:p>
-      <w:pPr>
-        <w:spacing w:line="360" w:lineRule="auto"/>
-        <w:jc w:val="both"/>
-        <w:rPr>
-          <w:rFonts w:ascii="Times New Roman" w:hAnsi="Times New Roman" w:cs="Times New Roman"/>
-        </w:rPr>
-      </w:pPr>
-    </w:p>
-    <w:p>
-      <w:pPr>
-        <w:spacing w:line="360" w:lineRule="auto"/>
-        <w:jc w:val="both"/>
-        <w:rPr>
-          <w:rFonts w:ascii="Times New Roman" w:hAnsi="Times New Roman" w:cs="Times New Roman"/>
-        </w:rPr>
-      </w:pPr>
-    </w:p>
-    <w:p>
-      <w:pPr>
-        <w:spacing w:line="360" w:lineRule="auto"/>
-        <w:jc w:val="both"/>
-        <w:rPr>
-          <w:rFonts w:ascii="Times New Roman" w:hAnsi="Times New Roman" w:cs="Times New Roman"/>
-        </w:rPr>
-      </w:pPr>
-    </w:p>
-    <w:p>
-      <w:pPr>
-        <w:spacing w:line="360" w:lineRule="auto"/>
-        <w:jc w:val="both"/>
-        <w:rPr>
-          <w:rFonts w:ascii="Times New Roman" w:hAnsi="Times New Roman" w:cs="Times New Roman"/>
-        </w:rPr>
-      </w:pPr>
-    </w:p>
-    <w:p>
-      <w:pPr>
-        <w:spacing w:line="360" w:lineRule="auto"/>
-        <w:jc w:val="both"/>
-        <w:rPr>
-          <w:rFonts w:ascii="Times New Roman" w:hAnsi="Times New Roman" w:cs="Times New Roman"/>
+          <w:lang w:val="es-ES"/>
+        </w:rPr>
+      </w:pPr>
+    </w:p>
+    <w:p>
+      <w:pPr>
+        <w:spacing w:line="360" w:lineRule="auto"/>
+        <w:jc w:val="both"/>
+        <w:rPr>
+          <w:rFonts w:ascii="Times New Roman" w:hAnsi="Times New Roman" w:cs="Times New Roman"/>
+          <w:lang w:val="es-ES"/>
+        </w:rPr>
+      </w:pPr>
+    </w:p>
+    <w:p>
+      <w:pPr>
+        <w:spacing w:line="360" w:lineRule="auto"/>
+        <w:jc w:val="both"/>
+        <w:rPr>
+          <w:rFonts w:ascii="Times New Roman" w:hAnsi="Times New Roman" w:cs="Times New Roman"/>
+          <w:lang w:val="es-ES"/>
+        </w:rPr>
+      </w:pPr>
+    </w:p>
+    <w:p>
+      <w:pPr>
+        <w:spacing w:line="360" w:lineRule="auto"/>
+        <w:jc w:val="both"/>
+        <w:rPr>
+          <w:rFonts w:ascii="Times New Roman" w:hAnsi="Times New Roman" w:cs="Times New Roman"/>
+          <w:lang w:val="es-ES"/>
+        </w:rPr>
+      </w:pPr>
+    </w:p>
+    <w:p>
+      <w:pPr>
+        <w:spacing w:line="360" w:lineRule="auto"/>
+        <w:jc w:val="both"/>
+        <w:rPr>
+          <w:rFonts w:ascii="Times New Roman" w:hAnsi="Times New Roman" w:cs="Times New Roman"/>
+          <w:lang w:val="es-ES"/>
+        </w:rPr>
+      </w:pPr>
+    </w:p>
+    <w:p>
+      <w:pPr>
+        <w:spacing w:line="360" w:lineRule="auto"/>
+        <w:jc w:val="both"/>
+        <w:rPr>
+          <w:rFonts w:ascii="Times New Roman" w:hAnsi="Times New Roman" w:cs="Times New Roman"/>
+          <w:lang w:val="es-ES"/>
+        </w:rPr>
+      </w:pPr>
+    </w:p>
+    <w:p>
+      <w:pPr>
+        <w:spacing w:line="360" w:lineRule="auto"/>
+        <w:jc w:val="both"/>
+        <w:rPr>
+          <w:rFonts w:ascii="Times New Roman" w:hAnsi="Times New Roman" w:cs="Times New Roman"/>
+          <w:lang w:val="es-ES"/>
+        </w:rPr>
+      </w:pPr>
+    </w:p>
+    <w:p>
+      <w:pPr>
+        <w:spacing w:line="360" w:lineRule="auto"/>
+        <w:jc w:val="both"/>
+        <w:rPr>
+          <w:rFonts w:ascii="Times New Roman" w:hAnsi="Times New Roman" w:cs="Times New Roman"/>
+          <w:lang w:val="es-ES"/>
+        </w:rPr>
+      </w:pPr>
+    </w:p>
+    <w:p>
+      <w:pPr>
+        <w:spacing w:line="360" w:lineRule="auto"/>
+        <w:jc w:val="both"/>
+        <w:rPr>
+          <w:rFonts w:ascii="Times New Roman" w:hAnsi="Times New Roman" w:cs="Times New Roman"/>
+          <w:lang w:val="es-ES"/>
+        </w:rPr>
+      </w:pPr>
+    </w:p>
+    <w:p>
+      <w:pPr>
+        <w:spacing w:line="360" w:lineRule="auto"/>
+        <w:jc w:val="both"/>
+        <w:rPr>
+          <w:rFonts w:ascii="Times New Roman" w:hAnsi="Times New Roman" w:cs="Times New Roman"/>
+          <w:lang w:val="es-ES"/>
+        </w:rPr>
+      </w:pPr>
+    </w:p>
+    <w:p>
+      <w:pPr>
+        <w:spacing w:line="360" w:lineRule="auto"/>
+        <w:jc w:val="both"/>
+        <w:rPr>
+          <w:rFonts w:ascii="Times New Roman" w:hAnsi="Times New Roman" w:cs="Times New Roman"/>
+          <w:lang w:val="es-ES"/>
+        </w:rPr>
+      </w:pPr>
+    </w:p>
+    <w:p>
+      <w:pPr>
+        <w:spacing w:line="360" w:lineRule="auto"/>
+        <w:jc w:val="both"/>
+        <w:rPr>
+          <w:rFonts w:ascii="Times New Roman" w:hAnsi="Times New Roman" w:cs="Times New Roman"/>
+          <w:lang w:val="es-ES"/>
+        </w:rPr>
+      </w:pPr>
+    </w:p>
+    <w:p>
+      <w:pPr>
+        <w:spacing w:line="360" w:lineRule="auto"/>
+        <w:jc w:val="both"/>
+        <w:rPr>
+          <w:rFonts w:ascii="Times New Roman" w:hAnsi="Times New Roman" w:cs="Times New Roman"/>
+          <w:lang w:val="es-ES"/>
+        </w:rPr>
+      </w:pPr>
+    </w:p>
+    <w:p>
+      <w:pPr>
+        <w:spacing w:line="360" w:lineRule="auto"/>
+        <w:jc w:val="both"/>
+        <w:rPr>
+          <w:rFonts w:ascii="Times New Roman" w:hAnsi="Times New Roman" w:cs="Times New Roman"/>
+          <w:lang w:val="es-ES"/>
+        </w:rPr>
+      </w:pPr>
+    </w:p>
+    <w:p>
+      <w:pPr>
+        <w:spacing w:line="360" w:lineRule="auto"/>
+        <w:jc w:val="both"/>
+        <w:rPr>
+          <w:rFonts w:ascii="Times New Roman" w:hAnsi="Times New Roman" w:cs="Times New Roman"/>
+          <w:lang w:val="es-ES"/>
+        </w:rPr>
+      </w:pPr>
+    </w:p>
+    <w:p>
+      <w:pPr>
+        <w:spacing w:line="360" w:lineRule="auto"/>
+        <w:jc w:val="both"/>
+        <w:rPr>
+          <w:rFonts w:ascii="Times New Roman" w:hAnsi="Times New Roman" w:cs="Times New Roman"/>
+          <w:lang w:val="es-ES"/>
+        </w:rPr>
+      </w:pPr>
+    </w:p>
+    <w:p>
+      <w:pPr>
+        <w:spacing w:line="360" w:lineRule="auto"/>
+        <w:jc w:val="both"/>
+        <w:rPr>
+          <w:rFonts w:ascii="Times New Roman" w:hAnsi="Times New Roman" w:cs="Times New Roman"/>
+          <w:lang w:val="es-ES"/>
         </w:rPr>
       </w:pPr>
     </w:p>
@@ -8010,8 +8036,7 @@
     </w:p>
     <w:p>
       <w:pPr>
-        <w:spacing w:line="360" w:lineRule="auto"/>
-        <w:jc w:val="both"/>
+        <w:pStyle w:val="Heading2"/>
         <w:rPr>
           <w:rFonts w:ascii="Times New Roman" w:hAnsi="Times New Roman" w:cs="Times New Roman"/>
           <w:b/>
@@ -8021,11 +8046,11 @@
           <w:lang w:val="es-ES"/>
         </w:rPr>
       </w:pPr>
-    </w:p>
-    <w:p>
-      <w:pPr>
-        <w:spacing w:line="360" w:lineRule="auto"/>
-        <w:jc w:val="both"/>
+      <w:bookmarkStart w:id="9" w:name="_Toc189846481"/>
+    </w:p>
+    <w:p>
+      <w:pPr>
+        <w:pStyle w:val="Heading2"/>
         <w:rPr>
           <w:rFonts w:ascii="Times New Roman" w:hAnsi="Times New Roman" w:cs="Times New Roman"/>
           <w:b/>
@@ -8038,8 +8063,7 @@
     </w:p>
     <w:p>
       <w:pPr>
-        <w:spacing w:line="360" w:lineRule="auto"/>
-        <w:jc w:val="both"/>
+        <w:pStyle w:val="Heading2"/>
         <w:rPr>
           <w:rFonts w:ascii="Times New Roman" w:hAnsi="Times New Roman" w:cs="Times New Roman"/>
           <w:b/>
@@ -8052,8 +8076,7 @@
     </w:p>
     <w:p>
       <w:pPr>
-        <w:spacing w:line="360" w:lineRule="auto"/>
-        <w:jc w:val="both"/>
+        <w:pStyle w:val="Heading2"/>
         <w:rPr>
           <w:rFonts w:ascii="Times New Roman" w:hAnsi="Times New Roman" w:cs="Times New Roman"/>
           <w:b/>
@@ -8066,8 +8089,7 @@
     </w:p>
     <w:p>
       <w:pPr>
-        <w:spacing w:line="360" w:lineRule="auto"/>
-        <w:jc w:val="both"/>
+        <w:pStyle w:val="Heading2"/>
         <w:rPr>
           <w:rFonts w:ascii="Times New Roman" w:hAnsi="Times New Roman" w:cs="Times New Roman"/>
           <w:b/>
@@ -8080,8 +8102,7 @@
     </w:p>
     <w:p>
       <w:pPr>
-        <w:spacing w:line="360" w:lineRule="auto"/>
-        <w:jc w:val="both"/>
+        <w:pStyle w:val="Heading2"/>
         <w:rPr>
           <w:rFonts w:ascii="Times New Roman" w:hAnsi="Times New Roman" w:cs="Times New Roman"/>
           <w:b/>
@@ -8094,8 +8115,7 @@
     </w:p>
     <w:p>
       <w:pPr>
-        <w:spacing w:line="360" w:lineRule="auto"/>
-        <w:jc w:val="both"/>
+        <w:pStyle w:val="Heading2"/>
         <w:rPr>
           <w:rFonts w:ascii="Times New Roman" w:hAnsi="Times New Roman" w:cs="Times New Roman"/>
           <w:b/>
@@ -8108,8 +8128,14 @@
     </w:p>
     <w:p>
       <w:pPr>
-        <w:spacing w:line="360" w:lineRule="auto"/>
-        <w:jc w:val="both"/>
+        <w:rPr>
+          <w:lang w:val="es-ES"/>
+        </w:rPr>
+      </w:pPr>
+    </w:p>
+    <w:p>
+      <w:pPr>
+        <w:pStyle w:val="Heading2"/>
         <w:rPr>
           <w:rFonts w:ascii="Times New Roman" w:hAnsi="Times New Roman" w:cs="Times New Roman"/>
           <w:b/>
@@ -8119,62 +8145,6 @@
           <w:lang w:val="es-ES"/>
         </w:rPr>
       </w:pPr>
-    </w:p>
-    <w:p>
-      <w:pPr>
-        <w:spacing w:line="360" w:lineRule="auto"/>
-        <w:jc w:val="both"/>
-        <w:rPr>
-          <w:rFonts w:ascii="Times New Roman" w:hAnsi="Times New Roman" w:cs="Times New Roman"/>
-          <w:b/>
-          <w:bCs/>
-          <w:sz w:val="28"/>
-          <w:szCs w:val="28"/>
-          <w:lang w:val="es-ES"/>
-        </w:rPr>
-      </w:pPr>
-    </w:p>
-    <w:p>
-      <w:pPr>
-        <w:spacing w:line="360" w:lineRule="auto"/>
-        <w:jc w:val="both"/>
-        <w:rPr>
-          <w:rFonts w:ascii="Times New Roman" w:hAnsi="Times New Roman" w:cs="Times New Roman"/>
-          <w:b/>
-          <w:bCs/>
-          <w:sz w:val="28"/>
-          <w:szCs w:val="28"/>
-          <w:lang w:val="es-ES"/>
-        </w:rPr>
-      </w:pPr>
-    </w:p>
-    <w:p>
-      <w:pPr>
-        <w:spacing w:line="360" w:lineRule="auto"/>
-        <w:jc w:val="both"/>
-        <w:rPr>
-          <w:rFonts w:ascii="Times New Roman" w:hAnsi="Times New Roman" w:cs="Times New Roman"/>
-          <w:b/>
-          <w:bCs/>
-          <w:sz w:val="28"/>
-          <w:szCs w:val="28"/>
-          <w:lang w:val="es-ES"/>
-        </w:rPr>
-      </w:pPr>
-    </w:p>
-    <w:p>
-      <w:pPr>
-        <w:pStyle w:val="Heading2"/>
-        <w:rPr>
-          <w:rFonts w:ascii="Times New Roman" w:hAnsi="Times New Roman" w:cs="Times New Roman"/>
-          <w:b/>
-          <w:bCs/>
-          <w:sz w:val="28"/>
-          <w:szCs w:val="28"/>
-          <w:lang w:val="es-ES"/>
-        </w:rPr>
-      </w:pPr>
-      <w:bookmarkStart w:id="9" w:name="_Toc189846481"/>
       <w:r>
         <w:rPr>
           <w:rFonts w:ascii="Times New Roman" w:hAnsi="Times New Roman" w:cs="Times New Roman"/>
@@ -18208,21 +18178,23 @@
           <w:b/>
           <w:bCs/>
           <w:noProof/>
+          <w:sz w:val="32"/>
+          <w:szCs w:val="32"/>
           <w:lang w:val="es-ES"/>
         </w:rPr>
         <w:drawing>
-          <wp:anchor distT="0" distB="0" distL="114300" distR="114300" simplePos="0" relativeHeight="251662336" behindDoc="0" locked="0" layoutInCell="1" allowOverlap="1" wp14:anchorId="4EC14DC6" wp14:editId="1FFD3BD0">
+          <wp:anchor distT="0" distB="0" distL="114300" distR="114300" simplePos="0" relativeHeight="251662336" behindDoc="0" locked="0" layoutInCell="1" allowOverlap="1" wp14:anchorId="3A7E3D1B" wp14:editId="58FE95D5">
             <wp:simplePos x="0" y="0"/>
             <wp:positionH relativeFrom="margin">
-              <wp:align>center</wp:align>
+              <wp:posOffset>8978</wp:posOffset>
             </wp:positionH>
             <wp:positionV relativeFrom="margin">
-              <wp:align>bottom</wp:align>
+              <wp:posOffset>3500949</wp:posOffset>
             </wp:positionV>
-            <wp:extent cx="6823710" cy="3749040"/>
+            <wp:extent cx="5398770" cy="5327015"/>
             <wp:effectExtent l="0" t="0" r="0" b="0"/>
             <wp:wrapSquare wrapText="bothSides"/>
-            <wp:docPr id="852004293" name="Picture 1" descr="A diagram of a program&#10;&#10;Description automatically generated"/>
+            <wp:docPr id="2039409983" name="Picture 1" descr="A screenshot of a computer&#10;&#10;Description automatically generated"/>
             <wp:cNvGraphicFramePr>
               <a:graphicFrameLocks xmlns:a="http://schemas.openxmlformats.org/drawingml/2006/main" noChangeAspect="1"/>
             </wp:cNvGraphicFramePr>
@@ -18230,11 +18202,11 @@
               <a:graphicData uri="http://schemas.openxmlformats.org/drawingml/2006/picture">
                 <pic:pic xmlns:pic="http://schemas.openxmlformats.org/drawingml/2006/picture">
                   <pic:nvPicPr>
-                    <pic:cNvPr id="852004293" name="Picture 1" descr="A diagram of a program&#10;&#10;Description automatically generated"/>
+                    <pic:cNvPr id="2039409983" name="Picture 1" descr="A screenshot of a computer&#10;&#10;Description automatically generated"/>
                     <pic:cNvPicPr/>
                   </pic:nvPicPr>
                   <pic:blipFill>
-                    <a:blip r:embed="rId11">
+                    <a:blip r:embed="rId11" cstate="print">
                       <a:extLst>
                         <a:ext uri="{28A0092B-C50C-407E-A947-70E740481C1C}">
                           <a14:useLocalDpi xmlns:a14="http://schemas.microsoft.com/office/drawing/2010/main" val="0"/>
@@ -18248,7 +18220,7 @@
                   <pic:spPr>
                     <a:xfrm>
                       <a:off x="0" y="0"/>
-                      <a:ext cx="6823710" cy="3749040"/>
+                      <a:ext cx="5398770" cy="5327015"/>
                     </a:xfrm>
                     <a:prstGeom prst="rect">
                       <a:avLst/>
@@ -18257,12 +18229,6 @@
                 </pic:pic>
               </a:graphicData>
             </a:graphic>
-            <wp14:sizeRelH relativeFrom="margin">
-              <wp14:pctWidth>0</wp14:pctWidth>
-            </wp14:sizeRelH>
-            <wp14:sizeRelV relativeFrom="margin">
-              <wp14:pctHeight>0</wp14:pctHeight>
-            </wp14:sizeRelV>
           </wp:anchor>
         </w:drawing>
       </w:r>
@@ -19455,33 +19421,11 @@
     </w:tbl>
     <w:p>
       <w:pPr>
-        <w:pStyle w:val="Heading1"/>
-        <w:spacing w:line="360" w:lineRule="auto"/>
-        <w:jc w:val="both"/>
-        <w:rPr>
-          <w:rFonts w:ascii="Times New Roman" w:hAnsi="Times New Roman" w:cs="Times New Roman"/>
-          <w:b/>
-          <w:bCs/>
-          <w:sz w:val="32"/>
-          <w:szCs w:val="32"/>
+        <w:rPr>
           <w:lang w:val="es-ES"/>
         </w:rPr>
       </w:pPr>
       <w:bookmarkStart w:id="10" w:name="_Toc189846482"/>
-    </w:p>
-    <w:p>
-      <w:pPr>
-        <w:rPr>
-          <w:lang w:val="es-ES"/>
-        </w:rPr>
-      </w:pPr>
-    </w:p>
-    <w:p>
-      <w:pPr>
-        <w:rPr>
-          <w:lang w:val="es-ES"/>
-        </w:rPr>
-      </w:pPr>
     </w:p>
     <w:p>
       <w:pPr>
@@ -20398,13 +20342,13 @@
           <w:lang w:val="es-ES"/>
         </w:rPr>
         <w:drawing>
-          <wp:anchor distT="0" distB="0" distL="114300" distR="114300" simplePos="0" relativeHeight="251659264" behindDoc="0" locked="0" layoutInCell="1" allowOverlap="1" wp14:anchorId="660C2B27" wp14:editId="3DB41083">
+          <wp:anchor distT="0" distB="0" distL="114300" distR="114300" simplePos="0" relativeHeight="251659264" behindDoc="0" locked="0" layoutInCell="1" allowOverlap="1" wp14:anchorId="660C2B27" wp14:editId="7AD060FD">
             <wp:simplePos x="0" y="0"/>
             <wp:positionH relativeFrom="margin">
-              <wp:posOffset>-11210</wp:posOffset>
+              <wp:posOffset>-109855</wp:posOffset>
             </wp:positionH>
             <wp:positionV relativeFrom="margin">
-              <wp:posOffset>3466760</wp:posOffset>
+              <wp:posOffset>2886075</wp:posOffset>
             </wp:positionV>
             <wp:extent cx="5659755" cy="5659755"/>
             <wp:effectExtent l="0" t="0" r="4445" b="4445"/>
@@ -20525,30 +20469,221 @@
           <w:lang w:val="es-ES"/>
         </w:rPr>
       </w:pPr>
-    </w:p>
-    <w:p>
-      <w:pPr>
-        <w:spacing w:line="360" w:lineRule="auto"/>
-        <w:jc w:val="both"/>
-        <w:rPr>
-          <w:rFonts w:ascii="Times New Roman" w:hAnsi="Times New Roman" w:cs="Times New Roman"/>
-          <w:lang w:val="es-ES"/>
-        </w:rPr>
-      </w:pPr>
-      <w:r>
-        <w:rPr>
-          <w:rFonts w:ascii="Times New Roman" w:hAnsi="Times New Roman" w:cs="Times New Roman"/>
+      <w:r>
+        <w:rPr>
+          <w:rFonts w:ascii="Times New Roman" w:hAnsi="Times New Roman" w:cs="Times New Roman"/>
+          <w:b/>
+          <w:bCs/>
           <w:noProof/>
+          <w:sz w:val="32"/>
+          <w:szCs w:val="32"/>
           <w:lang w:val="es-ES"/>
         </w:rPr>
         <w:drawing>
-          <wp:anchor distT="0" distB="0" distL="114300" distR="114300" simplePos="0" relativeHeight="251660288" behindDoc="0" locked="0" layoutInCell="1" allowOverlap="1" wp14:anchorId="7E612EE0" wp14:editId="71A895C4">
+          <wp:anchor distT="0" distB="0" distL="114300" distR="114300" simplePos="0" relativeHeight="251664384" behindDoc="0" locked="0" layoutInCell="1" allowOverlap="1" wp14:anchorId="0CA256E6" wp14:editId="262E4AF6">
             <wp:simplePos x="0" y="0"/>
             <wp:positionH relativeFrom="margin">
-              <wp:posOffset>-100965</wp:posOffset>
+              <wp:posOffset>57785</wp:posOffset>
             </wp:positionH>
             <wp:positionV relativeFrom="margin">
-              <wp:posOffset>1275715</wp:posOffset>
+              <wp:posOffset>974090</wp:posOffset>
+            </wp:positionV>
+            <wp:extent cx="5398770" cy="5327015"/>
+            <wp:effectExtent l="0" t="0" r="0" b="0"/>
+            <wp:wrapSquare wrapText="bothSides"/>
+            <wp:docPr id="802428284" name="Picture 1" descr="A screenshot of a computer&#10;&#10;Description automatically generated"/>
+            <wp:cNvGraphicFramePr>
+              <a:graphicFrameLocks xmlns:a="http://schemas.openxmlformats.org/drawingml/2006/main" noChangeAspect="1"/>
+            </wp:cNvGraphicFramePr>
+            <a:graphic xmlns:a="http://schemas.openxmlformats.org/drawingml/2006/main">
+              <a:graphicData uri="http://schemas.openxmlformats.org/drawingml/2006/picture">
+                <pic:pic xmlns:pic="http://schemas.openxmlformats.org/drawingml/2006/picture">
+                  <pic:nvPicPr>
+                    <pic:cNvPr id="2039409983" name="Picture 1" descr="A screenshot of a computer&#10;&#10;Description automatically generated"/>
+                    <pic:cNvPicPr/>
+                  </pic:nvPicPr>
+                  <pic:blipFill>
+                    <a:blip r:embed="rId11" cstate="print">
+                      <a:extLst>
+                        <a:ext uri="{28A0092B-C50C-407E-A947-70E740481C1C}">
+                          <a14:useLocalDpi xmlns:a14="http://schemas.microsoft.com/office/drawing/2010/main" val="0"/>
+                        </a:ext>
+                      </a:extLst>
+                    </a:blip>
+                    <a:stretch>
+                      <a:fillRect/>
+                    </a:stretch>
+                  </pic:blipFill>
+                  <pic:spPr>
+                    <a:xfrm>
+                      <a:off x="0" y="0"/>
+                      <a:ext cx="5398770" cy="5327015"/>
+                    </a:xfrm>
+                    <a:prstGeom prst="rect">
+                      <a:avLst/>
+                    </a:prstGeom>
+                  </pic:spPr>
+                </pic:pic>
+              </a:graphicData>
+            </a:graphic>
+          </wp:anchor>
+        </w:drawing>
+      </w:r>
+    </w:p>
+    <w:p>
+      <w:pPr>
+        <w:spacing w:line="360" w:lineRule="auto"/>
+        <w:jc w:val="both"/>
+        <w:rPr>
+          <w:rFonts w:ascii="Times New Roman" w:hAnsi="Times New Roman" w:cs="Times New Roman"/>
+          <w:lang w:val="es-ES"/>
+        </w:rPr>
+      </w:pPr>
+    </w:p>
+    <w:p>
+      <w:pPr>
+        <w:spacing w:line="360" w:lineRule="auto"/>
+        <w:jc w:val="both"/>
+        <w:rPr>
+          <w:rFonts w:ascii="Times New Roman" w:hAnsi="Times New Roman" w:cs="Times New Roman"/>
+          <w:lang w:val="es-ES"/>
+        </w:rPr>
+      </w:pPr>
+    </w:p>
+    <w:p>
+      <w:pPr>
+        <w:spacing w:line="360" w:lineRule="auto"/>
+        <w:jc w:val="both"/>
+        <w:rPr>
+          <w:rFonts w:ascii="Times New Roman" w:hAnsi="Times New Roman" w:cs="Times New Roman"/>
+          <w:lang w:val="es-ES"/>
+        </w:rPr>
+      </w:pPr>
+    </w:p>
+    <w:p>
+      <w:pPr>
+        <w:spacing w:line="360" w:lineRule="auto"/>
+        <w:jc w:val="both"/>
+        <w:rPr>
+          <w:rFonts w:ascii="Times New Roman" w:hAnsi="Times New Roman" w:cs="Times New Roman"/>
+          <w:lang w:val="es-ES"/>
+        </w:rPr>
+      </w:pPr>
+    </w:p>
+    <w:p>
+      <w:pPr>
+        <w:spacing w:line="360" w:lineRule="auto"/>
+        <w:jc w:val="both"/>
+        <w:rPr>
+          <w:rFonts w:ascii="Times New Roman" w:hAnsi="Times New Roman" w:cs="Times New Roman"/>
+          <w:lang w:val="es-ES"/>
+        </w:rPr>
+      </w:pPr>
+    </w:p>
+    <w:p>
+      <w:pPr>
+        <w:spacing w:line="360" w:lineRule="auto"/>
+        <w:jc w:val="both"/>
+        <w:rPr>
+          <w:rFonts w:ascii="Times New Roman" w:hAnsi="Times New Roman" w:cs="Times New Roman"/>
+          <w:lang w:val="es-ES"/>
+        </w:rPr>
+      </w:pPr>
+    </w:p>
+    <w:p>
+      <w:pPr>
+        <w:pStyle w:val="Heading2"/>
+        <w:spacing w:line="360" w:lineRule="auto"/>
+        <w:jc w:val="both"/>
+        <w:rPr>
+          <w:rFonts w:ascii="Times New Roman" w:hAnsi="Times New Roman" w:cs="Times New Roman"/>
+          <w:b/>
+          <w:bCs/>
+          <w:sz w:val="28"/>
+          <w:szCs w:val="28"/>
+          <w:lang w:val="es-ES"/>
+        </w:rPr>
+      </w:pPr>
+      <w:r>
+        <w:rPr>
+          <w:rFonts w:ascii="Times New Roman" w:hAnsi="Times New Roman" w:cs="Times New Roman"/>
+          <w:b/>
+          <w:bCs/>
+          <w:sz w:val="28"/>
+          <w:szCs w:val="28"/>
+          <w:lang w:val="es-ES"/>
+        </w:rPr>
+        <w:lastRenderedPageBreak/>
+        <w:t xml:space="preserve">Diagrama de </w:t>
+      </w:r>
+      <w:r>
+        <w:rPr>
+          <w:rFonts w:ascii="Times New Roman" w:hAnsi="Times New Roman" w:cs="Times New Roman"/>
+          <w:b/>
+          <w:bCs/>
+          <w:sz w:val="28"/>
+          <w:szCs w:val="28"/>
+          <w:lang w:val="es-ES"/>
+        </w:rPr>
+        <w:t>entidad-relación</w:t>
+      </w:r>
+    </w:p>
+    <w:p>
+      <w:pPr>
+        <w:spacing w:line="360" w:lineRule="auto"/>
+        <w:jc w:val="both"/>
+        <w:rPr>
+          <w:rFonts w:ascii="Times New Roman" w:hAnsi="Times New Roman" w:cs="Times New Roman"/>
+          <w:lang w:val="es-ES"/>
+        </w:rPr>
+      </w:pPr>
+      <w:r>
+        <w:rPr>
+          <w:rFonts w:ascii="Times New Roman" w:hAnsi="Times New Roman" w:cs="Times New Roman"/>
+          <w:lang w:val="es-ES"/>
+        </w:rPr>
+        <w:t xml:space="preserve">El </w:t>
+      </w:r>
+      <w:r>
+        <w:rPr>
+          <w:rFonts w:ascii="Times New Roman" w:hAnsi="Times New Roman" w:cs="Times New Roman"/>
+          <w:b/>
+          <w:bCs/>
+          <w:lang w:val="es-ES"/>
+        </w:rPr>
+        <w:t>diagrama entidad-relación</w:t>
+      </w:r>
+      <w:r>
+        <w:rPr>
+          <w:rFonts w:ascii="Times New Roman" w:hAnsi="Times New Roman" w:cs="Times New Roman"/>
+          <w:lang w:val="es-ES"/>
+        </w:rPr>
+        <w:t xml:space="preserve"> ha sido desarrollado para representar las entidades principales del sistema, sus atributos y las relaciones entre ellas. Este modelo permite visualizar cómo los datos están estructurados y cómo las entidades interactúan entre sí, facilitando la organización y gestión de la información en la base de datos.</w:t>
+      </w:r>
+    </w:p>
+    <w:p>
+      <w:pPr>
+        <w:spacing w:line="360" w:lineRule="auto"/>
+        <w:jc w:val="both"/>
+        <w:rPr>
+          <w:rFonts w:ascii="Times New Roman" w:hAnsi="Times New Roman" w:cs="Times New Roman"/>
+          <w:lang w:val="es-ES"/>
+        </w:rPr>
+      </w:pPr>
+      <w:r>
+        <w:rPr>
+          <w:rFonts w:ascii="Times New Roman" w:hAnsi="Times New Roman" w:cs="Times New Roman"/>
+          <w:noProof/>
+          <w:lang w:val="es-ES"/>
+        </w:rPr>
+        <w:drawing>
+          <wp:anchor distT="0" distB="0" distL="114300" distR="114300" simplePos="0" relativeHeight="251660288" behindDoc="0" locked="0" layoutInCell="1" allowOverlap="1" wp14:anchorId="7E612EE0" wp14:editId="45DA759D">
+            <wp:simplePos x="0" y="0"/>
+            <wp:positionH relativeFrom="margin">
+              <wp:posOffset>-48260</wp:posOffset>
+            </wp:positionH>
+            <wp:positionV relativeFrom="margin">
+              <wp:posOffset>1798320</wp:posOffset>
             </wp:positionV>
             <wp:extent cx="5580380" cy="4551045"/>
             <wp:effectExtent l="0" t="0" r="0" b="0"/>
@@ -20690,16 +20825,6 @@
     </w:p>
     <w:p>
       <w:pPr>
-        <w:spacing w:line="360" w:lineRule="auto"/>
-        <w:jc w:val="both"/>
-        <w:rPr>
-          <w:rFonts w:ascii="Times New Roman" w:hAnsi="Times New Roman" w:cs="Times New Roman"/>
-          <w:lang w:val="es-ES"/>
-        </w:rPr>
-      </w:pPr>
-    </w:p>
-    <w:p>
-      <w:pPr>
         <w:pStyle w:val="Heading2"/>
         <w:spacing w:line="360" w:lineRule="auto"/>
         <w:jc w:val="both"/>
@@ -20722,7 +20847,7 @@
           <w:lang w:val="es-ES"/>
         </w:rPr>
         <w:lastRenderedPageBreak/>
-        <w:t xml:space="preserve">Diagrama de </w:t>
+        <w:t>Diagrama</w:t>
       </w:r>
       <w:r>
         <w:rPr>
@@ -20733,39 +20858,37 @@
           <w:szCs w:val="28"/>
           <w:lang w:val="es-ES"/>
         </w:rPr>
-        <w:t>entidad-relación</w:t>
-      </w:r>
-    </w:p>
-    <w:p>
-      <w:pPr>
-        <w:spacing w:line="360" w:lineRule="auto"/>
-        <w:jc w:val="both"/>
-        <w:rPr>
-          <w:rFonts w:ascii="Times New Roman" w:hAnsi="Times New Roman" w:cs="Times New Roman"/>
-          <w:lang w:val="es-ES"/>
-        </w:rPr>
-      </w:pPr>
-      <w:r>
-        <w:rPr>
-          <w:rFonts w:ascii="Times New Roman" w:hAnsi="Times New Roman" w:cs="Times New Roman"/>
-          <w:b/>
-          <w:bCs/>
+        <w:t xml:space="preserve"> UML</w:t>
+      </w:r>
+    </w:p>
+    <w:p>
+      <w:pPr>
+        <w:spacing w:line="360" w:lineRule="auto"/>
+        <w:jc w:val="both"/>
+        <w:rPr>
+          <w:rFonts w:ascii="Times New Roman" w:hAnsi="Times New Roman" w:cs="Times New Roman"/>
+          <w:lang w:val="es-ES"/>
+        </w:rPr>
+      </w:pPr>
+      <w:r>
+        <w:rPr>
+          <w:rFonts w:ascii="Times New Roman" w:hAnsi="Times New Roman" w:cs="Times New Roman"/>
           <w:noProof/>
           <w:lang w:val="es-ES"/>
         </w:rPr>
         <w:drawing>
-          <wp:anchor distT="0" distB="0" distL="114300" distR="114300" simplePos="0" relativeHeight="251664384" behindDoc="0" locked="0" layoutInCell="1" allowOverlap="1" wp14:anchorId="09D689B8" wp14:editId="2E1550AC">
+          <wp:anchor distT="0" distB="0" distL="114300" distR="114300" simplePos="0" relativeHeight="251665408" behindDoc="0" locked="0" layoutInCell="1" allowOverlap="1" wp14:anchorId="090F80C3" wp14:editId="3A24689B">
             <wp:simplePos x="0" y="0"/>
             <wp:positionH relativeFrom="margin">
-              <wp:posOffset>-656590</wp:posOffset>
+              <wp:align>center</wp:align>
             </wp:positionH>
             <wp:positionV relativeFrom="margin">
-              <wp:posOffset>1959610</wp:posOffset>
+              <wp:align>center</wp:align>
             </wp:positionV>
-            <wp:extent cx="6823710" cy="3749040"/>
-            <wp:effectExtent l="0" t="0" r="0" b="0"/>
+            <wp:extent cx="6162286" cy="6971168"/>
+            <wp:effectExtent l="0" t="0" r="0" b="1270"/>
             <wp:wrapSquare wrapText="bothSides"/>
-            <wp:docPr id="712315953" name="Picture 1" descr="A diagram of a program&#10;&#10;Description automatically generated"/>
+            <wp:docPr id="1461595845" name="Picture 3" descr="A diagram of a computer&#10;&#10;Description automatically generated with medium confidence"/>
             <wp:cNvGraphicFramePr>
               <a:graphicFrameLocks xmlns:a="http://schemas.openxmlformats.org/drawingml/2006/main" noChangeAspect="1"/>
             </wp:cNvGraphicFramePr>
@@ -20773,11 +20896,11 @@
               <a:graphicData uri="http://schemas.openxmlformats.org/drawingml/2006/picture">
                 <pic:pic xmlns:pic="http://schemas.openxmlformats.org/drawingml/2006/picture">
                   <pic:nvPicPr>
-                    <pic:cNvPr id="852004293" name="Picture 1" descr="A diagram of a program&#10;&#10;Description automatically generated"/>
+                    <pic:cNvPr id="1461595845" name="Picture 3" descr="A diagram of a computer&#10;&#10;Description automatically generated with medium confidence"/>
                     <pic:cNvPicPr/>
                   </pic:nvPicPr>
                   <pic:blipFill>
-                    <a:blip r:embed="rId11">
+                    <a:blip r:embed="rId14">
                       <a:extLst>
                         <a:ext uri="{28A0092B-C50C-407E-A947-70E740481C1C}">
                           <a14:useLocalDpi xmlns:a14="http://schemas.microsoft.com/office/drawing/2010/main" val="0"/>
@@ -20791,143 +20914,7 @@
                   <pic:spPr>
                     <a:xfrm>
                       <a:off x="0" y="0"/>
-                      <a:ext cx="6823710" cy="3749040"/>
-                    </a:xfrm>
-                    <a:prstGeom prst="rect">
-                      <a:avLst/>
-                    </a:prstGeom>
-                  </pic:spPr>
-                </pic:pic>
-              </a:graphicData>
-            </a:graphic>
-            <wp14:sizeRelH relativeFrom="margin">
-              <wp14:pctWidth>0</wp14:pctWidth>
-            </wp14:sizeRelH>
-            <wp14:sizeRelV relativeFrom="margin">
-              <wp14:pctHeight>0</wp14:pctHeight>
-            </wp14:sizeRelV>
-          </wp:anchor>
-        </w:drawing>
-      </w:r>
-      <w:r>
-        <w:rPr>
-          <w:rFonts w:ascii="Times New Roman" w:hAnsi="Times New Roman" w:cs="Times New Roman"/>
-          <w:lang w:val="es-ES"/>
-        </w:rPr>
-        <w:t xml:space="preserve">El </w:t>
-      </w:r>
-      <w:r>
-        <w:rPr>
-          <w:rFonts w:ascii="Times New Roman" w:hAnsi="Times New Roman" w:cs="Times New Roman"/>
-          <w:b/>
-          <w:bCs/>
-          <w:lang w:val="es-ES"/>
-        </w:rPr>
-        <w:t>diagrama entidad-relación</w:t>
-      </w:r>
-      <w:r>
-        <w:rPr>
-          <w:rFonts w:ascii="Times New Roman" w:hAnsi="Times New Roman" w:cs="Times New Roman"/>
-          <w:lang w:val="es-ES"/>
-        </w:rPr>
-        <w:t xml:space="preserve"> ha sido desarrollado para representar las entidades principales del sistema, sus atributos y las relaciones entre ellas. Este modelo permite visualizar cómo los datos están estructurados y cómo las entidades interactúan entre sí, facilitando la organización y gestión de la información en la base de datos.</w:t>
-      </w:r>
-    </w:p>
-    <w:p>
-      <w:pPr>
-        <w:spacing w:line="360" w:lineRule="auto"/>
-        <w:jc w:val="both"/>
-        <w:rPr>
-          <w:rFonts w:ascii="Times New Roman" w:hAnsi="Times New Roman" w:cs="Times New Roman"/>
-          <w:lang w:val="es-ES"/>
-        </w:rPr>
-      </w:pPr>
-    </w:p>
-    <w:p>
-      <w:pPr>
-        <w:spacing w:line="360" w:lineRule="auto"/>
-        <w:jc w:val="both"/>
-        <w:rPr>
-          <w:rFonts w:ascii="Times New Roman" w:hAnsi="Times New Roman" w:cs="Times New Roman"/>
-          <w:lang w:val="es-ES"/>
-        </w:rPr>
-      </w:pPr>
-    </w:p>
-    <w:p>
-      <w:pPr>
-        <w:spacing w:line="360" w:lineRule="auto"/>
-        <w:jc w:val="both"/>
-        <w:rPr>
-          <w:rFonts w:ascii="Times New Roman" w:hAnsi="Times New Roman" w:cs="Times New Roman"/>
-          <w:lang w:val="es-ES"/>
-        </w:rPr>
-      </w:pPr>
-    </w:p>
-    <w:p>
-      <w:pPr>
-        <w:spacing w:line="360" w:lineRule="auto"/>
-        <w:jc w:val="both"/>
-        <w:rPr>
-          <w:rFonts w:ascii="Times New Roman" w:hAnsi="Times New Roman" w:cs="Times New Roman"/>
-          <w:lang w:val="es-ES"/>
-        </w:rPr>
-      </w:pPr>
-    </w:p>
-    <w:p>
-      <w:pPr>
-        <w:spacing w:line="360" w:lineRule="auto"/>
-        <w:jc w:val="both"/>
-        <w:rPr>
-          <w:rFonts w:ascii="Times New Roman" w:hAnsi="Times New Roman" w:cs="Times New Roman"/>
-          <w:lang w:val="es-ES"/>
-        </w:rPr>
-      </w:pPr>
-      <w:r>
-        <w:rPr>
-          <w:rFonts w:ascii="Times New Roman" w:hAnsi="Times New Roman" w:cs="Times New Roman"/>
-          <w:noProof/>
-          <w:lang w:val="es-ES"/>
-        </w:rPr>
-        <w:lastRenderedPageBreak/>
-        <w:drawing>
-          <wp:anchor distT="0" distB="0" distL="114300" distR="114300" simplePos="0" relativeHeight="251661312" behindDoc="0" locked="0" layoutInCell="1" allowOverlap="1" wp14:anchorId="55058B46" wp14:editId="10C75880">
-            <wp:simplePos x="0" y="0"/>
-            <wp:positionH relativeFrom="margin">
-              <wp:align>center</wp:align>
-            </wp:positionH>
-            <wp:positionV relativeFrom="margin">
-              <wp:align>top</wp:align>
-            </wp:positionV>
-            <wp:extent cx="6705600" cy="6620510"/>
-            <wp:effectExtent l="0" t="0" r="0" b="0"/>
-            <wp:wrapSquare wrapText="bothSides"/>
-            <wp:docPr id="1185473307" name="Picture 7" descr="A screenshot of a computer&#10;&#10;Description automatically generated"/>
-            <wp:cNvGraphicFramePr>
-              <a:graphicFrameLocks xmlns:a="http://schemas.openxmlformats.org/drawingml/2006/main" noChangeAspect="1"/>
-            </wp:cNvGraphicFramePr>
-            <a:graphic xmlns:a="http://schemas.openxmlformats.org/drawingml/2006/main">
-              <a:graphicData uri="http://schemas.openxmlformats.org/drawingml/2006/picture">
-                <pic:pic xmlns:pic="http://schemas.openxmlformats.org/drawingml/2006/picture">
-                  <pic:nvPicPr>
-                    <pic:cNvPr id="1185473307" name="Picture 7" descr="A screenshot of a computer&#10;&#10;Description automatically generated"/>
-                    <pic:cNvPicPr/>
-                  </pic:nvPicPr>
-                  <pic:blipFill>
-                    <a:blip r:embed="rId14" cstate="print">
-                      <a:extLst>
-                        <a:ext uri="{28A0092B-C50C-407E-A947-70E740481C1C}">
-                          <a14:useLocalDpi xmlns:a14="http://schemas.microsoft.com/office/drawing/2010/main" val="0"/>
-                        </a:ext>
-                      </a:extLst>
-                    </a:blip>
-                    <a:stretch>
-                      <a:fillRect/>
-                    </a:stretch>
-                  </pic:blipFill>
-                  <pic:spPr>
-                    <a:xfrm>
-                      <a:off x="0" y="0"/>
-                      <a:ext cx="6705600" cy="6620510"/>
+                      <a:ext cx="6162286" cy="6971168"/>
                     </a:xfrm>
                     <a:prstGeom prst="rect">
                       <a:avLst/>
@@ -20992,6 +20979,216 @@
     </w:p>
     <w:p>
       <w:pPr>
+        <w:spacing w:line="360" w:lineRule="auto"/>
+        <w:jc w:val="both"/>
+        <w:rPr>
+          <w:rFonts w:ascii="Times New Roman" w:hAnsi="Times New Roman" w:cs="Times New Roman"/>
+          <w:lang w:val="es-ES"/>
+        </w:rPr>
+      </w:pPr>
+    </w:p>
+    <w:p>
+      <w:pPr>
+        <w:spacing w:line="360" w:lineRule="auto"/>
+        <w:jc w:val="both"/>
+        <w:rPr>
+          <w:rFonts w:ascii="Times New Roman" w:hAnsi="Times New Roman" w:cs="Times New Roman"/>
+          <w:lang w:val="es-ES"/>
+        </w:rPr>
+      </w:pPr>
+    </w:p>
+    <w:p>
+      <w:pPr>
+        <w:spacing w:line="360" w:lineRule="auto"/>
+        <w:jc w:val="both"/>
+        <w:rPr>
+          <w:rFonts w:ascii="Times New Roman" w:hAnsi="Times New Roman" w:cs="Times New Roman"/>
+          <w:lang w:val="es-ES"/>
+        </w:rPr>
+      </w:pPr>
+    </w:p>
+    <w:p>
+      <w:pPr>
+        <w:spacing w:line="360" w:lineRule="auto"/>
+        <w:jc w:val="both"/>
+        <w:rPr>
+          <w:rFonts w:ascii="Times New Roman" w:hAnsi="Times New Roman" w:cs="Times New Roman"/>
+          <w:lang w:val="es-ES"/>
+        </w:rPr>
+      </w:pPr>
+    </w:p>
+    <w:p>
+      <w:pPr>
+        <w:spacing w:line="360" w:lineRule="auto"/>
+        <w:jc w:val="both"/>
+        <w:rPr>
+          <w:rFonts w:ascii="Times New Roman" w:hAnsi="Times New Roman" w:cs="Times New Roman"/>
+          <w:lang w:val="es-ES"/>
+        </w:rPr>
+      </w:pPr>
+    </w:p>
+    <w:p>
+      <w:pPr>
+        <w:spacing w:line="360" w:lineRule="auto"/>
+        <w:jc w:val="both"/>
+        <w:rPr>
+          <w:rFonts w:ascii="Times New Roman" w:hAnsi="Times New Roman" w:cs="Times New Roman"/>
+          <w:lang w:val="es-ES"/>
+        </w:rPr>
+      </w:pPr>
+    </w:p>
+    <w:p>
+      <w:pPr>
+        <w:spacing w:line="360" w:lineRule="auto"/>
+        <w:jc w:val="both"/>
+        <w:rPr>
+          <w:rFonts w:ascii="Times New Roman" w:hAnsi="Times New Roman" w:cs="Times New Roman"/>
+          <w:lang w:val="es-ES"/>
+        </w:rPr>
+      </w:pPr>
+    </w:p>
+    <w:p>
+      <w:pPr>
+        <w:spacing w:line="360" w:lineRule="auto"/>
+        <w:jc w:val="both"/>
+        <w:rPr>
+          <w:rFonts w:ascii="Times New Roman" w:hAnsi="Times New Roman" w:cs="Times New Roman"/>
+          <w:lang w:val="es-ES"/>
+        </w:rPr>
+      </w:pPr>
+    </w:p>
+    <w:p>
+      <w:pPr>
+        <w:spacing w:line="360" w:lineRule="auto"/>
+        <w:jc w:val="both"/>
+        <w:rPr>
+          <w:rFonts w:ascii="Times New Roman" w:hAnsi="Times New Roman" w:cs="Times New Roman"/>
+          <w:lang w:val="es-ES"/>
+        </w:rPr>
+      </w:pPr>
+    </w:p>
+    <w:p>
+      <w:pPr>
+        <w:spacing w:line="360" w:lineRule="auto"/>
+        <w:jc w:val="both"/>
+        <w:rPr>
+          <w:rFonts w:ascii="Times New Roman" w:hAnsi="Times New Roman" w:cs="Times New Roman"/>
+          <w:lang w:val="es-ES"/>
+        </w:rPr>
+      </w:pPr>
+    </w:p>
+    <w:p>
+      <w:pPr>
+        <w:spacing w:line="360" w:lineRule="auto"/>
+        <w:jc w:val="both"/>
+        <w:rPr>
+          <w:rFonts w:ascii="Times New Roman" w:hAnsi="Times New Roman" w:cs="Times New Roman"/>
+          <w:lang w:val="es-ES"/>
+        </w:rPr>
+      </w:pPr>
+    </w:p>
+    <w:p>
+      <w:pPr>
+        <w:spacing w:line="360" w:lineRule="auto"/>
+        <w:jc w:val="both"/>
+        <w:rPr>
+          <w:rFonts w:ascii="Times New Roman" w:hAnsi="Times New Roman" w:cs="Times New Roman"/>
+          <w:lang w:val="es-ES"/>
+        </w:rPr>
+      </w:pPr>
+    </w:p>
+    <w:p>
+      <w:pPr>
+        <w:spacing w:line="360" w:lineRule="auto"/>
+        <w:jc w:val="both"/>
+        <w:rPr>
+          <w:rFonts w:ascii="Times New Roman" w:hAnsi="Times New Roman" w:cs="Times New Roman"/>
+          <w:lang w:val="es-ES"/>
+        </w:rPr>
+      </w:pPr>
+    </w:p>
+    <w:p>
+      <w:pPr>
+        <w:spacing w:line="360" w:lineRule="auto"/>
+        <w:jc w:val="both"/>
+        <w:rPr>
+          <w:rFonts w:ascii="Times New Roman" w:hAnsi="Times New Roman" w:cs="Times New Roman"/>
+          <w:lang w:val="es-ES"/>
+        </w:rPr>
+      </w:pPr>
+    </w:p>
+    <w:p>
+      <w:pPr>
+        <w:spacing w:line="360" w:lineRule="auto"/>
+        <w:jc w:val="both"/>
+        <w:rPr>
+          <w:rFonts w:ascii="Times New Roman" w:hAnsi="Times New Roman" w:cs="Times New Roman"/>
+          <w:lang w:val="es-ES"/>
+        </w:rPr>
+      </w:pPr>
+    </w:p>
+    <w:p>
+      <w:pPr>
+        <w:spacing w:line="360" w:lineRule="auto"/>
+        <w:jc w:val="both"/>
+        <w:rPr>
+          <w:rFonts w:ascii="Times New Roman" w:hAnsi="Times New Roman" w:cs="Times New Roman"/>
+          <w:lang w:val="es-ES"/>
+        </w:rPr>
+      </w:pPr>
+    </w:p>
+    <w:p>
+      <w:pPr>
+        <w:spacing w:line="360" w:lineRule="auto"/>
+        <w:jc w:val="both"/>
+        <w:rPr>
+          <w:rFonts w:ascii="Times New Roman" w:hAnsi="Times New Roman" w:cs="Times New Roman"/>
+          <w:lang w:val="es-ES"/>
+        </w:rPr>
+      </w:pPr>
+    </w:p>
+    <w:p>
+      <w:pPr>
+        <w:spacing w:line="360" w:lineRule="auto"/>
+        <w:jc w:val="both"/>
+        <w:rPr>
+          <w:rFonts w:ascii="Times New Roman" w:hAnsi="Times New Roman" w:cs="Times New Roman"/>
+          <w:lang w:val="es-ES"/>
+        </w:rPr>
+      </w:pPr>
+    </w:p>
+    <w:p>
+      <w:pPr>
+        <w:spacing w:line="360" w:lineRule="auto"/>
+        <w:jc w:val="both"/>
+        <w:rPr>
+          <w:rFonts w:ascii="Times New Roman" w:hAnsi="Times New Roman" w:cs="Times New Roman"/>
+          <w:lang w:val="es-ES"/>
+        </w:rPr>
+      </w:pPr>
+    </w:p>
+    <w:p>
+      <w:pPr>
+        <w:spacing w:line="360" w:lineRule="auto"/>
+        <w:jc w:val="both"/>
+        <w:rPr>
+          <w:rFonts w:ascii="Times New Roman" w:hAnsi="Times New Roman" w:cs="Times New Roman"/>
+          <w:lang w:val="es-ES"/>
+        </w:rPr>
+      </w:pPr>
+    </w:p>
+    <w:p>
+      <w:pPr>
+        <w:spacing w:line="360" w:lineRule="auto"/>
+        <w:jc w:val="both"/>
+        <w:rPr>
+          <w:rFonts w:ascii="Times New Roman" w:hAnsi="Times New Roman" w:cs="Times New Roman"/>
+          <w:lang w:val="es-ES"/>
+        </w:rPr>
+      </w:pPr>
+    </w:p>
+    <w:p>
+      <w:pPr>
         <w:pStyle w:val="Heading1"/>
         <w:spacing w:line="360" w:lineRule="auto"/>
         <w:jc w:val="both"/>
@@ -21014,7 +21211,6 @@
           <w:szCs w:val="32"/>
           <w:lang w:val="es-ES"/>
         </w:rPr>
-        <w:lastRenderedPageBreak/>
         <w:t>A</w:t>
       </w:r>
       <w:r>
@@ -21136,7 +21332,15 @@
           <w:rFonts w:ascii="Times New Roman" w:hAnsi="Times New Roman" w:cs="Times New Roman"/>
           <w:lang w:val="es-ES"/>
         </w:rPr>
-        <w:t>Por otra parte, han sido insertados varios .</w:t>
+        <w:t xml:space="preserve">Por </w:t>
+      </w:r>
+      <w:r>
+        <w:rPr>
+          <w:rFonts w:ascii="Times New Roman" w:hAnsi="Times New Roman" w:cs="Times New Roman"/>
+          <w:lang w:val="es-ES"/>
+        </w:rPr>
+        <w:lastRenderedPageBreak/>
+        <w:t>otra parte, han sido insertados varios .</w:t>
       </w:r>
       <w:proofErr w:type="spellStart"/>
       <w:r>
@@ -21245,7 +21449,7 @@
           <w:lang w:val="es-ES"/>
         </w:rPr>
         <w:drawing>
-          <wp:inline distT="0" distB="0" distL="0" distR="0" wp14:anchorId="56EC2BF2" wp14:editId="6896EDAB">
+          <wp:inline distT="0" distB="0" distL="0" distR="0" wp14:anchorId="56EC2BF2" wp14:editId="4B5F853C">
             <wp:extent cx="5739483" cy="2834640"/>
             <wp:effectExtent l="0" t="0" r="1270" b="0"/>
             <wp:docPr id="1521730561" name="Picture 1" descr="A screenshot of a computer program&#10;&#10;Description automatically generated"/>
@@ -21377,188 +21581,188 @@
           <w:bCs/>
           <w:lang w:val="es-ES"/>
         </w:rPr>
+        <w:t>DirectoryIndex</w:t>
+      </w:r>
+      <w:proofErr w:type="spellEnd"/>
+      <w:r>
+        <w:rPr>
+          <w:rFonts w:ascii="Times New Roman" w:hAnsi="Times New Roman" w:cs="Times New Roman"/>
+          <w:lang w:val="es-ES"/>
+        </w:rPr>
+        <w:t xml:space="preserve">: Dentro del funcionamiento del proyecto, es necesario utilizar un archivo </w:t>
+      </w:r>
+      <w:proofErr w:type="spellStart"/>
+      <w:r>
+        <w:rPr>
+          <w:rFonts w:ascii="Times New Roman" w:hAnsi="Times New Roman" w:cs="Times New Roman"/>
+          <w:lang w:val="es-ES"/>
+        </w:rPr>
+        <w:t>index.php</w:t>
+      </w:r>
+      <w:proofErr w:type="spellEnd"/>
+      <w:r>
+        <w:rPr>
+          <w:rFonts w:ascii="Times New Roman" w:hAnsi="Times New Roman" w:cs="Times New Roman"/>
+          <w:lang w:val="es-ES"/>
+        </w:rPr>
+        <w:t xml:space="preserve"> para manejar todas las rutas y el propio funcionamiento del entorno, por lo que, para que funcione correctamente, es necesario hacer que </w:t>
+      </w:r>
+      <w:r>
+        <w:rPr>
+          <w:rFonts w:ascii="Times New Roman" w:hAnsi="Times New Roman" w:cs="Times New Roman"/>
+          <w:lang w:val="es-ES"/>
+        </w:rPr>
+        <w:t>este archivo se ejecute siempre.</w:t>
+      </w:r>
+    </w:p>
+    <w:p>
+      <w:pPr>
+        <w:spacing w:line="360" w:lineRule="auto"/>
+        <w:jc w:val="both"/>
+        <w:rPr>
+          <w:rFonts w:ascii="Times New Roman" w:hAnsi="Times New Roman" w:cs="Times New Roman"/>
+          <w:lang w:val="es-ES"/>
+        </w:rPr>
+      </w:pPr>
+    </w:p>
+    <w:p>
+      <w:pPr>
+        <w:spacing w:line="360" w:lineRule="auto"/>
+        <w:jc w:val="both"/>
+        <w:rPr>
+          <w:rFonts w:ascii="Times New Roman" w:hAnsi="Times New Roman" w:cs="Times New Roman"/>
+          <w:lang w:val="es-ES"/>
+        </w:rPr>
+      </w:pPr>
+      <w:proofErr w:type="spellStart"/>
+      <w:r>
+        <w:rPr>
+          <w:rFonts w:ascii="Times New Roman" w:hAnsi="Times New Roman" w:cs="Times New Roman"/>
+          <w:b/>
+          <w:bCs/>
+          <w:lang w:val="es-ES"/>
+        </w:rPr>
+        <w:t>RewriteConditions</w:t>
+      </w:r>
+      <w:proofErr w:type="spellEnd"/>
+      <w:r>
+        <w:rPr>
+          <w:rFonts w:ascii="Times New Roman" w:hAnsi="Times New Roman" w:cs="Times New Roman"/>
+          <w:b/>
+          <w:bCs/>
+          <w:lang w:val="es-ES"/>
+        </w:rPr>
+        <w:t>:</w:t>
+      </w:r>
+      <w:r>
+        <w:rPr>
+          <w:rFonts w:ascii="Times New Roman" w:hAnsi="Times New Roman" w:cs="Times New Roman"/>
+          <w:lang w:val="es-ES"/>
+        </w:rPr>
+        <w:t xml:space="preserve"> Estas directrices indican que se debe de ejecutar siempre el </w:t>
+      </w:r>
+      <w:proofErr w:type="spellStart"/>
+      <w:r>
+        <w:rPr>
+          <w:rFonts w:ascii="Times New Roman" w:hAnsi="Times New Roman" w:cs="Times New Roman"/>
+          <w:lang w:val="es-ES"/>
+        </w:rPr>
+        <w:t>index.php</w:t>
+      </w:r>
+      <w:proofErr w:type="spellEnd"/>
+      <w:r>
+        <w:rPr>
+          <w:rFonts w:ascii="Times New Roman" w:hAnsi="Times New Roman" w:cs="Times New Roman"/>
+          <w:lang w:val="es-ES"/>
+        </w:rPr>
+        <w:t xml:space="preserve"> y que, en el caso de que se quiera acceder a algún directorio o archivo físico (por </w:t>
+      </w:r>
+      <w:r>
+        <w:rPr>
+          <w:rFonts w:ascii="Times New Roman" w:hAnsi="Times New Roman" w:cs="Times New Roman"/>
+          <w:lang w:val="es-ES"/>
+        </w:rPr>
+        <w:t>ejemplo,</w:t>
+      </w:r>
+      <w:r>
+        <w:rPr>
+          <w:rFonts w:ascii="Times New Roman" w:hAnsi="Times New Roman" w:cs="Times New Roman"/>
+          <w:lang w:val="es-ES"/>
+        </w:rPr>
+        <w:t xml:space="preserve"> un archivo CSS), este sea accesible.</w:t>
+      </w:r>
+    </w:p>
+    <w:p>
+      <w:pPr>
+        <w:spacing w:line="360" w:lineRule="auto"/>
+        <w:jc w:val="both"/>
+        <w:rPr>
+          <w:rFonts w:ascii="Times New Roman" w:hAnsi="Times New Roman" w:cs="Times New Roman"/>
+          <w:lang w:val="es-ES"/>
+        </w:rPr>
+      </w:pPr>
+    </w:p>
+    <w:p>
+      <w:pPr>
+        <w:spacing w:line="360" w:lineRule="auto"/>
+        <w:jc w:val="both"/>
+        <w:rPr>
+          <w:rFonts w:ascii="Times New Roman" w:hAnsi="Times New Roman" w:cs="Times New Roman"/>
+          <w:lang w:val="es-ES"/>
+        </w:rPr>
+      </w:pPr>
+      <w:r>
+        <w:rPr>
+          <w:rFonts w:ascii="Times New Roman" w:hAnsi="Times New Roman" w:cs="Times New Roman"/>
+          <w:lang w:val="es-ES"/>
+        </w:rPr>
+        <w:t xml:space="preserve">En caso de que no estuvieran estas directrices, </w:t>
+      </w:r>
+      <w:r>
+        <w:rPr>
+          <w:rFonts w:ascii="Times New Roman" w:hAnsi="Times New Roman" w:cs="Times New Roman"/>
+          <w:lang w:val="es-ES"/>
+        </w:rPr>
+        <w:t xml:space="preserve">al intentar enlazar un CSS o un JS a un archivo HTML, debe de ser procesado primero por el </w:t>
+      </w:r>
+      <w:proofErr w:type="spellStart"/>
+      <w:r>
+        <w:rPr>
+          <w:rFonts w:ascii="Times New Roman" w:hAnsi="Times New Roman" w:cs="Times New Roman"/>
+          <w:lang w:val="es-ES"/>
+        </w:rPr>
+        <w:t>index.php</w:t>
+      </w:r>
+      <w:proofErr w:type="spellEnd"/>
+    </w:p>
+    <w:p>
+      <w:pPr>
+        <w:spacing w:line="360" w:lineRule="auto"/>
+        <w:jc w:val="both"/>
+        <w:rPr>
+          <w:rFonts w:ascii="Times New Roman" w:hAnsi="Times New Roman" w:cs="Times New Roman"/>
+          <w:lang w:val="es-ES"/>
+        </w:rPr>
+      </w:pPr>
+    </w:p>
+    <w:p>
+      <w:pPr>
+        <w:spacing w:line="360" w:lineRule="auto"/>
+        <w:jc w:val="both"/>
+        <w:rPr>
+          <w:rFonts w:ascii="Times New Roman" w:hAnsi="Times New Roman" w:cs="Times New Roman"/>
+          <w:lang w:val="es-ES"/>
+        </w:rPr>
+      </w:pPr>
+      <w:proofErr w:type="spellStart"/>
+      <w:r>
+        <w:rPr>
+          <w:rFonts w:ascii="Times New Roman" w:hAnsi="Times New Roman" w:cs="Times New Roman"/>
+          <w:b/>
+          <w:bCs/>
+          <w:lang w:val="es-ES"/>
+        </w:rPr>
         <w:lastRenderedPageBreak/>
-        <w:t>DirectoryIndex</w:t>
-      </w:r>
-      <w:proofErr w:type="spellEnd"/>
-      <w:r>
-        <w:rPr>
-          <w:rFonts w:ascii="Times New Roman" w:hAnsi="Times New Roman" w:cs="Times New Roman"/>
-          <w:lang w:val="es-ES"/>
-        </w:rPr>
-        <w:t xml:space="preserve">: Dentro del funcionamiento del proyecto, es necesario utilizar un archivo </w:t>
-      </w:r>
-      <w:proofErr w:type="spellStart"/>
-      <w:r>
-        <w:rPr>
-          <w:rFonts w:ascii="Times New Roman" w:hAnsi="Times New Roman" w:cs="Times New Roman"/>
-          <w:lang w:val="es-ES"/>
-        </w:rPr>
-        <w:t>index.php</w:t>
-      </w:r>
-      <w:proofErr w:type="spellEnd"/>
-      <w:r>
-        <w:rPr>
-          <w:rFonts w:ascii="Times New Roman" w:hAnsi="Times New Roman" w:cs="Times New Roman"/>
-          <w:lang w:val="es-ES"/>
-        </w:rPr>
-        <w:t xml:space="preserve"> para manejar todas las rutas y el propio funcionamiento del entorno, por lo que, para que funcione correctamente, es necesario hacer que </w:t>
-      </w:r>
-      <w:r>
-        <w:rPr>
-          <w:rFonts w:ascii="Times New Roman" w:hAnsi="Times New Roman" w:cs="Times New Roman"/>
-          <w:lang w:val="es-ES"/>
-        </w:rPr>
-        <w:t>este archivo se ejecute siempre.</w:t>
-      </w:r>
-    </w:p>
-    <w:p>
-      <w:pPr>
-        <w:spacing w:line="360" w:lineRule="auto"/>
-        <w:jc w:val="both"/>
-        <w:rPr>
-          <w:rFonts w:ascii="Times New Roman" w:hAnsi="Times New Roman" w:cs="Times New Roman"/>
-          <w:lang w:val="es-ES"/>
-        </w:rPr>
-      </w:pPr>
-    </w:p>
-    <w:p>
-      <w:pPr>
-        <w:spacing w:line="360" w:lineRule="auto"/>
-        <w:jc w:val="both"/>
-        <w:rPr>
-          <w:rFonts w:ascii="Times New Roman" w:hAnsi="Times New Roman" w:cs="Times New Roman"/>
-          <w:lang w:val="es-ES"/>
-        </w:rPr>
-      </w:pPr>
-      <w:proofErr w:type="spellStart"/>
-      <w:r>
-        <w:rPr>
-          <w:rFonts w:ascii="Times New Roman" w:hAnsi="Times New Roman" w:cs="Times New Roman"/>
-          <w:b/>
-          <w:bCs/>
-          <w:lang w:val="es-ES"/>
-        </w:rPr>
-        <w:t>RewriteConditions</w:t>
-      </w:r>
-      <w:proofErr w:type="spellEnd"/>
-      <w:r>
-        <w:rPr>
-          <w:rFonts w:ascii="Times New Roman" w:hAnsi="Times New Roman" w:cs="Times New Roman"/>
-          <w:b/>
-          <w:bCs/>
-          <w:lang w:val="es-ES"/>
-        </w:rPr>
-        <w:t>:</w:t>
-      </w:r>
-      <w:r>
-        <w:rPr>
-          <w:rFonts w:ascii="Times New Roman" w:hAnsi="Times New Roman" w:cs="Times New Roman"/>
-          <w:lang w:val="es-ES"/>
-        </w:rPr>
-        <w:t xml:space="preserve"> Estas directrices indican que se debe de ejecutar siempre el </w:t>
-      </w:r>
-      <w:proofErr w:type="spellStart"/>
-      <w:r>
-        <w:rPr>
-          <w:rFonts w:ascii="Times New Roman" w:hAnsi="Times New Roman" w:cs="Times New Roman"/>
-          <w:lang w:val="es-ES"/>
-        </w:rPr>
-        <w:t>index.php</w:t>
-      </w:r>
-      <w:proofErr w:type="spellEnd"/>
-      <w:r>
-        <w:rPr>
-          <w:rFonts w:ascii="Times New Roman" w:hAnsi="Times New Roman" w:cs="Times New Roman"/>
-          <w:lang w:val="es-ES"/>
-        </w:rPr>
-        <w:t xml:space="preserve"> y que, en el caso de que se quiera acceder a algún directorio o archivo físico (por </w:t>
-      </w:r>
-      <w:r>
-        <w:rPr>
-          <w:rFonts w:ascii="Times New Roman" w:hAnsi="Times New Roman" w:cs="Times New Roman"/>
-          <w:lang w:val="es-ES"/>
-        </w:rPr>
-        <w:t>ejemplo,</w:t>
-      </w:r>
-      <w:r>
-        <w:rPr>
-          <w:rFonts w:ascii="Times New Roman" w:hAnsi="Times New Roman" w:cs="Times New Roman"/>
-          <w:lang w:val="es-ES"/>
-        </w:rPr>
-        <w:t xml:space="preserve"> un archivo CSS), este sea accesible.</w:t>
-      </w:r>
-    </w:p>
-    <w:p>
-      <w:pPr>
-        <w:spacing w:line="360" w:lineRule="auto"/>
-        <w:jc w:val="both"/>
-        <w:rPr>
-          <w:rFonts w:ascii="Times New Roman" w:hAnsi="Times New Roman" w:cs="Times New Roman"/>
-          <w:lang w:val="es-ES"/>
-        </w:rPr>
-      </w:pPr>
-    </w:p>
-    <w:p>
-      <w:pPr>
-        <w:spacing w:line="360" w:lineRule="auto"/>
-        <w:jc w:val="both"/>
-        <w:rPr>
-          <w:rFonts w:ascii="Times New Roman" w:hAnsi="Times New Roman" w:cs="Times New Roman"/>
-          <w:lang w:val="es-ES"/>
-        </w:rPr>
-      </w:pPr>
-      <w:r>
-        <w:rPr>
-          <w:rFonts w:ascii="Times New Roman" w:hAnsi="Times New Roman" w:cs="Times New Roman"/>
-          <w:lang w:val="es-ES"/>
-        </w:rPr>
-        <w:t xml:space="preserve">En caso de que no estuvieran estas directrices, </w:t>
-      </w:r>
-      <w:r>
-        <w:rPr>
-          <w:rFonts w:ascii="Times New Roman" w:hAnsi="Times New Roman" w:cs="Times New Roman"/>
-          <w:lang w:val="es-ES"/>
-        </w:rPr>
-        <w:t xml:space="preserve">al intentar enlazar un CSS o un JS a un archivo HTML, debe de ser procesado primero por el </w:t>
-      </w:r>
-      <w:proofErr w:type="spellStart"/>
-      <w:r>
-        <w:rPr>
-          <w:rFonts w:ascii="Times New Roman" w:hAnsi="Times New Roman" w:cs="Times New Roman"/>
-          <w:lang w:val="es-ES"/>
-        </w:rPr>
-        <w:t>index.php</w:t>
-      </w:r>
-      <w:proofErr w:type="spellEnd"/>
-    </w:p>
-    <w:p>
-      <w:pPr>
-        <w:spacing w:line="360" w:lineRule="auto"/>
-        <w:jc w:val="both"/>
-        <w:rPr>
-          <w:rFonts w:ascii="Times New Roman" w:hAnsi="Times New Roman" w:cs="Times New Roman"/>
-          <w:lang w:val="es-ES"/>
-        </w:rPr>
-      </w:pPr>
-    </w:p>
-    <w:p>
-      <w:pPr>
-        <w:spacing w:line="360" w:lineRule="auto"/>
-        <w:jc w:val="both"/>
-        <w:rPr>
-          <w:rFonts w:ascii="Times New Roman" w:hAnsi="Times New Roman" w:cs="Times New Roman"/>
-          <w:lang w:val="es-ES"/>
-        </w:rPr>
-      </w:pPr>
-      <w:proofErr w:type="spellStart"/>
-      <w:r>
-        <w:rPr>
-          <w:rFonts w:ascii="Times New Roman" w:hAnsi="Times New Roman" w:cs="Times New Roman"/>
-          <w:b/>
-          <w:bCs/>
-          <w:lang w:val="es-ES"/>
-        </w:rPr>
         <w:t>ErrorDocument</w:t>
       </w:r>
       <w:proofErr w:type="spellEnd"/>
@@ -21757,7 +21961,7 @@
           <w:lang w:val="es-ES"/>
         </w:rPr>
         <w:drawing>
-          <wp:inline distT="0" distB="0" distL="0" distR="0" wp14:anchorId="33ECE28B" wp14:editId="7AE61A96">
+          <wp:inline distT="0" distB="0" distL="0" distR="0" wp14:anchorId="33ECE28B" wp14:editId="75D01917">
             <wp:extent cx="5398770" cy="1061085"/>
             <wp:effectExtent l="0" t="0" r="0" b="5715"/>
             <wp:docPr id="1224674290" name="Picture 2" descr="A computer screen with white text&#10;&#10;Description automatically generated"/>
@@ -21893,7 +22097,7 @@
           <w:lang w:val="es-ES"/>
         </w:rPr>
         <w:drawing>
-          <wp:inline distT="0" distB="0" distL="0" distR="0" wp14:anchorId="369DCB05" wp14:editId="328D89A4">
+          <wp:inline distT="0" distB="0" distL="0" distR="0" wp14:anchorId="369DCB05" wp14:editId="4C5F0F05">
             <wp:extent cx="5398770" cy="643890"/>
             <wp:effectExtent l="0" t="0" r="0" b="3810"/>
             <wp:docPr id="1058945197" name="Picture 3"/>
@@ -21959,7 +22163,6 @@
           <w:rFonts w:ascii="Times New Roman" w:hAnsi="Times New Roman" w:cs="Times New Roman"/>
           <w:lang w:val="es-ES"/>
         </w:rPr>
-        <w:lastRenderedPageBreak/>
         <w:t>Después</w:t>
       </w:r>
       <w:r>
@@ -22095,6 +22298,7 @@
           <w:rFonts w:ascii="Times New Roman" w:hAnsi="Times New Roman" w:cs="Times New Roman"/>
           <w:lang w:val="es-ES"/>
         </w:rPr>
+        <w:lastRenderedPageBreak/>
         <w:t xml:space="preserve">Una vez </w:t>
       </w:r>
       <w:r>

</xml_diff>

<commit_message>
Memoria actualizada para la entrega 3: Conclusiones y Desarrollo de la aplicación
</commit_message>
<xml_diff>
--- a/documentacion/memoria_pi_danielcorreavilla.docx
+++ b/documentacion/memoria_pi_danielcorreavilla.docx
@@ -281,7 +281,7 @@
           <w:rFonts w:ascii="Times New Roman" w:hAnsi="Times New Roman" w:cs="Times New Roman"/>
           <w:lang w:val="es-ES"/>
         </w:rPr>
-        <w:t>Con una estructura bien definida, una arquitectura Modelo Vista Controlador y un enfoque en la usabilidad, este proyecto busca mejorar la gestión y el disfrute de las actividades en un entorno educativo y recreativo.</w:t>
+        <w:t>Con una estructura bien definida, una arquitectura Modelo Vista Controlador y un enfoque en la usabilidad, este proyecto busca mejorar la gestión de las actividades en un entorno educativo.</w:t>
       </w:r>
     </w:p>
     <w:p>
@@ -332,8 +332,8 @@
         <w:spacing w:line="360" w:lineRule="auto"/>
         <w:jc w:val="both"/>
         <w:rPr>
-          <w:rFonts w:ascii="Times New Roman" w:hAnsi="Times New Roman" w:cs="Times New Roman"/>
-          <w:color w:val="156082" w:themeColor="accent1"/>
+          <w:rStyle w:val="Hyperlink"/>
+          <w:rFonts w:ascii="Times New Roman" w:hAnsi="Times New Roman" w:cs="Times New Roman"/>
           <w:lang w:val="es-ES"/>
         </w:rPr>
       </w:pPr>
@@ -353,10 +353,53 @@
         <w:spacing w:line="360" w:lineRule="auto"/>
         <w:jc w:val="both"/>
         <w:rPr>
-          <w:rFonts w:ascii="Times New Roman" w:hAnsi="Times New Roman" w:cs="Times New Roman"/>
-          <w:lang w:val="es-ES"/>
-        </w:rPr>
-      </w:pPr>
+          <w:rStyle w:val="Hyperlink"/>
+          <w:rFonts w:ascii="Times New Roman" w:hAnsi="Times New Roman" w:cs="Times New Roman"/>
+          <w:lang w:val="es-ES"/>
+        </w:rPr>
+      </w:pPr>
+    </w:p>
+    <w:p>
+      <w:pPr>
+        <w:spacing w:line="360" w:lineRule="auto"/>
+        <w:jc w:val="both"/>
+        <w:rPr>
+          <w:rFonts w:ascii="Times New Roman" w:hAnsi="Times New Roman" w:cs="Times New Roman"/>
+          <w:lang w:val="es-ES"/>
+        </w:rPr>
+      </w:pPr>
+      <w:r>
+        <w:rPr>
+          <w:rStyle w:val="Hyperlink"/>
+          <w:rFonts w:ascii="Times New Roman" w:hAnsi="Times New Roman" w:cs="Times New Roman"/>
+          <w:color w:val="auto"/>
+          <w:u w:val="none"/>
+          <w:lang w:val="es-ES"/>
+        </w:rPr>
+        <w:t xml:space="preserve">En caso de que no pueda ver correctamente el repositorio, contacte con </w:t>
+      </w:r>
+      <w:r>
+        <w:rPr>
+          <w:rStyle w:val="Hyperlink"/>
+          <w:rFonts w:ascii="Times New Roman" w:hAnsi="Times New Roman" w:cs="Times New Roman"/>
+          <w:b/>
+          <w:bCs/>
+          <w:color w:val="auto"/>
+          <w:u w:val="none"/>
+          <w:lang w:val="es-ES"/>
+        </w:rPr>
+        <w:t>daniel.correa@kodalogic.com</w:t>
+      </w:r>
+      <w:r>
+        <w:rPr>
+          <w:rStyle w:val="Hyperlink"/>
+          <w:rFonts w:ascii="Times New Roman" w:hAnsi="Times New Roman" w:cs="Times New Roman"/>
+          <w:color w:val="auto"/>
+          <w:u w:val="none"/>
+          <w:lang w:val="es-ES"/>
+        </w:rPr>
+        <w:t>.</w:t>
+      </w:r>
     </w:p>
     <w:p>
       <w:pPr>
@@ -738,7 +781,6 @@
         <w:jc w:val="both"/>
         <w:rPr>
           <w:rFonts w:ascii="Times New Roman" w:hAnsi="Times New Roman" w:cs="Times New Roman"/>
-          <w:lang w:val="es-ES"/>
         </w:rPr>
       </w:pPr>
       <w:r>
@@ -754,7 +796,6 @@
         <w:jc w:val="both"/>
         <w:rPr>
           <w:rFonts w:ascii="Times New Roman" w:hAnsi="Times New Roman" w:cs="Times New Roman"/>
-          <w:lang w:val="es-ES"/>
         </w:rPr>
       </w:pPr>
     </w:p>
@@ -1035,6 +1076,7 @@
             <w:tabs>
               <w:tab w:val="right" w:leader="dot" w:pos="8492"/>
             </w:tabs>
+            <w:jc w:val="both"/>
             <w:rPr>
               <w:rFonts w:eastAsiaTheme="minorEastAsia"/>
               <w:b w:val="0"/>
@@ -1132,6 +1174,7 @@
             <w:tabs>
               <w:tab w:val="right" w:leader="dot" w:pos="8492"/>
             </w:tabs>
+            <w:jc w:val="both"/>
             <w:rPr>
               <w:rFonts w:eastAsiaTheme="minorEastAsia"/>
               <w:b w:val="0"/>
@@ -1207,6 +1250,7 @@
             <w:tabs>
               <w:tab w:val="right" w:leader="dot" w:pos="8492"/>
             </w:tabs>
+            <w:jc w:val="both"/>
             <w:rPr>
               <w:rFonts w:eastAsiaTheme="minorEastAsia"/>
               <w:b w:val="0"/>
@@ -1282,6 +1326,7 @@
             <w:tabs>
               <w:tab w:val="right" w:leader="dot" w:pos="8492"/>
             </w:tabs>
+            <w:jc w:val="both"/>
             <w:rPr>
               <w:rFonts w:eastAsiaTheme="minorEastAsia"/>
               <w:b w:val="0"/>
@@ -1357,6 +1402,7 @@
             <w:tabs>
               <w:tab w:val="right" w:leader="dot" w:pos="8492"/>
             </w:tabs>
+            <w:jc w:val="both"/>
             <w:rPr>
               <w:rFonts w:eastAsiaTheme="minorEastAsia"/>
               <w:b w:val="0"/>
@@ -1432,6 +1478,7 @@
             <w:tabs>
               <w:tab w:val="right" w:leader="dot" w:pos="8492"/>
             </w:tabs>
+            <w:jc w:val="both"/>
             <w:rPr>
               <w:rFonts w:eastAsiaTheme="minorEastAsia"/>
               <w:b w:val="0"/>
@@ -1507,6 +1554,7 @@
             <w:tabs>
               <w:tab w:val="right" w:leader="dot" w:pos="8492"/>
             </w:tabs>
+            <w:jc w:val="both"/>
             <w:rPr>
               <w:rFonts w:eastAsiaTheme="minorEastAsia"/>
               <w:b w:val="0"/>
@@ -1581,6 +1629,7 @@
             <w:tabs>
               <w:tab w:val="right" w:leader="dot" w:pos="8492"/>
             </w:tabs>
+            <w:jc w:val="both"/>
             <w:rPr>
               <w:rFonts w:eastAsiaTheme="minorEastAsia"/>
               <w:b w:val="0"/>
@@ -1656,6 +1705,7 @@
             <w:tabs>
               <w:tab w:val="right" w:leader="dot" w:pos="8492"/>
             </w:tabs>
+            <w:jc w:val="both"/>
             <w:rPr>
               <w:rFonts w:eastAsiaTheme="minorEastAsia"/>
               <w:b w:val="0"/>
@@ -1731,6 +1781,7 @@
             <w:tabs>
               <w:tab w:val="right" w:leader="dot" w:pos="8492"/>
             </w:tabs>
+            <w:jc w:val="both"/>
             <w:rPr>
               <w:rFonts w:eastAsiaTheme="minorEastAsia"/>
               <w:b w:val="0"/>
@@ -1806,6 +1857,7 @@
             <w:tabs>
               <w:tab w:val="right" w:leader="dot" w:pos="8492"/>
             </w:tabs>
+            <w:jc w:val="both"/>
             <w:rPr>
               <w:rFonts w:eastAsiaTheme="minorEastAsia"/>
               <w:b w:val="0"/>
@@ -1881,6 +1933,7 @@
             <w:tabs>
               <w:tab w:val="right" w:leader="dot" w:pos="8492"/>
             </w:tabs>
+            <w:jc w:val="both"/>
             <w:rPr>
               <w:rFonts w:eastAsiaTheme="minorEastAsia"/>
               <w:b w:val="0"/>
@@ -1898,7 +1951,25 @@
                 <w:noProof/>
                 <w:lang w:val="es-ES"/>
               </w:rPr>
-              <w:t>Gestión de rutas y clases con Polaris</w:t>
+              <w:t>Gestión de rutas y</w:t>
+            </w:r>
+            <w:r>
+              <w:rPr>
+                <w:rStyle w:val="Hyperlink"/>
+                <w:rFonts w:ascii="Times New Roman" w:hAnsi="Times New Roman" w:cs="Times New Roman"/>
+                <w:noProof/>
+                <w:lang w:val="es-ES"/>
+              </w:rPr>
+              <w:t xml:space="preserve"> </w:t>
+            </w:r>
+            <w:r>
+              <w:rPr>
+                <w:rStyle w:val="Hyperlink"/>
+                <w:rFonts w:ascii="Times New Roman" w:hAnsi="Times New Roman" w:cs="Times New Roman"/>
+                <w:noProof/>
+                <w:lang w:val="es-ES"/>
+              </w:rPr>
+              <w:t>clases con Polaris</w:t>
             </w:r>
             <w:r>
               <w:rPr>
@@ -1956,6 +2027,7 @@
             <w:tabs>
               <w:tab w:val="right" w:leader="dot" w:pos="8492"/>
             </w:tabs>
+            <w:jc w:val="both"/>
             <w:rPr>
               <w:rFonts w:eastAsiaTheme="minorEastAsia"/>
               <w:b w:val="0"/>
@@ -2031,6 +2103,7 @@
             <w:tabs>
               <w:tab w:val="right" w:leader="dot" w:pos="8492"/>
             </w:tabs>
+            <w:jc w:val="both"/>
             <w:rPr>
               <w:rFonts w:eastAsiaTheme="minorEastAsia"/>
               <w:b w:val="0"/>
@@ -2106,6 +2179,7 @@
             <w:tabs>
               <w:tab w:val="right" w:leader="dot" w:pos="8492"/>
             </w:tabs>
+            <w:jc w:val="both"/>
             <w:rPr>
               <w:rFonts w:eastAsiaTheme="minorEastAsia"/>
               <w:b w:val="0"/>
@@ -2181,6 +2255,7 @@
             <w:tabs>
               <w:tab w:val="right" w:leader="dot" w:pos="8492"/>
             </w:tabs>
+            <w:jc w:val="both"/>
             <w:rPr>
               <w:rFonts w:eastAsiaTheme="minorEastAsia"/>
               <w:b w:val="0"/>
@@ -2256,6 +2331,7 @@
             <w:tabs>
               <w:tab w:val="right" w:leader="dot" w:pos="8492"/>
             </w:tabs>
+            <w:jc w:val="both"/>
             <w:rPr>
               <w:rFonts w:eastAsiaTheme="minorEastAsia"/>
               <w:b w:val="0"/>
@@ -2331,6 +2407,7 @@
             <w:tabs>
               <w:tab w:val="right" w:leader="dot" w:pos="8492"/>
             </w:tabs>
+            <w:jc w:val="both"/>
             <w:rPr>
               <w:rFonts w:eastAsiaTheme="minorEastAsia"/>
               <w:b w:val="0"/>
@@ -2406,6 +2483,7 @@
             <w:tabs>
               <w:tab w:val="right" w:leader="dot" w:pos="8492"/>
             </w:tabs>
+            <w:jc w:val="both"/>
             <w:rPr>
               <w:rFonts w:eastAsiaTheme="minorEastAsia"/>
               <w:b w:val="0"/>
@@ -2481,6 +2559,7 @@
             <w:tabs>
               <w:tab w:val="right" w:leader="dot" w:pos="8492"/>
             </w:tabs>
+            <w:jc w:val="both"/>
             <w:rPr>
               <w:rFonts w:eastAsiaTheme="minorEastAsia"/>
               <w:b w:val="0"/>
@@ -3520,20 +3599,23 @@
     </w:p>
     <w:p>
       <w:pPr>
-        <w:rPr>
-          <w:lang w:val="es-ES"/>
-        </w:rPr>
-      </w:pPr>
-    </w:p>
-    <w:p>
-      <w:pPr>
-        <w:rPr>
-          <w:lang w:val="es-ES"/>
-        </w:rPr>
-      </w:pPr>
-    </w:p>
-    <w:p>
-      <w:pPr>
+        <w:jc w:val="both"/>
+        <w:rPr>
+          <w:lang w:val="es-ES"/>
+        </w:rPr>
+      </w:pPr>
+    </w:p>
+    <w:p>
+      <w:pPr>
+        <w:jc w:val="both"/>
+        <w:rPr>
+          <w:lang w:val="es-ES"/>
+        </w:rPr>
+      </w:pPr>
+    </w:p>
+    <w:p>
+      <w:pPr>
+        <w:jc w:val="both"/>
         <w:rPr>
           <w:lang w:val="es-ES"/>
         </w:rPr>
@@ -6356,6 +6438,7 @@
     <w:p>
       <w:pPr>
         <w:pStyle w:val="Heading2"/>
+        <w:jc w:val="both"/>
         <w:rPr>
           <w:rFonts w:ascii="Times New Roman" w:hAnsi="Times New Roman" w:cs="Times New Roman"/>
           <w:b/>
@@ -8037,6 +8120,7 @@
     <w:p>
       <w:pPr>
         <w:pStyle w:val="Heading2"/>
+        <w:jc w:val="both"/>
         <w:rPr>
           <w:rFonts w:ascii="Times New Roman" w:hAnsi="Times New Roman" w:cs="Times New Roman"/>
           <w:b/>
@@ -8051,6 +8135,7 @@
     <w:p>
       <w:pPr>
         <w:pStyle w:val="Heading2"/>
+        <w:jc w:val="both"/>
         <w:rPr>
           <w:rFonts w:ascii="Times New Roman" w:hAnsi="Times New Roman" w:cs="Times New Roman"/>
           <w:b/>
@@ -8064,6 +8149,7 @@
     <w:p>
       <w:pPr>
         <w:pStyle w:val="Heading2"/>
+        <w:jc w:val="both"/>
         <w:rPr>
           <w:rFonts w:ascii="Times New Roman" w:hAnsi="Times New Roman" w:cs="Times New Roman"/>
           <w:b/>
@@ -8077,6 +8163,7 @@
     <w:p>
       <w:pPr>
         <w:pStyle w:val="Heading2"/>
+        <w:jc w:val="both"/>
         <w:rPr>
           <w:rFonts w:ascii="Times New Roman" w:hAnsi="Times New Roman" w:cs="Times New Roman"/>
           <w:b/>
@@ -8090,6 +8177,7 @@
     <w:p>
       <w:pPr>
         <w:pStyle w:val="Heading2"/>
+        <w:jc w:val="both"/>
         <w:rPr>
           <w:rFonts w:ascii="Times New Roman" w:hAnsi="Times New Roman" w:cs="Times New Roman"/>
           <w:b/>
@@ -8103,6 +8191,7 @@
     <w:p>
       <w:pPr>
         <w:pStyle w:val="Heading2"/>
+        <w:jc w:val="both"/>
         <w:rPr>
           <w:rFonts w:ascii="Times New Roman" w:hAnsi="Times New Roman" w:cs="Times New Roman"/>
           <w:b/>
@@ -8116,6 +8205,7 @@
     <w:p>
       <w:pPr>
         <w:pStyle w:val="Heading2"/>
+        <w:jc w:val="both"/>
         <w:rPr>
           <w:rFonts w:ascii="Times New Roman" w:hAnsi="Times New Roman" w:cs="Times New Roman"/>
           <w:b/>
@@ -8128,6 +8218,7 @@
     </w:p>
     <w:p>
       <w:pPr>
+        <w:jc w:val="both"/>
         <w:rPr>
           <w:lang w:val="es-ES"/>
         </w:rPr>
@@ -8136,6 +8227,7 @@
     <w:p>
       <w:pPr>
         <w:pStyle w:val="Heading2"/>
+        <w:jc w:val="both"/>
         <w:rPr>
           <w:rFonts w:ascii="Times New Roman" w:hAnsi="Times New Roman" w:cs="Times New Roman"/>
           <w:b/>
@@ -9415,6 +9507,32 @@
                 <w:szCs w:val="20"/>
               </w:rPr>
               <w:t>TINYINT</w:t>
+            </w:r>
+            <w:r>
+              <w:rPr>
+                <w:rFonts w:ascii="Times New Roman" w:hAnsi="Times New Roman" w:cs="Times New Roman"/>
+                <w:sz w:val="20"/>
+                <w:szCs w:val="20"/>
+              </w:rPr>
+              <w:t xml:space="preserve"> (</w:t>
+            </w:r>
+            <w:proofErr w:type="spellStart"/>
+            <w:r>
+              <w:rPr>
+                <w:rFonts w:ascii="Times New Roman" w:hAnsi="Times New Roman" w:cs="Times New Roman"/>
+                <w:sz w:val="20"/>
+                <w:szCs w:val="20"/>
+              </w:rPr>
+              <w:t>boolean</w:t>
+            </w:r>
+            <w:proofErr w:type="spellEnd"/>
+            <w:r>
+              <w:rPr>
+                <w:rFonts w:ascii="Times New Roman" w:hAnsi="Times New Roman" w:cs="Times New Roman"/>
+                <w:sz w:val="20"/>
+                <w:szCs w:val="20"/>
+              </w:rPr>
+              <w:t>)</w:t>
             </w:r>
           </w:p>
         </w:tc>
@@ -19421,6 +19539,7 @@
     </w:tbl>
     <w:p>
       <w:pPr>
+        <w:jc w:val="both"/>
         <w:rPr>
           <w:lang w:val="es-ES"/>
         </w:rPr>
@@ -19595,6 +19714,7 @@
     <w:p>
       <w:pPr>
         <w:spacing w:line="360" w:lineRule="auto"/>
+        <w:jc w:val="both"/>
         <w:rPr>
           <w:rFonts w:ascii="Times New Roman" w:hAnsi="Times New Roman" w:cs="Times New Roman"/>
           <w:lang w:val="es-ES"/>
@@ -19616,6 +19736,7 @@
           <w:numId w:val="30"/>
         </w:numPr>
         <w:spacing w:line="360" w:lineRule="auto"/>
+        <w:jc w:val="both"/>
         <w:rPr>
           <w:rFonts w:ascii="Times New Roman" w:hAnsi="Times New Roman" w:cs="Times New Roman"/>
           <w:lang w:val="es-ES"/>
@@ -19646,6 +19767,7 @@
           <w:numId w:val="30"/>
         </w:numPr>
         <w:spacing w:line="360" w:lineRule="auto"/>
+        <w:jc w:val="both"/>
         <w:rPr>
           <w:rFonts w:ascii="Times New Roman" w:hAnsi="Times New Roman" w:cs="Times New Roman"/>
           <w:lang w:val="es-ES"/>
@@ -19676,6 +19798,7 @@
           <w:numId w:val="30"/>
         </w:numPr>
         <w:spacing w:line="360" w:lineRule="auto"/>
+        <w:jc w:val="both"/>
         <w:rPr>
           <w:rFonts w:ascii="Times New Roman" w:hAnsi="Times New Roman" w:cs="Times New Roman"/>
           <w:lang w:val="es-ES"/>
@@ -19706,6 +19829,7 @@
           <w:numId w:val="30"/>
         </w:numPr>
         <w:spacing w:line="360" w:lineRule="auto"/>
+        <w:jc w:val="both"/>
         <w:rPr>
           <w:rFonts w:ascii="Times New Roman" w:hAnsi="Times New Roman" w:cs="Times New Roman"/>
           <w:lang w:val="es-ES"/>
@@ -20079,10 +20203,1829 @@
     </w:p>
     <w:p>
       <w:pPr>
+        <w:pStyle w:val="Heading2"/>
+        <w:spacing w:line="360" w:lineRule="auto"/>
+        <w:jc w:val="both"/>
+        <w:rPr>
+          <w:rFonts w:ascii="Times New Roman" w:hAnsi="Times New Roman" w:cs="Times New Roman"/>
+          <w:b/>
+          <w:bCs/>
+          <w:sz w:val="28"/>
+          <w:szCs w:val="28"/>
+          <w:lang w:val="es-ES"/>
+        </w:rPr>
+      </w:pPr>
+    </w:p>
+    <w:p>
+      <w:pPr>
+        <w:pStyle w:val="Heading2"/>
+        <w:spacing w:line="360" w:lineRule="auto"/>
+        <w:jc w:val="both"/>
+        <w:rPr>
+          <w:rFonts w:ascii="Times New Roman" w:hAnsi="Times New Roman" w:cs="Times New Roman"/>
+          <w:b/>
+          <w:bCs/>
+          <w:sz w:val="28"/>
+          <w:szCs w:val="28"/>
+          <w:lang w:val="es-ES"/>
+        </w:rPr>
+      </w:pPr>
+    </w:p>
+    <w:p>
+      <w:pPr>
+        <w:pStyle w:val="Heading2"/>
+        <w:spacing w:line="360" w:lineRule="auto"/>
+        <w:jc w:val="both"/>
+        <w:rPr>
+          <w:rFonts w:ascii="Times New Roman" w:hAnsi="Times New Roman" w:cs="Times New Roman"/>
+          <w:b/>
+          <w:bCs/>
+          <w:sz w:val="28"/>
+          <w:szCs w:val="28"/>
+          <w:lang w:val="es-ES"/>
+        </w:rPr>
+      </w:pPr>
+    </w:p>
+    <w:p>
+      <w:pPr>
+        <w:pStyle w:val="Heading2"/>
+        <w:spacing w:line="360" w:lineRule="auto"/>
+        <w:jc w:val="both"/>
+        <w:rPr>
+          <w:rFonts w:ascii="Times New Roman" w:hAnsi="Times New Roman" w:cs="Times New Roman"/>
+          <w:b/>
+          <w:bCs/>
+          <w:sz w:val="28"/>
+          <w:szCs w:val="28"/>
+          <w:lang w:val="es-ES"/>
+        </w:rPr>
+      </w:pPr>
+    </w:p>
+    <w:p>
+      <w:pPr>
+        <w:pStyle w:val="Heading2"/>
+        <w:spacing w:line="360" w:lineRule="auto"/>
+        <w:jc w:val="both"/>
+        <w:rPr>
+          <w:rFonts w:ascii="Times New Roman" w:hAnsi="Times New Roman" w:cs="Times New Roman"/>
+          <w:b/>
+          <w:bCs/>
+          <w:sz w:val="28"/>
+          <w:szCs w:val="28"/>
+          <w:lang w:val="es-ES"/>
+        </w:rPr>
+      </w:pPr>
+    </w:p>
+    <w:p>
+      <w:pPr>
+        <w:pStyle w:val="Heading2"/>
+        <w:spacing w:line="360" w:lineRule="auto"/>
+        <w:jc w:val="both"/>
+        <w:rPr>
+          <w:rFonts w:ascii="Times New Roman" w:hAnsi="Times New Roman" w:cs="Times New Roman"/>
+          <w:b/>
+          <w:bCs/>
+          <w:sz w:val="28"/>
+          <w:szCs w:val="28"/>
+          <w:lang w:val="es-ES"/>
+        </w:rPr>
+      </w:pPr>
+    </w:p>
+    <w:p>
+      <w:pPr>
+        <w:pStyle w:val="Heading2"/>
+        <w:spacing w:line="360" w:lineRule="auto"/>
+        <w:jc w:val="both"/>
+        <w:rPr>
+          <w:rFonts w:ascii="Times New Roman" w:hAnsi="Times New Roman" w:cs="Times New Roman"/>
+          <w:b/>
+          <w:bCs/>
+          <w:sz w:val="28"/>
+          <w:szCs w:val="28"/>
+          <w:lang w:val="es-ES"/>
+        </w:rPr>
+      </w:pPr>
+    </w:p>
+    <w:p>
+      <w:pPr>
+        <w:pStyle w:val="Heading2"/>
+        <w:spacing w:line="360" w:lineRule="auto"/>
+        <w:jc w:val="both"/>
+        <w:rPr>
+          <w:rFonts w:ascii="Times New Roman" w:hAnsi="Times New Roman" w:cs="Times New Roman"/>
+          <w:b/>
+          <w:bCs/>
+          <w:sz w:val="28"/>
+          <w:szCs w:val="28"/>
+          <w:lang w:val="es-ES"/>
+        </w:rPr>
+      </w:pPr>
+    </w:p>
+    <w:p>
+      <w:pPr>
+        <w:pStyle w:val="Heading2"/>
+        <w:spacing w:line="360" w:lineRule="auto"/>
+        <w:jc w:val="both"/>
+        <w:rPr>
+          <w:rFonts w:ascii="Times New Roman" w:hAnsi="Times New Roman" w:cs="Times New Roman"/>
+          <w:b/>
+          <w:bCs/>
+          <w:sz w:val="28"/>
+          <w:szCs w:val="28"/>
+          <w:lang w:val="es-ES"/>
+        </w:rPr>
+      </w:pPr>
+    </w:p>
+    <w:p>
+      <w:pPr>
+        <w:jc w:val="both"/>
+        <w:rPr>
+          <w:lang w:val="es-ES"/>
+        </w:rPr>
+      </w:pPr>
+    </w:p>
+    <w:p>
+      <w:pPr>
+        <w:pStyle w:val="Heading2"/>
+        <w:spacing w:line="360" w:lineRule="auto"/>
+        <w:jc w:val="both"/>
+        <w:rPr>
+          <w:rFonts w:ascii="Times New Roman" w:hAnsi="Times New Roman" w:cs="Times New Roman"/>
+          <w:b/>
+          <w:bCs/>
+          <w:sz w:val="28"/>
+          <w:szCs w:val="28"/>
+          <w:lang w:val="es-ES"/>
+        </w:rPr>
+      </w:pPr>
+      <w:r>
+        <w:rPr>
+          <w:rFonts w:ascii="Times New Roman" w:hAnsi="Times New Roman" w:cs="Times New Roman"/>
+          <w:b/>
+          <w:bCs/>
+          <w:sz w:val="28"/>
+          <w:szCs w:val="28"/>
+          <w:lang w:val="es-ES"/>
+        </w:rPr>
+        <w:lastRenderedPageBreak/>
+        <w:t>Gestión de roles en la aplicación</w:t>
+      </w:r>
+    </w:p>
+    <w:p>
+      <w:pPr>
+        <w:spacing w:line="360" w:lineRule="auto"/>
+        <w:jc w:val="both"/>
+        <w:rPr>
+          <w:rFonts w:ascii="Times New Roman" w:hAnsi="Times New Roman" w:cs="Times New Roman"/>
+          <w:lang w:val="es-ES"/>
+        </w:rPr>
+      </w:pPr>
+      <w:r>
+        <w:rPr>
+          <w:rFonts w:ascii="Times New Roman" w:hAnsi="Times New Roman" w:cs="Times New Roman"/>
+          <w:lang w:val="es-ES"/>
+        </w:rPr>
+        <w:t>Dentro de la aplicación, existe un tipo de panel diferente para cada rol (tutor, monitor y administrador). Por ejemplo, un monitor no tiene acceso al apartado de finanzas, el cual pertenece al panel de administrador.</w:t>
+      </w:r>
+    </w:p>
+    <w:p>
+      <w:pPr>
+        <w:spacing w:line="360" w:lineRule="auto"/>
+        <w:jc w:val="both"/>
+        <w:rPr>
+          <w:rFonts w:ascii="Times New Roman" w:hAnsi="Times New Roman" w:cs="Times New Roman"/>
+          <w:lang w:val="es-ES"/>
+        </w:rPr>
+      </w:pPr>
+    </w:p>
+    <w:p>
+      <w:pPr>
+        <w:spacing w:line="360" w:lineRule="auto"/>
+        <w:jc w:val="both"/>
+        <w:rPr>
+          <w:rFonts w:ascii="Times New Roman" w:hAnsi="Times New Roman" w:cs="Times New Roman"/>
+          <w:b/>
+          <w:bCs/>
+          <w:lang w:val="es-ES"/>
+        </w:rPr>
+      </w:pPr>
+      <w:r>
+        <w:rPr>
+          <w:rFonts w:ascii="Times New Roman" w:hAnsi="Times New Roman" w:cs="Times New Roman"/>
+          <w:b/>
+          <w:bCs/>
+          <w:lang w:val="es-ES"/>
+        </w:rPr>
+        <w:t>Tabla de roles</w:t>
+      </w:r>
+    </w:p>
+    <w:tbl>
+      <w:tblPr>
+        <w:tblW w:w="5000" w:type="pct"/>
+        <w:tblCellMar>
+          <w:left w:w="0" w:type="dxa"/>
+          <w:right w:w="0" w:type="dxa"/>
+        </w:tblCellMar>
+        <w:tblLook w:val="04A0" w:firstRow="1" w:lastRow="0" w:firstColumn="1" w:lastColumn="0" w:noHBand="0" w:noVBand="1"/>
+      </w:tblPr>
+      <w:tblGrid>
+        <w:gridCol w:w="3578"/>
+        <w:gridCol w:w="2464"/>
+        <w:gridCol w:w="2444"/>
+      </w:tblGrid>
+      <w:tr>
+        <w:trPr>
+          <w:trHeight w:val="150"/>
+        </w:trPr>
+        <w:tc>
+          <w:tcPr>
+            <w:tcW w:w="2108" w:type="pct"/>
+            <w:tcBorders>
+              <w:top w:val="single" w:sz="6" w:space="0" w:color="000000"/>
+              <w:left w:val="single" w:sz="6" w:space="0" w:color="000000"/>
+              <w:bottom w:val="single" w:sz="6" w:space="0" w:color="000000"/>
+              <w:right w:val="single" w:sz="6" w:space="0" w:color="000000"/>
+            </w:tcBorders>
+            <w:shd w:val="clear" w:color="auto" w:fill="B0B3B2"/>
+            <w:tcMar>
+              <w:top w:w="0" w:type="dxa"/>
+              <w:left w:w="30" w:type="dxa"/>
+              <w:bottom w:w="30" w:type="dxa"/>
+              <w:right w:w="30" w:type="dxa"/>
+            </w:tcMar>
+            <w:vAlign w:val="bottom"/>
+            <w:hideMark/>
+          </w:tcPr>
+          <w:p>
+            <w:pPr>
+              <w:jc w:val="both"/>
+              <w:rPr>
+                <w:sz w:val="20"/>
+                <w:szCs w:val="20"/>
+              </w:rPr>
+            </w:pPr>
+            <w:r>
+              <w:rPr>
+                <w:b/>
+                <w:bCs/>
+                <w:sz w:val="20"/>
+                <w:szCs w:val="20"/>
+              </w:rPr>
+              <w:t>Página</w:t>
+            </w:r>
+          </w:p>
+        </w:tc>
+        <w:tc>
+          <w:tcPr>
+            <w:tcW w:w="1452" w:type="pct"/>
+            <w:tcBorders>
+              <w:top w:val="single" w:sz="6" w:space="0" w:color="000000"/>
+              <w:left w:val="single" w:sz="6" w:space="0" w:color="000000"/>
+              <w:bottom w:val="single" w:sz="6" w:space="0" w:color="000000"/>
+              <w:right w:val="single" w:sz="6" w:space="0" w:color="000000"/>
+            </w:tcBorders>
+            <w:shd w:val="clear" w:color="auto" w:fill="B0B3B2"/>
+            <w:tcMar>
+              <w:top w:w="0" w:type="dxa"/>
+              <w:left w:w="30" w:type="dxa"/>
+              <w:bottom w:w="30" w:type="dxa"/>
+              <w:right w:w="30" w:type="dxa"/>
+            </w:tcMar>
+            <w:vAlign w:val="bottom"/>
+            <w:hideMark/>
+          </w:tcPr>
+          <w:p>
+            <w:pPr>
+              <w:jc w:val="both"/>
+              <w:rPr>
+                <w:sz w:val="20"/>
+                <w:szCs w:val="20"/>
+              </w:rPr>
+            </w:pPr>
+            <w:r>
+              <w:rPr>
+                <w:b/>
+                <w:bCs/>
+                <w:sz w:val="20"/>
+                <w:szCs w:val="20"/>
+              </w:rPr>
+              <w:t>Rol</w:t>
+            </w:r>
+          </w:p>
+        </w:tc>
+        <w:tc>
+          <w:tcPr>
+            <w:tcW w:w="1440" w:type="pct"/>
+            <w:tcBorders>
+              <w:top w:val="single" w:sz="6" w:space="0" w:color="000000"/>
+              <w:left w:val="single" w:sz="6" w:space="0" w:color="000000"/>
+              <w:bottom w:val="single" w:sz="6" w:space="0" w:color="000000"/>
+              <w:right w:val="single" w:sz="6" w:space="0" w:color="000000"/>
+            </w:tcBorders>
+            <w:shd w:val="clear" w:color="auto" w:fill="B0B3B2"/>
+            <w:tcMar>
+              <w:top w:w="0" w:type="dxa"/>
+              <w:left w:w="30" w:type="dxa"/>
+              <w:bottom w:w="30" w:type="dxa"/>
+              <w:right w:w="30" w:type="dxa"/>
+            </w:tcMar>
+            <w:vAlign w:val="bottom"/>
+            <w:hideMark/>
+          </w:tcPr>
+          <w:p>
+            <w:pPr>
+              <w:jc w:val="both"/>
+              <w:rPr>
+                <w:sz w:val="20"/>
+                <w:szCs w:val="20"/>
+              </w:rPr>
+            </w:pPr>
+            <w:proofErr w:type="spellStart"/>
+            <w:r>
+              <w:rPr>
+                <w:b/>
+                <w:bCs/>
+                <w:sz w:val="20"/>
+                <w:szCs w:val="20"/>
+              </w:rPr>
+              <w:t>Sección</w:t>
+            </w:r>
+            <w:proofErr w:type="spellEnd"/>
+          </w:p>
+        </w:tc>
+      </w:tr>
+      <w:tr>
+        <w:trPr>
+          <w:trHeight w:val="150"/>
+        </w:trPr>
+        <w:tc>
+          <w:tcPr>
+            <w:tcW w:w="2108" w:type="pct"/>
+            <w:tcBorders>
+              <w:top w:val="single" w:sz="6" w:space="0" w:color="000000"/>
+              <w:left w:val="single" w:sz="6" w:space="0" w:color="000000"/>
+              <w:bottom w:val="single" w:sz="6" w:space="0" w:color="000000"/>
+              <w:right w:val="single" w:sz="6" w:space="0" w:color="000000"/>
+            </w:tcBorders>
+            <w:shd w:val="clear" w:color="auto" w:fill="D4D4D4"/>
+            <w:tcMar>
+              <w:top w:w="0" w:type="dxa"/>
+              <w:left w:w="30" w:type="dxa"/>
+              <w:bottom w:w="30" w:type="dxa"/>
+              <w:right w:w="30" w:type="dxa"/>
+            </w:tcMar>
+            <w:vAlign w:val="bottom"/>
+            <w:hideMark/>
+          </w:tcPr>
+          <w:p>
+            <w:pPr>
+              <w:jc w:val="both"/>
+              <w:rPr>
+                <w:sz w:val="20"/>
+                <w:szCs w:val="20"/>
+              </w:rPr>
+            </w:pPr>
+            <w:r>
+              <w:rPr>
+                <w:b/>
+                <w:bCs/>
+                <w:sz w:val="20"/>
+                <w:szCs w:val="20"/>
+              </w:rPr>
+              <w:t>Tutor</w:t>
+            </w:r>
+          </w:p>
+        </w:tc>
+        <w:tc>
+          <w:tcPr>
+            <w:tcW w:w="1452" w:type="pct"/>
+            <w:tcBorders>
+              <w:top w:val="single" w:sz="6" w:space="0" w:color="000000"/>
+              <w:left w:val="single" w:sz="6" w:space="0" w:color="000000"/>
+              <w:bottom w:val="single" w:sz="6" w:space="0" w:color="000000"/>
+              <w:right w:val="single" w:sz="6" w:space="0" w:color="000000"/>
+            </w:tcBorders>
+            <w:tcMar>
+              <w:top w:w="0" w:type="dxa"/>
+              <w:left w:w="30" w:type="dxa"/>
+              <w:bottom w:w="30" w:type="dxa"/>
+              <w:right w:w="30" w:type="dxa"/>
+            </w:tcMar>
+            <w:vAlign w:val="bottom"/>
+            <w:hideMark/>
+          </w:tcPr>
+          <w:p>
+            <w:pPr>
+              <w:jc w:val="both"/>
+              <w:rPr>
+                <w:sz w:val="20"/>
+                <w:szCs w:val="20"/>
+              </w:rPr>
+            </w:pPr>
+            <w:r>
+              <w:rPr>
+                <w:sz w:val="20"/>
+                <w:szCs w:val="20"/>
+              </w:rPr>
+              <w:t>0</w:t>
+            </w:r>
+          </w:p>
+        </w:tc>
+        <w:tc>
+          <w:tcPr>
+            <w:tcW w:w="1440" w:type="pct"/>
+            <w:tcBorders>
+              <w:top w:val="single" w:sz="6" w:space="0" w:color="000000"/>
+              <w:left w:val="single" w:sz="6" w:space="0" w:color="000000"/>
+              <w:bottom w:val="single" w:sz="6" w:space="0" w:color="000000"/>
+              <w:right w:val="single" w:sz="6" w:space="0" w:color="000000"/>
+            </w:tcBorders>
+            <w:tcMar>
+              <w:top w:w="0" w:type="dxa"/>
+              <w:left w:w="30" w:type="dxa"/>
+              <w:bottom w:w="30" w:type="dxa"/>
+              <w:right w:w="30" w:type="dxa"/>
+            </w:tcMar>
+            <w:vAlign w:val="bottom"/>
+            <w:hideMark/>
+          </w:tcPr>
+          <w:p>
+            <w:pPr>
+              <w:jc w:val="both"/>
+              <w:rPr>
+                <w:sz w:val="20"/>
+                <w:szCs w:val="20"/>
+              </w:rPr>
+            </w:pPr>
+            <w:r>
+              <w:rPr>
+                <w:sz w:val="20"/>
+                <w:szCs w:val="20"/>
+              </w:rPr>
+              <w:t>Tutor</w:t>
+            </w:r>
+          </w:p>
+        </w:tc>
+      </w:tr>
+      <w:tr>
+        <w:trPr>
+          <w:trHeight w:val="150"/>
+        </w:trPr>
+        <w:tc>
+          <w:tcPr>
+            <w:tcW w:w="2108" w:type="pct"/>
+            <w:tcBorders>
+              <w:top w:val="single" w:sz="6" w:space="0" w:color="000000"/>
+              <w:left w:val="single" w:sz="6" w:space="0" w:color="000000"/>
+              <w:bottom w:val="single" w:sz="6" w:space="0" w:color="000000"/>
+              <w:right w:val="single" w:sz="6" w:space="0" w:color="000000"/>
+            </w:tcBorders>
+            <w:shd w:val="clear" w:color="auto" w:fill="D4D4D4"/>
+            <w:tcMar>
+              <w:top w:w="0" w:type="dxa"/>
+              <w:left w:w="30" w:type="dxa"/>
+              <w:bottom w:w="30" w:type="dxa"/>
+              <w:right w:w="30" w:type="dxa"/>
+            </w:tcMar>
+            <w:vAlign w:val="bottom"/>
+            <w:hideMark/>
+          </w:tcPr>
+          <w:p>
+            <w:pPr>
+              <w:jc w:val="both"/>
+              <w:rPr>
+                <w:sz w:val="20"/>
+                <w:szCs w:val="20"/>
+              </w:rPr>
+            </w:pPr>
+            <w:r>
+              <w:rPr>
+                <w:b/>
+                <w:bCs/>
+                <w:sz w:val="20"/>
+                <w:szCs w:val="20"/>
+              </w:rPr>
+              <w:t>Attendance</w:t>
+            </w:r>
+          </w:p>
+        </w:tc>
+        <w:tc>
+          <w:tcPr>
+            <w:tcW w:w="1452" w:type="pct"/>
+            <w:tcBorders>
+              <w:top w:val="single" w:sz="6" w:space="0" w:color="000000"/>
+              <w:left w:val="single" w:sz="6" w:space="0" w:color="000000"/>
+              <w:bottom w:val="single" w:sz="6" w:space="0" w:color="000000"/>
+              <w:right w:val="single" w:sz="6" w:space="0" w:color="000000"/>
+            </w:tcBorders>
+            <w:tcMar>
+              <w:top w:w="0" w:type="dxa"/>
+              <w:left w:w="30" w:type="dxa"/>
+              <w:bottom w:w="30" w:type="dxa"/>
+              <w:right w:w="30" w:type="dxa"/>
+            </w:tcMar>
+            <w:vAlign w:val="bottom"/>
+            <w:hideMark/>
+          </w:tcPr>
+          <w:p>
+            <w:pPr>
+              <w:jc w:val="both"/>
+              <w:rPr>
+                <w:sz w:val="20"/>
+                <w:szCs w:val="20"/>
+              </w:rPr>
+            </w:pPr>
+            <w:r>
+              <w:rPr>
+                <w:sz w:val="20"/>
+                <w:szCs w:val="20"/>
+              </w:rPr>
+              <w:t>1</w:t>
+            </w:r>
+          </w:p>
+        </w:tc>
+        <w:tc>
+          <w:tcPr>
+            <w:tcW w:w="1440" w:type="pct"/>
+            <w:tcBorders>
+              <w:top w:val="single" w:sz="6" w:space="0" w:color="000000"/>
+              <w:left w:val="single" w:sz="6" w:space="0" w:color="000000"/>
+              <w:bottom w:val="single" w:sz="6" w:space="0" w:color="000000"/>
+              <w:right w:val="single" w:sz="6" w:space="0" w:color="000000"/>
+            </w:tcBorders>
+            <w:tcMar>
+              <w:top w:w="0" w:type="dxa"/>
+              <w:left w:w="30" w:type="dxa"/>
+              <w:bottom w:w="30" w:type="dxa"/>
+              <w:right w:w="30" w:type="dxa"/>
+            </w:tcMar>
+            <w:vAlign w:val="bottom"/>
+            <w:hideMark/>
+          </w:tcPr>
+          <w:p>
+            <w:pPr>
+              <w:jc w:val="both"/>
+              <w:rPr>
+                <w:sz w:val="20"/>
+                <w:szCs w:val="20"/>
+              </w:rPr>
+            </w:pPr>
+            <w:r>
+              <w:rPr>
+                <w:sz w:val="20"/>
+                <w:szCs w:val="20"/>
+              </w:rPr>
+              <w:t>Monitor</w:t>
+            </w:r>
+          </w:p>
+        </w:tc>
+      </w:tr>
+      <w:tr>
+        <w:trPr>
+          <w:trHeight w:val="150"/>
+        </w:trPr>
+        <w:tc>
+          <w:tcPr>
+            <w:tcW w:w="2108" w:type="pct"/>
+            <w:tcBorders>
+              <w:top w:val="single" w:sz="6" w:space="0" w:color="000000"/>
+              <w:left w:val="single" w:sz="6" w:space="0" w:color="000000"/>
+              <w:bottom w:val="single" w:sz="6" w:space="0" w:color="000000"/>
+              <w:right w:val="single" w:sz="6" w:space="0" w:color="000000"/>
+            </w:tcBorders>
+            <w:shd w:val="clear" w:color="auto" w:fill="D4D4D4"/>
+            <w:tcMar>
+              <w:top w:w="0" w:type="dxa"/>
+              <w:left w:w="30" w:type="dxa"/>
+              <w:bottom w:w="30" w:type="dxa"/>
+              <w:right w:w="30" w:type="dxa"/>
+            </w:tcMar>
+            <w:vAlign w:val="bottom"/>
+            <w:hideMark/>
+          </w:tcPr>
+          <w:p>
+            <w:pPr>
+              <w:jc w:val="both"/>
+              <w:rPr>
+                <w:sz w:val="20"/>
+                <w:szCs w:val="20"/>
+              </w:rPr>
+            </w:pPr>
+            <w:r>
+              <w:rPr>
+                <w:b/>
+                <w:bCs/>
+                <w:sz w:val="20"/>
+                <w:szCs w:val="20"/>
+              </w:rPr>
+              <w:t>Schedule</w:t>
+            </w:r>
+          </w:p>
+        </w:tc>
+        <w:tc>
+          <w:tcPr>
+            <w:tcW w:w="1452" w:type="pct"/>
+            <w:tcBorders>
+              <w:top w:val="single" w:sz="6" w:space="0" w:color="000000"/>
+              <w:left w:val="single" w:sz="6" w:space="0" w:color="000000"/>
+              <w:bottom w:val="single" w:sz="6" w:space="0" w:color="000000"/>
+              <w:right w:val="single" w:sz="6" w:space="0" w:color="000000"/>
+            </w:tcBorders>
+            <w:tcMar>
+              <w:top w:w="0" w:type="dxa"/>
+              <w:left w:w="30" w:type="dxa"/>
+              <w:bottom w:w="30" w:type="dxa"/>
+              <w:right w:w="30" w:type="dxa"/>
+            </w:tcMar>
+            <w:vAlign w:val="bottom"/>
+            <w:hideMark/>
+          </w:tcPr>
+          <w:p>
+            <w:pPr>
+              <w:jc w:val="both"/>
+              <w:rPr>
+                <w:sz w:val="20"/>
+                <w:szCs w:val="20"/>
+              </w:rPr>
+            </w:pPr>
+            <w:r>
+              <w:rPr>
+                <w:sz w:val="20"/>
+                <w:szCs w:val="20"/>
+              </w:rPr>
+              <w:t>1</w:t>
+            </w:r>
+          </w:p>
+        </w:tc>
+        <w:tc>
+          <w:tcPr>
+            <w:tcW w:w="1440" w:type="pct"/>
+            <w:tcBorders>
+              <w:top w:val="single" w:sz="6" w:space="0" w:color="000000"/>
+              <w:left w:val="single" w:sz="6" w:space="0" w:color="000000"/>
+              <w:bottom w:val="single" w:sz="6" w:space="0" w:color="000000"/>
+              <w:right w:val="single" w:sz="6" w:space="0" w:color="000000"/>
+            </w:tcBorders>
+            <w:tcMar>
+              <w:top w:w="0" w:type="dxa"/>
+              <w:left w:w="30" w:type="dxa"/>
+              <w:bottom w:w="30" w:type="dxa"/>
+              <w:right w:w="30" w:type="dxa"/>
+            </w:tcMar>
+            <w:vAlign w:val="bottom"/>
+            <w:hideMark/>
+          </w:tcPr>
+          <w:p>
+            <w:pPr>
+              <w:jc w:val="both"/>
+              <w:rPr>
+                <w:sz w:val="20"/>
+                <w:szCs w:val="20"/>
+              </w:rPr>
+            </w:pPr>
+            <w:r>
+              <w:rPr>
+                <w:sz w:val="20"/>
+                <w:szCs w:val="20"/>
+              </w:rPr>
+              <w:t>Monitor</w:t>
+            </w:r>
+          </w:p>
+        </w:tc>
+      </w:tr>
+      <w:tr>
+        <w:trPr>
+          <w:trHeight w:val="150"/>
+        </w:trPr>
+        <w:tc>
+          <w:tcPr>
+            <w:tcW w:w="2108" w:type="pct"/>
+            <w:tcBorders>
+              <w:top w:val="single" w:sz="6" w:space="0" w:color="000000"/>
+              <w:left w:val="single" w:sz="6" w:space="0" w:color="000000"/>
+              <w:bottom w:val="single" w:sz="6" w:space="0" w:color="000000"/>
+              <w:right w:val="single" w:sz="6" w:space="0" w:color="000000"/>
+            </w:tcBorders>
+            <w:shd w:val="clear" w:color="auto" w:fill="D4D4D4"/>
+            <w:tcMar>
+              <w:top w:w="0" w:type="dxa"/>
+              <w:left w:w="30" w:type="dxa"/>
+              <w:bottom w:w="30" w:type="dxa"/>
+              <w:right w:w="30" w:type="dxa"/>
+            </w:tcMar>
+            <w:vAlign w:val="bottom"/>
+            <w:hideMark/>
+          </w:tcPr>
+          <w:p>
+            <w:pPr>
+              <w:jc w:val="both"/>
+              <w:rPr>
+                <w:sz w:val="20"/>
+                <w:szCs w:val="20"/>
+              </w:rPr>
+            </w:pPr>
+            <w:r>
+              <w:rPr>
+                <w:b/>
+                <w:bCs/>
+                <w:sz w:val="20"/>
+                <w:szCs w:val="20"/>
+              </w:rPr>
+              <w:t>Finances</w:t>
+            </w:r>
+          </w:p>
+        </w:tc>
+        <w:tc>
+          <w:tcPr>
+            <w:tcW w:w="1452" w:type="pct"/>
+            <w:tcBorders>
+              <w:top w:val="single" w:sz="6" w:space="0" w:color="000000"/>
+              <w:left w:val="single" w:sz="6" w:space="0" w:color="000000"/>
+              <w:bottom w:val="single" w:sz="6" w:space="0" w:color="000000"/>
+              <w:right w:val="single" w:sz="6" w:space="0" w:color="000000"/>
+            </w:tcBorders>
+            <w:tcMar>
+              <w:top w:w="0" w:type="dxa"/>
+              <w:left w:w="30" w:type="dxa"/>
+              <w:bottom w:w="30" w:type="dxa"/>
+              <w:right w:w="30" w:type="dxa"/>
+            </w:tcMar>
+            <w:vAlign w:val="bottom"/>
+            <w:hideMark/>
+          </w:tcPr>
+          <w:p>
+            <w:pPr>
+              <w:jc w:val="both"/>
+              <w:rPr>
+                <w:sz w:val="20"/>
+                <w:szCs w:val="20"/>
+              </w:rPr>
+            </w:pPr>
+            <w:r>
+              <w:rPr>
+                <w:sz w:val="20"/>
+                <w:szCs w:val="20"/>
+              </w:rPr>
+              <w:t>2</w:t>
+            </w:r>
+          </w:p>
+        </w:tc>
+        <w:tc>
+          <w:tcPr>
+            <w:tcW w:w="1440" w:type="pct"/>
+            <w:tcBorders>
+              <w:top w:val="single" w:sz="6" w:space="0" w:color="000000"/>
+              <w:left w:val="single" w:sz="6" w:space="0" w:color="000000"/>
+              <w:bottom w:val="single" w:sz="6" w:space="0" w:color="000000"/>
+              <w:right w:val="single" w:sz="6" w:space="0" w:color="000000"/>
+            </w:tcBorders>
+            <w:tcMar>
+              <w:top w:w="0" w:type="dxa"/>
+              <w:left w:w="30" w:type="dxa"/>
+              <w:bottom w:w="30" w:type="dxa"/>
+              <w:right w:w="30" w:type="dxa"/>
+            </w:tcMar>
+            <w:vAlign w:val="bottom"/>
+            <w:hideMark/>
+          </w:tcPr>
+          <w:p>
+            <w:pPr>
+              <w:jc w:val="both"/>
+              <w:rPr>
+                <w:sz w:val="20"/>
+                <w:szCs w:val="20"/>
+              </w:rPr>
+            </w:pPr>
+            <w:r>
+              <w:rPr>
+                <w:sz w:val="20"/>
+                <w:szCs w:val="20"/>
+              </w:rPr>
+              <w:t>Admin</w:t>
+            </w:r>
+          </w:p>
+        </w:tc>
+      </w:tr>
+      <w:tr>
+        <w:trPr>
+          <w:trHeight w:val="150"/>
+        </w:trPr>
+        <w:tc>
+          <w:tcPr>
+            <w:tcW w:w="2108" w:type="pct"/>
+            <w:tcBorders>
+              <w:top w:val="single" w:sz="6" w:space="0" w:color="000000"/>
+              <w:left w:val="single" w:sz="6" w:space="0" w:color="000000"/>
+              <w:bottom w:val="single" w:sz="6" w:space="0" w:color="000000"/>
+              <w:right w:val="single" w:sz="6" w:space="0" w:color="000000"/>
+            </w:tcBorders>
+            <w:shd w:val="clear" w:color="auto" w:fill="D4D4D4"/>
+            <w:tcMar>
+              <w:top w:w="0" w:type="dxa"/>
+              <w:left w:w="30" w:type="dxa"/>
+              <w:bottom w:w="30" w:type="dxa"/>
+              <w:right w:w="30" w:type="dxa"/>
+            </w:tcMar>
+            <w:vAlign w:val="bottom"/>
+            <w:hideMark/>
+          </w:tcPr>
+          <w:p>
+            <w:pPr>
+              <w:jc w:val="both"/>
+              <w:rPr>
+                <w:sz w:val="20"/>
+                <w:szCs w:val="20"/>
+              </w:rPr>
+            </w:pPr>
+            <w:r>
+              <w:rPr>
+                <w:b/>
+                <w:bCs/>
+                <w:sz w:val="20"/>
+                <w:szCs w:val="20"/>
+              </w:rPr>
+              <w:t>Activities</w:t>
+            </w:r>
+          </w:p>
+        </w:tc>
+        <w:tc>
+          <w:tcPr>
+            <w:tcW w:w="1452" w:type="pct"/>
+            <w:tcBorders>
+              <w:top w:val="single" w:sz="6" w:space="0" w:color="000000"/>
+              <w:left w:val="single" w:sz="6" w:space="0" w:color="000000"/>
+              <w:bottom w:val="single" w:sz="6" w:space="0" w:color="000000"/>
+              <w:right w:val="single" w:sz="6" w:space="0" w:color="000000"/>
+            </w:tcBorders>
+            <w:tcMar>
+              <w:top w:w="0" w:type="dxa"/>
+              <w:left w:w="30" w:type="dxa"/>
+              <w:bottom w:w="30" w:type="dxa"/>
+              <w:right w:w="30" w:type="dxa"/>
+            </w:tcMar>
+            <w:vAlign w:val="bottom"/>
+            <w:hideMark/>
+          </w:tcPr>
+          <w:p>
+            <w:pPr>
+              <w:jc w:val="both"/>
+              <w:rPr>
+                <w:sz w:val="20"/>
+                <w:szCs w:val="20"/>
+              </w:rPr>
+            </w:pPr>
+            <w:r>
+              <w:rPr>
+                <w:sz w:val="20"/>
+                <w:szCs w:val="20"/>
+              </w:rPr>
+              <w:t>-</w:t>
+            </w:r>
+          </w:p>
+        </w:tc>
+        <w:tc>
+          <w:tcPr>
+            <w:tcW w:w="1440" w:type="pct"/>
+            <w:tcBorders>
+              <w:top w:val="single" w:sz="6" w:space="0" w:color="000000"/>
+              <w:left w:val="single" w:sz="6" w:space="0" w:color="000000"/>
+              <w:bottom w:val="single" w:sz="6" w:space="0" w:color="000000"/>
+              <w:right w:val="single" w:sz="6" w:space="0" w:color="000000"/>
+            </w:tcBorders>
+            <w:tcMar>
+              <w:top w:w="0" w:type="dxa"/>
+              <w:left w:w="30" w:type="dxa"/>
+              <w:bottom w:w="30" w:type="dxa"/>
+              <w:right w:w="30" w:type="dxa"/>
+            </w:tcMar>
+            <w:vAlign w:val="bottom"/>
+            <w:hideMark/>
+          </w:tcPr>
+          <w:p>
+            <w:pPr>
+              <w:jc w:val="both"/>
+              <w:rPr>
+                <w:sz w:val="20"/>
+                <w:szCs w:val="20"/>
+              </w:rPr>
+            </w:pPr>
+            <w:r>
+              <w:rPr>
+                <w:sz w:val="20"/>
+                <w:szCs w:val="20"/>
+              </w:rPr>
+              <w:t>General</w:t>
+            </w:r>
+          </w:p>
+        </w:tc>
+      </w:tr>
+      <w:tr>
+        <w:trPr>
+          <w:trHeight w:val="150"/>
+        </w:trPr>
+        <w:tc>
+          <w:tcPr>
+            <w:tcW w:w="2108" w:type="pct"/>
+            <w:tcBorders>
+              <w:top w:val="single" w:sz="6" w:space="0" w:color="000000"/>
+              <w:left w:val="single" w:sz="6" w:space="0" w:color="000000"/>
+              <w:bottom w:val="single" w:sz="6" w:space="0" w:color="000000"/>
+              <w:right w:val="single" w:sz="6" w:space="0" w:color="000000"/>
+            </w:tcBorders>
+            <w:shd w:val="clear" w:color="auto" w:fill="D4D4D4"/>
+            <w:tcMar>
+              <w:top w:w="0" w:type="dxa"/>
+              <w:left w:w="30" w:type="dxa"/>
+              <w:bottom w:w="30" w:type="dxa"/>
+              <w:right w:w="30" w:type="dxa"/>
+            </w:tcMar>
+            <w:vAlign w:val="bottom"/>
+            <w:hideMark/>
+          </w:tcPr>
+          <w:p>
+            <w:pPr>
+              <w:jc w:val="both"/>
+              <w:rPr>
+                <w:sz w:val="20"/>
+                <w:szCs w:val="20"/>
+              </w:rPr>
+            </w:pPr>
+            <w:r>
+              <w:rPr>
+                <w:b/>
+                <w:bCs/>
+                <w:sz w:val="20"/>
+                <w:szCs w:val="20"/>
+              </w:rPr>
+              <w:t>Activity</w:t>
+            </w:r>
+          </w:p>
+        </w:tc>
+        <w:tc>
+          <w:tcPr>
+            <w:tcW w:w="1452" w:type="pct"/>
+            <w:tcBorders>
+              <w:top w:val="single" w:sz="6" w:space="0" w:color="000000"/>
+              <w:left w:val="single" w:sz="6" w:space="0" w:color="000000"/>
+              <w:bottom w:val="single" w:sz="6" w:space="0" w:color="000000"/>
+              <w:right w:val="single" w:sz="6" w:space="0" w:color="000000"/>
+            </w:tcBorders>
+            <w:tcMar>
+              <w:top w:w="0" w:type="dxa"/>
+              <w:left w:w="30" w:type="dxa"/>
+              <w:bottom w:w="30" w:type="dxa"/>
+              <w:right w:w="30" w:type="dxa"/>
+            </w:tcMar>
+            <w:vAlign w:val="bottom"/>
+            <w:hideMark/>
+          </w:tcPr>
+          <w:p>
+            <w:pPr>
+              <w:jc w:val="both"/>
+              <w:rPr>
+                <w:sz w:val="20"/>
+                <w:szCs w:val="20"/>
+              </w:rPr>
+            </w:pPr>
+            <w:r>
+              <w:rPr>
+                <w:sz w:val="20"/>
+                <w:szCs w:val="20"/>
+              </w:rPr>
+              <w:t>-</w:t>
+            </w:r>
+          </w:p>
+        </w:tc>
+        <w:tc>
+          <w:tcPr>
+            <w:tcW w:w="1440" w:type="pct"/>
+            <w:tcBorders>
+              <w:top w:val="single" w:sz="6" w:space="0" w:color="000000"/>
+              <w:left w:val="single" w:sz="6" w:space="0" w:color="000000"/>
+              <w:bottom w:val="single" w:sz="6" w:space="0" w:color="000000"/>
+              <w:right w:val="single" w:sz="6" w:space="0" w:color="000000"/>
+            </w:tcBorders>
+            <w:tcMar>
+              <w:top w:w="0" w:type="dxa"/>
+              <w:left w:w="30" w:type="dxa"/>
+              <w:bottom w:w="30" w:type="dxa"/>
+              <w:right w:w="30" w:type="dxa"/>
+            </w:tcMar>
+            <w:vAlign w:val="bottom"/>
+            <w:hideMark/>
+          </w:tcPr>
+          <w:p>
+            <w:pPr>
+              <w:jc w:val="both"/>
+              <w:rPr>
+                <w:sz w:val="20"/>
+                <w:szCs w:val="20"/>
+              </w:rPr>
+            </w:pPr>
+            <w:r>
+              <w:rPr>
+                <w:sz w:val="20"/>
+                <w:szCs w:val="20"/>
+              </w:rPr>
+              <w:t>General</w:t>
+            </w:r>
+          </w:p>
+        </w:tc>
+      </w:tr>
+      <w:tr>
+        <w:trPr>
+          <w:trHeight w:val="150"/>
+        </w:trPr>
+        <w:tc>
+          <w:tcPr>
+            <w:tcW w:w="2108" w:type="pct"/>
+            <w:tcBorders>
+              <w:top w:val="single" w:sz="6" w:space="0" w:color="000000"/>
+              <w:left w:val="single" w:sz="6" w:space="0" w:color="000000"/>
+              <w:bottom w:val="single" w:sz="6" w:space="0" w:color="000000"/>
+              <w:right w:val="single" w:sz="6" w:space="0" w:color="000000"/>
+            </w:tcBorders>
+            <w:shd w:val="clear" w:color="auto" w:fill="D4D4D4"/>
+            <w:tcMar>
+              <w:top w:w="0" w:type="dxa"/>
+              <w:left w:w="30" w:type="dxa"/>
+              <w:bottom w:w="30" w:type="dxa"/>
+              <w:right w:w="30" w:type="dxa"/>
+            </w:tcMar>
+            <w:vAlign w:val="bottom"/>
+            <w:hideMark/>
+          </w:tcPr>
+          <w:p>
+            <w:pPr>
+              <w:jc w:val="both"/>
+              <w:rPr>
+                <w:sz w:val="20"/>
+                <w:szCs w:val="20"/>
+              </w:rPr>
+            </w:pPr>
+            <w:r>
+              <w:rPr>
+                <w:b/>
+                <w:bCs/>
+                <w:sz w:val="20"/>
+                <w:szCs w:val="20"/>
+              </w:rPr>
+              <w:t>Account</w:t>
+            </w:r>
+          </w:p>
+        </w:tc>
+        <w:tc>
+          <w:tcPr>
+            <w:tcW w:w="1452" w:type="pct"/>
+            <w:tcBorders>
+              <w:top w:val="single" w:sz="6" w:space="0" w:color="000000"/>
+              <w:left w:val="single" w:sz="6" w:space="0" w:color="000000"/>
+              <w:bottom w:val="single" w:sz="6" w:space="0" w:color="000000"/>
+              <w:right w:val="single" w:sz="6" w:space="0" w:color="000000"/>
+            </w:tcBorders>
+            <w:tcMar>
+              <w:top w:w="0" w:type="dxa"/>
+              <w:left w:w="30" w:type="dxa"/>
+              <w:bottom w:w="30" w:type="dxa"/>
+              <w:right w:w="30" w:type="dxa"/>
+            </w:tcMar>
+            <w:vAlign w:val="bottom"/>
+            <w:hideMark/>
+          </w:tcPr>
+          <w:p>
+            <w:pPr>
+              <w:jc w:val="both"/>
+              <w:rPr>
+                <w:sz w:val="20"/>
+                <w:szCs w:val="20"/>
+              </w:rPr>
+            </w:pPr>
+            <w:r>
+              <w:rPr>
+                <w:sz w:val="20"/>
+                <w:szCs w:val="20"/>
+              </w:rPr>
+              <w:t>-</w:t>
+            </w:r>
+          </w:p>
+        </w:tc>
+        <w:tc>
+          <w:tcPr>
+            <w:tcW w:w="1440" w:type="pct"/>
+            <w:tcBorders>
+              <w:top w:val="single" w:sz="6" w:space="0" w:color="000000"/>
+              <w:left w:val="single" w:sz="6" w:space="0" w:color="000000"/>
+              <w:bottom w:val="single" w:sz="6" w:space="0" w:color="000000"/>
+              <w:right w:val="single" w:sz="6" w:space="0" w:color="000000"/>
+            </w:tcBorders>
+            <w:tcMar>
+              <w:top w:w="0" w:type="dxa"/>
+              <w:left w:w="30" w:type="dxa"/>
+              <w:bottom w:w="30" w:type="dxa"/>
+              <w:right w:w="30" w:type="dxa"/>
+            </w:tcMar>
+            <w:vAlign w:val="bottom"/>
+            <w:hideMark/>
+          </w:tcPr>
+          <w:p>
+            <w:pPr>
+              <w:jc w:val="both"/>
+              <w:rPr>
+                <w:sz w:val="20"/>
+                <w:szCs w:val="20"/>
+              </w:rPr>
+            </w:pPr>
+            <w:r>
+              <w:rPr>
+                <w:sz w:val="20"/>
+                <w:szCs w:val="20"/>
+              </w:rPr>
+              <w:t>General</w:t>
+            </w:r>
+          </w:p>
+        </w:tc>
+      </w:tr>
+      <w:tr>
+        <w:trPr>
+          <w:trHeight w:val="150"/>
+        </w:trPr>
+        <w:tc>
+          <w:tcPr>
+            <w:tcW w:w="2108" w:type="pct"/>
+            <w:tcBorders>
+              <w:top w:val="single" w:sz="6" w:space="0" w:color="000000"/>
+              <w:left w:val="single" w:sz="6" w:space="0" w:color="000000"/>
+              <w:bottom w:val="single" w:sz="6" w:space="0" w:color="000000"/>
+              <w:right w:val="single" w:sz="6" w:space="0" w:color="000000"/>
+            </w:tcBorders>
+            <w:shd w:val="clear" w:color="auto" w:fill="D4D4D4"/>
+            <w:tcMar>
+              <w:top w:w="0" w:type="dxa"/>
+              <w:left w:w="30" w:type="dxa"/>
+              <w:bottom w:w="30" w:type="dxa"/>
+              <w:right w:w="30" w:type="dxa"/>
+            </w:tcMar>
+            <w:vAlign w:val="bottom"/>
+            <w:hideMark/>
+          </w:tcPr>
+          <w:p>
+            <w:pPr>
+              <w:jc w:val="both"/>
+              <w:rPr>
+                <w:sz w:val="20"/>
+                <w:szCs w:val="20"/>
+              </w:rPr>
+            </w:pPr>
+            <w:r>
+              <w:rPr>
+                <w:b/>
+                <w:bCs/>
+                <w:sz w:val="20"/>
+                <w:szCs w:val="20"/>
+              </w:rPr>
+              <w:t>Desktop</w:t>
+            </w:r>
+          </w:p>
+        </w:tc>
+        <w:tc>
+          <w:tcPr>
+            <w:tcW w:w="1452" w:type="pct"/>
+            <w:tcBorders>
+              <w:top w:val="single" w:sz="6" w:space="0" w:color="000000"/>
+              <w:left w:val="single" w:sz="6" w:space="0" w:color="000000"/>
+              <w:bottom w:val="single" w:sz="6" w:space="0" w:color="000000"/>
+              <w:right w:val="single" w:sz="6" w:space="0" w:color="000000"/>
+            </w:tcBorders>
+            <w:tcMar>
+              <w:top w:w="0" w:type="dxa"/>
+              <w:left w:w="30" w:type="dxa"/>
+              <w:bottom w:w="30" w:type="dxa"/>
+              <w:right w:w="30" w:type="dxa"/>
+            </w:tcMar>
+            <w:vAlign w:val="bottom"/>
+            <w:hideMark/>
+          </w:tcPr>
+          <w:p>
+            <w:pPr>
+              <w:jc w:val="both"/>
+              <w:rPr>
+                <w:sz w:val="20"/>
+                <w:szCs w:val="20"/>
+              </w:rPr>
+            </w:pPr>
+            <w:r>
+              <w:rPr>
+                <w:sz w:val="20"/>
+                <w:szCs w:val="20"/>
+              </w:rPr>
+              <w:t>-</w:t>
+            </w:r>
+          </w:p>
+        </w:tc>
+        <w:tc>
+          <w:tcPr>
+            <w:tcW w:w="1440" w:type="pct"/>
+            <w:tcBorders>
+              <w:top w:val="single" w:sz="6" w:space="0" w:color="000000"/>
+              <w:left w:val="single" w:sz="6" w:space="0" w:color="000000"/>
+              <w:bottom w:val="single" w:sz="6" w:space="0" w:color="000000"/>
+              <w:right w:val="single" w:sz="6" w:space="0" w:color="000000"/>
+            </w:tcBorders>
+            <w:tcMar>
+              <w:top w:w="0" w:type="dxa"/>
+              <w:left w:w="30" w:type="dxa"/>
+              <w:bottom w:w="30" w:type="dxa"/>
+              <w:right w:w="30" w:type="dxa"/>
+            </w:tcMar>
+            <w:vAlign w:val="bottom"/>
+            <w:hideMark/>
+          </w:tcPr>
+          <w:p>
+            <w:pPr>
+              <w:jc w:val="both"/>
+              <w:rPr>
+                <w:sz w:val="20"/>
+                <w:szCs w:val="20"/>
+              </w:rPr>
+            </w:pPr>
+            <w:r>
+              <w:rPr>
+                <w:sz w:val="20"/>
+                <w:szCs w:val="20"/>
+              </w:rPr>
+              <w:t>General</w:t>
+            </w:r>
+          </w:p>
+        </w:tc>
+      </w:tr>
+      <w:tr>
+        <w:trPr>
+          <w:trHeight w:val="150"/>
+        </w:trPr>
+        <w:tc>
+          <w:tcPr>
+            <w:tcW w:w="2108" w:type="pct"/>
+            <w:tcBorders>
+              <w:top w:val="single" w:sz="6" w:space="0" w:color="000000"/>
+              <w:left w:val="single" w:sz="6" w:space="0" w:color="000000"/>
+              <w:bottom w:val="single" w:sz="6" w:space="0" w:color="000000"/>
+              <w:right w:val="single" w:sz="6" w:space="0" w:color="000000"/>
+            </w:tcBorders>
+            <w:shd w:val="clear" w:color="auto" w:fill="D4D4D4"/>
+            <w:tcMar>
+              <w:top w:w="0" w:type="dxa"/>
+              <w:left w:w="30" w:type="dxa"/>
+              <w:bottom w:w="30" w:type="dxa"/>
+              <w:right w:w="30" w:type="dxa"/>
+            </w:tcMar>
+            <w:vAlign w:val="bottom"/>
+            <w:hideMark/>
+          </w:tcPr>
+          <w:p>
+            <w:pPr>
+              <w:jc w:val="both"/>
+              <w:rPr>
+                <w:sz w:val="20"/>
+                <w:szCs w:val="20"/>
+              </w:rPr>
+            </w:pPr>
+            <w:r>
+              <w:rPr>
+                <w:b/>
+                <w:bCs/>
+                <w:sz w:val="20"/>
+                <w:szCs w:val="20"/>
+              </w:rPr>
+              <w:t>Login</w:t>
+            </w:r>
+          </w:p>
+        </w:tc>
+        <w:tc>
+          <w:tcPr>
+            <w:tcW w:w="1452" w:type="pct"/>
+            <w:tcBorders>
+              <w:top w:val="single" w:sz="6" w:space="0" w:color="000000"/>
+              <w:left w:val="single" w:sz="6" w:space="0" w:color="000000"/>
+              <w:bottom w:val="single" w:sz="6" w:space="0" w:color="000000"/>
+              <w:right w:val="single" w:sz="6" w:space="0" w:color="000000"/>
+            </w:tcBorders>
+            <w:tcMar>
+              <w:top w:w="0" w:type="dxa"/>
+              <w:left w:w="30" w:type="dxa"/>
+              <w:bottom w:w="30" w:type="dxa"/>
+              <w:right w:w="30" w:type="dxa"/>
+            </w:tcMar>
+            <w:vAlign w:val="bottom"/>
+            <w:hideMark/>
+          </w:tcPr>
+          <w:p>
+            <w:pPr>
+              <w:jc w:val="both"/>
+              <w:rPr>
+                <w:sz w:val="20"/>
+                <w:szCs w:val="20"/>
+              </w:rPr>
+            </w:pPr>
+            <w:r>
+              <w:rPr>
+                <w:sz w:val="20"/>
+                <w:szCs w:val="20"/>
+              </w:rPr>
+              <w:t>-</w:t>
+            </w:r>
+          </w:p>
+        </w:tc>
+        <w:tc>
+          <w:tcPr>
+            <w:tcW w:w="1440" w:type="pct"/>
+            <w:tcBorders>
+              <w:top w:val="single" w:sz="6" w:space="0" w:color="000000"/>
+              <w:left w:val="single" w:sz="6" w:space="0" w:color="000000"/>
+              <w:bottom w:val="single" w:sz="6" w:space="0" w:color="000000"/>
+              <w:right w:val="single" w:sz="6" w:space="0" w:color="000000"/>
+            </w:tcBorders>
+            <w:tcMar>
+              <w:top w:w="0" w:type="dxa"/>
+              <w:left w:w="30" w:type="dxa"/>
+              <w:bottom w:w="30" w:type="dxa"/>
+              <w:right w:w="30" w:type="dxa"/>
+            </w:tcMar>
+            <w:vAlign w:val="bottom"/>
+            <w:hideMark/>
+          </w:tcPr>
+          <w:p>
+            <w:pPr>
+              <w:jc w:val="both"/>
+              <w:rPr>
+                <w:sz w:val="20"/>
+                <w:szCs w:val="20"/>
+              </w:rPr>
+            </w:pPr>
+            <w:r>
+              <w:rPr>
+                <w:sz w:val="20"/>
+                <w:szCs w:val="20"/>
+              </w:rPr>
+              <w:t>General</w:t>
+            </w:r>
+          </w:p>
+        </w:tc>
+      </w:tr>
+      <w:tr>
+        <w:trPr>
+          <w:trHeight w:val="150"/>
+        </w:trPr>
+        <w:tc>
+          <w:tcPr>
+            <w:tcW w:w="2108" w:type="pct"/>
+            <w:tcBorders>
+              <w:top w:val="single" w:sz="6" w:space="0" w:color="000000"/>
+              <w:left w:val="single" w:sz="6" w:space="0" w:color="000000"/>
+              <w:bottom w:val="single" w:sz="6" w:space="0" w:color="000000"/>
+              <w:right w:val="single" w:sz="6" w:space="0" w:color="000000"/>
+            </w:tcBorders>
+            <w:shd w:val="clear" w:color="auto" w:fill="D4D4D4"/>
+            <w:tcMar>
+              <w:top w:w="0" w:type="dxa"/>
+              <w:left w:w="30" w:type="dxa"/>
+              <w:bottom w:w="30" w:type="dxa"/>
+              <w:right w:w="30" w:type="dxa"/>
+            </w:tcMar>
+            <w:vAlign w:val="bottom"/>
+            <w:hideMark/>
+          </w:tcPr>
+          <w:p>
+            <w:pPr>
+              <w:jc w:val="both"/>
+              <w:rPr>
+                <w:sz w:val="20"/>
+                <w:szCs w:val="20"/>
+              </w:rPr>
+            </w:pPr>
+            <w:r>
+              <w:rPr>
+                <w:b/>
+                <w:bCs/>
+                <w:sz w:val="20"/>
+                <w:szCs w:val="20"/>
+              </w:rPr>
+              <w:t>Participant</w:t>
+            </w:r>
+          </w:p>
+        </w:tc>
+        <w:tc>
+          <w:tcPr>
+            <w:tcW w:w="1452" w:type="pct"/>
+            <w:tcBorders>
+              <w:top w:val="single" w:sz="6" w:space="0" w:color="000000"/>
+              <w:left w:val="single" w:sz="6" w:space="0" w:color="000000"/>
+              <w:bottom w:val="single" w:sz="6" w:space="0" w:color="000000"/>
+              <w:right w:val="single" w:sz="6" w:space="0" w:color="000000"/>
+            </w:tcBorders>
+            <w:tcMar>
+              <w:top w:w="0" w:type="dxa"/>
+              <w:left w:w="30" w:type="dxa"/>
+              <w:bottom w:w="30" w:type="dxa"/>
+              <w:right w:w="30" w:type="dxa"/>
+            </w:tcMar>
+            <w:vAlign w:val="bottom"/>
+            <w:hideMark/>
+          </w:tcPr>
+          <w:p>
+            <w:pPr>
+              <w:jc w:val="both"/>
+              <w:rPr>
+                <w:sz w:val="20"/>
+                <w:szCs w:val="20"/>
+              </w:rPr>
+            </w:pPr>
+            <w:r>
+              <w:rPr>
+                <w:sz w:val="20"/>
+                <w:szCs w:val="20"/>
+              </w:rPr>
+              <w:t>-</w:t>
+            </w:r>
+          </w:p>
+        </w:tc>
+        <w:tc>
+          <w:tcPr>
+            <w:tcW w:w="1440" w:type="pct"/>
+            <w:tcBorders>
+              <w:top w:val="single" w:sz="6" w:space="0" w:color="000000"/>
+              <w:left w:val="single" w:sz="6" w:space="0" w:color="000000"/>
+              <w:bottom w:val="single" w:sz="6" w:space="0" w:color="000000"/>
+              <w:right w:val="single" w:sz="6" w:space="0" w:color="000000"/>
+            </w:tcBorders>
+            <w:tcMar>
+              <w:top w:w="0" w:type="dxa"/>
+              <w:left w:w="30" w:type="dxa"/>
+              <w:bottom w:w="30" w:type="dxa"/>
+              <w:right w:w="30" w:type="dxa"/>
+            </w:tcMar>
+            <w:vAlign w:val="bottom"/>
+            <w:hideMark/>
+          </w:tcPr>
+          <w:p>
+            <w:pPr>
+              <w:jc w:val="both"/>
+              <w:rPr>
+                <w:sz w:val="20"/>
+                <w:szCs w:val="20"/>
+              </w:rPr>
+            </w:pPr>
+            <w:r>
+              <w:rPr>
+                <w:sz w:val="20"/>
+                <w:szCs w:val="20"/>
+              </w:rPr>
+              <w:t>General</w:t>
+            </w:r>
+          </w:p>
+        </w:tc>
+      </w:tr>
+      <w:tr>
+        <w:trPr>
+          <w:trHeight w:val="135"/>
+        </w:trPr>
+        <w:tc>
+          <w:tcPr>
+            <w:tcW w:w="2108" w:type="pct"/>
+            <w:tcBorders>
+              <w:top w:val="single" w:sz="6" w:space="0" w:color="000000"/>
+              <w:left w:val="single" w:sz="6" w:space="0" w:color="000000"/>
+              <w:bottom w:val="single" w:sz="6" w:space="0" w:color="000000"/>
+              <w:right w:val="single" w:sz="6" w:space="0" w:color="000000"/>
+            </w:tcBorders>
+            <w:shd w:val="clear" w:color="auto" w:fill="D4D4D4"/>
+            <w:tcMar>
+              <w:top w:w="0" w:type="dxa"/>
+              <w:left w:w="30" w:type="dxa"/>
+              <w:bottom w:w="30" w:type="dxa"/>
+              <w:right w:w="30" w:type="dxa"/>
+            </w:tcMar>
+            <w:vAlign w:val="bottom"/>
+            <w:hideMark/>
+          </w:tcPr>
+          <w:p>
+            <w:pPr>
+              <w:jc w:val="both"/>
+              <w:rPr>
+                <w:sz w:val="20"/>
+                <w:szCs w:val="20"/>
+              </w:rPr>
+            </w:pPr>
+            <w:r>
+              <w:rPr>
+                <w:b/>
+                <w:bCs/>
+                <w:sz w:val="20"/>
+                <w:szCs w:val="20"/>
+              </w:rPr>
+              <w:t>Participants</w:t>
+            </w:r>
+          </w:p>
+        </w:tc>
+        <w:tc>
+          <w:tcPr>
+            <w:tcW w:w="1452" w:type="pct"/>
+            <w:tcBorders>
+              <w:top w:val="single" w:sz="6" w:space="0" w:color="000000"/>
+              <w:left w:val="single" w:sz="6" w:space="0" w:color="000000"/>
+              <w:bottom w:val="single" w:sz="6" w:space="0" w:color="000000"/>
+              <w:right w:val="single" w:sz="6" w:space="0" w:color="000000"/>
+            </w:tcBorders>
+            <w:tcMar>
+              <w:top w:w="0" w:type="dxa"/>
+              <w:left w:w="30" w:type="dxa"/>
+              <w:bottom w:w="30" w:type="dxa"/>
+              <w:right w:w="30" w:type="dxa"/>
+            </w:tcMar>
+            <w:vAlign w:val="bottom"/>
+            <w:hideMark/>
+          </w:tcPr>
+          <w:p>
+            <w:pPr>
+              <w:jc w:val="both"/>
+              <w:rPr>
+                <w:sz w:val="20"/>
+                <w:szCs w:val="20"/>
+              </w:rPr>
+            </w:pPr>
+            <w:r>
+              <w:rPr>
+                <w:sz w:val="20"/>
+                <w:szCs w:val="20"/>
+              </w:rPr>
+              <w:t>-</w:t>
+            </w:r>
+          </w:p>
+        </w:tc>
+        <w:tc>
+          <w:tcPr>
+            <w:tcW w:w="1440" w:type="pct"/>
+            <w:tcBorders>
+              <w:top w:val="single" w:sz="6" w:space="0" w:color="000000"/>
+              <w:left w:val="single" w:sz="6" w:space="0" w:color="000000"/>
+              <w:bottom w:val="single" w:sz="6" w:space="0" w:color="000000"/>
+              <w:right w:val="single" w:sz="6" w:space="0" w:color="000000"/>
+            </w:tcBorders>
+            <w:tcMar>
+              <w:top w:w="0" w:type="dxa"/>
+              <w:left w:w="30" w:type="dxa"/>
+              <w:bottom w:w="30" w:type="dxa"/>
+              <w:right w:w="30" w:type="dxa"/>
+            </w:tcMar>
+            <w:vAlign w:val="bottom"/>
+            <w:hideMark/>
+          </w:tcPr>
+          <w:p>
+            <w:pPr>
+              <w:jc w:val="both"/>
+              <w:rPr>
+                <w:sz w:val="20"/>
+                <w:szCs w:val="20"/>
+              </w:rPr>
+            </w:pPr>
+            <w:r>
+              <w:rPr>
+                <w:sz w:val="20"/>
+                <w:szCs w:val="20"/>
+              </w:rPr>
+              <w:t>General</w:t>
+            </w:r>
+          </w:p>
+        </w:tc>
+      </w:tr>
+      <w:tr>
+        <w:trPr>
+          <w:trHeight w:val="150"/>
+        </w:trPr>
+        <w:tc>
+          <w:tcPr>
+            <w:tcW w:w="2108" w:type="pct"/>
+            <w:tcBorders>
+              <w:top w:val="single" w:sz="6" w:space="0" w:color="000000"/>
+              <w:left w:val="single" w:sz="6" w:space="0" w:color="000000"/>
+              <w:bottom w:val="single" w:sz="6" w:space="0" w:color="000000"/>
+              <w:right w:val="single" w:sz="6" w:space="0" w:color="000000"/>
+            </w:tcBorders>
+            <w:shd w:val="clear" w:color="auto" w:fill="D4D4D4"/>
+            <w:tcMar>
+              <w:top w:w="0" w:type="dxa"/>
+              <w:left w:w="30" w:type="dxa"/>
+              <w:bottom w:w="30" w:type="dxa"/>
+              <w:right w:w="30" w:type="dxa"/>
+            </w:tcMar>
+            <w:vAlign w:val="bottom"/>
+            <w:hideMark/>
+          </w:tcPr>
+          <w:p>
+            <w:pPr>
+              <w:jc w:val="both"/>
+              <w:rPr>
+                <w:sz w:val="20"/>
+                <w:szCs w:val="20"/>
+              </w:rPr>
+            </w:pPr>
+            <w:r>
+              <w:rPr>
+                <w:b/>
+                <w:bCs/>
+                <w:sz w:val="20"/>
+                <w:szCs w:val="20"/>
+              </w:rPr>
+              <w:t>Signup</w:t>
+            </w:r>
+          </w:p>
+        </w:tc>
+        <w:tc>
+          <w:tcPr>
+            <w:tcW w:w="1452" w:type="pct"/>
+            <w:tcBorders>
+              <w:top w:val="single" w:sz="6" w:space="0" w:color="000000"/>
+              <w:left w:val="single" w:sz="6" w:space="0" w:color="000000"/>
+              <w:bottom w:val="single" w:sz="6" w:space="0" w:color="000000"/>
+              <w:right w:val="single" w:sz="6" w:space="0" w:color="000000"/>
+            </w:tcBorders>
+            <w:tcMar>
+              <w:top w:w="0" w:type="dxa"/>
+              <w:left w:w="30" w:type="dxa"/>
+              <w:bottom w:w="30" w:type="dxa"/>
+              <w:right w:w="30" w:type="dxa"/>
+            </w:tcMar>
+            <w:vAlign w:val="bottom"/>
+            <w:hideMark/>
+          </w:tcPr>
+          <w:p>
+            <w:pPr>
+              <w:jc w:val="both"/>
+              <w:rPr>
+                <w:sz w:val="20"/>
+                <w:szCs w:val="20"/>
+              </w:rPr>
+            </w:pPr>
+            <w:r>
+              <w:rPr>
+                <w:sz w:val="20"/>
+                <w:szCs w:val="20"/>
+              </w:rPr>
+              <w:t>-</w:t>
+            </w:r>
+          </w:p>
+        </w:tc>
+        <w:tc>
+          <w:tcPr>
+            <w:tcW w:w="1440" w:type="pct"/>
+            <w:tcBorders>
+              <w:top w:val="single" w:sz="6" w:space="0" w:color="000000"/>
+              <w:left w:val="single" w:sz="6" w:space="0" w:color="000000"/>
+              <w:bottom w:val="single" w:sz="6" w:space="0" w:color="000000"/>
+              <w:right w:val="single" w:sz="6" w:space="0" w:color="000000"/>
+            </w:tcBorders>
+            <w:tcMar>
+              <w:top w:w="0" w:type="dxa"/>
+              <w:left w:w="30" w:type="dxa"/>
+              <w:bottom w:w="30" w:type="dxa"/>
+              <w:right w:w="30" w:type="dxa"/>
+            </w:tcMar>
+            <w:vAlign w:val="bottom"/>
+            <w:hideMark/>
+          </w:tcPr>
+          <w:p>
+            <w:pPr>
+              <w:jc w:val="both"/>
+              <w:rPr>
+                <w:sz w:val="20"/>
+                <w:szCs w:val="20"/>
+              </w:rPr>
+            </w:pPr>
+            <w:r>
+              <w:rPr>
+                <w:sz w:val="20"/>
+                <w:szCs w:val="20"/>
+              </w:rPr>
+              <w:t>General</w:t>
+            </w:r>
+          </w:p>
+        </w:tc>
+      </w:tr>
+    </w:tbl>
+    <w:p>
+      <w:pPr>
+        <w:jc w:val="both"/>
+        <w:rPr>
+          <w:lang w:val="es-ES"/>
+        </w:rPr>
+      </w:pPr>
+    </w:p>
+    <w:p>
+      <w:pPr>
+        <w:jc w:val="both"/>
+        <w:rPr>
+          <w:lang w:val="es-ES"/>
+        </w:rPr>
+      </w:pPr>
+    </w:p>
+    <w:p>
+      <w:pPr>
+        <w:jc w:val="both"/>
+        <w:rPr>
+          <w:lang w:val="es-ES"/>
+        </w:rPr>
+      </w:pPr>
+    </w:p>
+    <w:p>
+      <w:pPr>
+        <w:jc w:val="both"/>
+        <w:rPr>
+          <w:lang w:val="es-ES"/>
+        </w:rPr>
+      </w:pPr>
+    </w:p>
+    <w:p>
+      <w:pPr>
+        <w:jc w:val="both"/>
+        <w:rPr>
+          <w:lang w:val="es-ES"/>
+        </w:rPr>
+      </w:pPr>
+    </w:p>
+    <w:p>
+      <w:pPr>
+        <w:jc w:val="both"/>
+        <w:rPr>
+          <w:lang w:val="es-ES"/>
+        </w:rPr>
+      </w:pPr>
+    </w:p>
+    <w:p>
+      <w:pPr>
+        <w:jc w:val="both"/>
+        <w:rPr>
+          <w:lang w:val="es-ES"/>
+        </w:rPr>
+      </w:pPr>
+    </w:p>
+    <w:p>
+      <w:pPr>
+        <w:jc w:val="both"/>
+        <w:rPr>
+          <w:lang w:val="es-ES"/>
+        </w:rPr>
+      </w:pPr>
+    </w:p>
+    <w:p>
+      <w:pPr>
+        <w:jc w:val="both"/>
+        <w:rPr>
+          <w:lang w:val="es-ES"/>
+        </w:rPr>
+      </w:pPr>
+    </w:p>
+    <w:p>
+      <w:pPr>
+        <w:jc w:val="both"/>
+        <w:rPr>
+          <w:lang w:val="es-ES"/>
+        </w:rPr>
+      </w:pPr>
+    </w:p>
+    <w:p>
+      <w:pPr>
+        <w:jc w:val="both"/>
+        <w:rPr>
+          <w:lang w:val="es-ES"/>
+        </w:rPr>
+      </w:pPr>
+    </w:p>
+    <w:p>
+      <w:pPr>
+        <w:jc w:val="both"/>
+        <w:rPr>
+          <w:lang w:val="es-ES"/>
+        </w:rPr>
+      </w:pPr>
+    </w:p>
+    <w:p>
+      <w:pPr>
+        <w:jc w:val="both"/>
+        <w:rPr>
+          <w:lang w:val="es-ES"/>
+        </w:rPr>
+      </w:pPr>
+    </w:p>
+    <w:p>
+      <w:pPr>
+        <w:jc w:val="both"/>
+        <w:rPr>
+          <w:lang w:val="es-ES"/>
+        </w:rPr>
+      </w:pPr>
+    </w:p>
+    <w:p>
+      <w:pPr>
         <w:pStyle w:val="Heading1"/>
-        <w:tabs>
-          <w:tab w:val="left" w:pos="4876"/>
-        </w:tabs>
         <w:spacing w:line="360" w:lineRule="auto"/>
         <w:jc w:val="both"/>
         <w:rPr>
@@ -20094,116 +22037,39 @@
           <w:lang w:val="es-ES"/>
         </w:rPr>
       </w:pPr>
-    </w:p>
-    <w:p>
-      <w:pPr>
-        <w:rPr>
-          <w:lang w:val="es-ES"/>
-        </w:rPr>
-      </w:pPr>
-    </w:p>
-    <w:p>
-      <w:pPr>
-        <w:rPr>
-          <w:lang w:val="es-ES"/>
-        </w:rPr>
-      </w:pPr>
-    </w:p>
-    <w:p>
-      <w:pPr>
-        <w:rPr>
-          <w:lang w:val="es-ES"/>
-        </w:rPr>
-      </w:pPr>
-    </w:p>
-    <w:p>
-      <w:pPr>
-        <w:rPr>
-          <w:lang w:val="es-ES"/>
-        </w:rPr>
-      </w:pPr>
-    </w:p>
-    <w:p>
-      <w:pPr>
-        <w:rPr>
-          <w:lang w:val="es-ES"/>
-        </w:rPr>
-      </w:pPr>
-    </w:p>
-    <w:p>
-      <w:pPr>
-        <w:rPr>
-          <w:lang w:val="es-ES"/>
-        </w:rPr>
-      </w:pPr>
-    </w:p>
-    <w:p>
-      <w:pPr>
-        <w:rPr>
-          <w:lang w:val="es-ES"/>
-        </w:rPr>
-      </w:pPr>
-    </w:p>
-    <w:p>
-      <w:pPr>
-        <w:rPr>
-          <w:lang w:val="es-ES"/>
-        </w:rPr>
-      </w:pPr>
-    </w:p>
-    <w:p>
-      <w:pPr>
-        <w:rPr>
-          <w:lang w:val="es-ES"/>
-        </w:rPr>
-      </w:pPr>
-    </w:p>
-    <w:p>
-      <w:pPr>
-        <w:rPr>
-          <w:lang w:val="es-ES"/>
-        </w:rPr>
-      </w:pPr>
-    </w:p>
-    <w:p>
-      <w:pPr>
-        <w:rPr>
-          <w:lang w:val="es-ES"/>
-        </w:rPr>
-      </w:pPr>
-    </w:p>
-    <w:p>
-      <w:pPr>
-        <w:rPr>
-          <w:lang w:val="es-ES"/>
-        </w:rPr>
-      </w:pPr>
-    </w:p>
-    <w:p>
-      <w:pPr>
-        <w:rPr>
-          <w:lang w:val="es-ES"/>
-        </w:rPr>
-      </w:pPr>
-    </w:p>
-    <w:p>
-      <w:pPr>
-        <w:pStyle w:val="Heading1"/>
-        <w:spacing w:line="360" w:lineRule="auto"/>
-        <w:jc w:val="both"/>
-        <w:rPr>
-          <w:rFonts w:ascii="Times New Roman" w:hAnsi="Times New Roman" w:cs="Times New Roman"/>
-          <w:b/>
-          <w:bCs/>
-          <w:sz w:val="32"/>
-          <w:szCs w:val="32"/>
-          <w:lang w:val="es-ES"/>
-        </w:rPr>
-      </w:pPr>
       <w:bookmarkStart w:id="14" w:name="_Toc189846486"/>
     </w:p>
     <w:p>
       <w:pPr>
+        <w:rPr>
+          <w:lang w:val="es-ES"/>
+        </w:rPr>
+      </w:pPr>
+    </w:p>
+    <w:p>
+      <w:pPr>
+        <w:rPr>
+          <w:lang w:val="es-ES"/>
+        </w:rPr>
+      </w:pPr>
+    </w:p>
+    <w:p>
+      <w:pPr>
+        <w:rPr>
+          <w:lang w:val="es-ES"/>
+        </w:rPr>
+      </w:pPr>
+    </w:p>
+    <w:p>
+      <w:pPr>
+        <w:rPr>
+          <w:lang w:val="es-ES"/>
+        </w:rPr>
+      </w:pPr>
+    </w:p>
+    <w:p>
+      <w:pPr>
+        <w:jc w:val="both"/>
         <w:rPr>
           <w:lang w:val="es-ES"/>
         </w:rPr>
@@ -20969,226 +22835,6 @@
     </w:p>
     <w:p>
       <w:pPr>
-        <w:spacing w:line="360" w:lineRule="auto"/>
-        <w:jc w:val="both"/>
-        <w:rPr>
-          <w:rFonts w:ascii="Times New Roman" w:hAnsi="Times New Roman" w:cs="Times New Roman"/>
-          <w:lang w:val="es-ES"/>
-        </w:rPr>
-      </w:pPr>
-    </w:p>
-    <w:p>
-      <w:pPr>
-        <w:spacing w:line="360" w:lineRule="auto"/>
-        <w:jc w:val="both"/>
-        <w:rPr>
-          <w:rFonts w:ascii="Times New Roman" w:hAnsi="Times New Roman" w:cs="Times New Roman"/>
-          <w:lang w:val="es-ES"/>
-        </w:rPr>
-      </w:pPr>
-    </w:p>
-    <w:p>
-      <w:pPr>
-        <w:spacing w:line="360" w:lineRule="auto"/>
-        <w:jc w:val="both"/>
-        <w:rPr>
-          <w:rFonts w:ascii="Times New Roman" w:hAnsi="Times New Roman" w:cs="Times New Roman"/>
-          <w:lang w:val="es-ES"/>
-        </w:rPr>
-      </w:pPr>
-    </w:p>
-    <w:p>
-      <w:pPr>
-        <w:spacing w:line="360" w:lineRule="auto"/>
-        <w:jc w:val="both"/>
-        <w:rPr>
-          <w:rFonts w:ascii="Times New Roman" w:hAnsi="Times New Roman" w:cs="Times New Roman"/>
-          <w:lang w:val="es-ES"/>
-        </w:rPr>
-      </w:pPr>
-    </w:p>
-    <w:p>
-      <w:pPr>
-        <w:spacing w:line="360" w:lineRule="auto"/>
-        <w:jc w:val="both"/>
-        <w:rPr>
-          <w:rFonts w:ascii="Times New Roman" w:hAnsi="Times New Roman" w:cs="Times New Roman"/>
-          <w:lang w:val="es-ES"/>
-        </w:rPr>
-      </w:pPr>
-    </w:p>
-    <w:p>
-      <w:pPr>
-        <w:spacing w:line="360" w:lineRule="auto"/>
-        <w:jc w:val="both"/>
-        <w:rPr>
-          <w:rFonts w:ascii="Times New Roman" w:hAnsi="Times New Roman" w:cs="Times New Roman"/>
-          <w:lang w:val="es-ES"/>
-        </w:rPr>
-      </w:pPr>
-    </w:p>
-    <w:p>
-      <w:pPr>
-        <w:spacing w:line="360" w:lineRule="auto"/>
-        <w:jc w:val="both"/>
-        <w:rPr>
-          <w:rFonts w:ascii="Times New Roman" w:hAnsi="Times New Roman" w:cs="Times New Roman"/>
-          <w:lang w:val="es-ES"/>
-        </w:rPr>
-      </w:pPr>
-    </w:p>
-    <w:p>
-      <w:pPr>
-        <w:spacing w:line="360" w:lineRule="auto"/>
-        <w:jc w:val="both"/>
-        <w:rPr>
-          <w:rFonts w:ascii="Times New Roman" w:hAnsi="Times New Roman" w:cs="Times New Roman"/>
-          <w:lang w:val="es-ES"/>
-        </w:rPr>
-      </w:pPr>
-    </w:p>
-    <w:p>
-      <w:pPr>
-        <w:spacing w:line="360" w:lineRule="auto"/>
-        <w:jc w:val="both"/>
-        <w:rPr>
-          <w:rFonts w:ascii="Times New Roman" w:hAnsi="Times New Roman" w:cs="Times New Roman"/>
-          <w:lang w:val="es-ES"/>
-        </w:rPr>
-      </w:pPr>
-    </w:p>
-    <w:p>
-      <w:pPr>
-        <w:spacing w:line="360" w:lineRule="auto"/>
-        <w:jc w:val="both"/>
-        <w:rPr>
-          <w:rFonts w:ascii="Times New Roman" w:hAnsi="Times New Roman" w:cs="Times New Roman"/>
-          <w:lang w:val="es-ES"/>
-        </w:rPr>
-      </w:pPr>
-    </w:p>
-    <w:p>
-      <w:pPr>
-        <w:spacing w:line="360" w:lineRule="auto"/>
-        <w:jc w:val="both"/>
-        <w:rPr>
-          <w:rFonts w:ascii="Times New Roman" w:hAnsi="Times New Roman" w:cs="Times New Roman"/>
-          <w:lang w:val="es-ES"/>
-        </w:rPr>
-      </w:pPr>
-    </w:p>
-    <w:p>
-      <w:pPr>
-        <w:spacing w:line="360" w:lineRule="auto"/>
-        <w:jc w:val="both"/>
-        <w:rPr>
-          <w:rFonts w:ascii="Times New Roman" w:hAnsi="Times New Roman" w:cs="Times New Roman"/>
-          <w:lang w:val="es-ES"/>
-        </w:rPr>
-      </w:pPr>
-    </w:p>
-    <w:p>
-      <w:pPr>
-        <w:spacing w:line="360" w:lineRule="auto"/>
-        <w:jc w:val="both"/>
-        <w:rPr>
-          <w:rFonts w:ascii="Times New Roman" w:hAnsi="Times New Roman" w:cs="Times New Roman"/>
-          <w:lang w:val="es-ES"/>
-        </w:rPr>
-      </w:pPr>
-    </w:p>
-    <w:p>
-      <w:pPr>
-        <w:spacing w:line="360" w:lineRule="auto"/>
-        <w:jc w:val="both"/>
-        <w:rPr>
-          <w:rFonts w:ascii="Times New Roman" w:hAnsi="Times New Roman" w:cs="Times New Roman"/>
-          <w:lang w:val="es-ES"/>
-        </w:rPr>
-      </w:pPr>
-    </w:p>
-    <w:p>
-      <w:pPr>
-        <w:spacing w:line="360" w:lineRule="auto"/>
-        <w:jc w:val="both"/>
-        <w:rPr>
-          <w:rFonts w:ascii="Times New Roman" w:hAnsi="Times New Roman" w:cs="Times New Roman"/>
-          <w:lang w:val="es-ES"/>
-        </w:rPr>
-      </w:pPr>
-    </w:p>
-    <w:p>
-      <w:pPr>
-        <w:spacing w:line="360" w:lineRule="auto"/>
-        <w:jc w:val="both"/>
-        <w:rPr>
-          <w:rFonts w:ascii="Times New Roman" w:hAnsi="Times New Roman" w:cs="Times New Roman"/>
-          <w:lang w:val="es-ES"/>
-        </w:rPr>
-      </w:pPr>
-    </w:p>
-    <w:p>
-      <w:pPr>
-        <w:spacing w:line="360" w:lineRule="auto"/>
-        <w:jc w:val="both"/>
-        <w:rPr>
-          <w:rFonts w:ascii="Times New Roman" w:hAnsi="Times New Roman" w:cs="Times New Roman"/>
-          <w:lang w:val="es-ES"/>
-        </w:rPr>
-      </w:pPr>
-    </w:p>
-    <w:p>
-      <w:pPr>
-        <w:spacing w:line="360" w:lineRule="auto"/>
-        <w:jc w:val="both"/>
-        <w:rPr>
-          <w:rFonts w:ascii="Times New Roman" w:hAnsi="Times New Roman" w:cs="Times New Roman"/>
-          <w:lang w:val="es-ES"/>
-        </w:rPr>
-      </w:pPr>
-    </w:p>
-    <w:p>
-      <w:pPr>
-        <w:spacing w:line="360" w:lineRule="auto"/>
-        <w:jc w:val="both"/>
-        <w:rPr>
-          <w:rFonts w:ascii="Times New Roman" w:hAnsi="Times New Roman" w:cs="Times New Roman"/>
-          <w:lang w:val="es-ES"/>
-        </w:rPr>
-      </w:pPr>
-    </w:p>
-    <w:p>
-      <w:pPr>
-        <w:spacing w:line="360" w:lineRule="auto"/>
-        <w:jc w:val="both"/>
-        <w:rPr>
-          <w:rFonts w:ascii="Times New Roman" w:hAnsi="Times New Roman" w:cs="Times New Roman"/>
-          <w:lang w:val="es-ES"/>
-        </w:rPr>
-      </w:pPr>
-    </w:p>
-    <w:p>
-      <w:pPr>
-        <w:spacing w:line="360" w:lineRule="auto"/>
-        <w:jc w:val="both"/>
-        <w:rPr>
-          <w:rFonts w:ascii="Times New Roman" w:hAnsi="Times New Roman" w:cs="Times New Roman"/>
-          <w:lang w:val="es-ES"/>
-        </w:rPr>
-      </w:pPr>
-    </w:p>
-    <w:p>
-      <w:pPr>
-        <w:spacing w:line="360" w:lineRule="auto"/>
-        <w:jc w:val="both"/>
-        <w:rPr>
-          <w:rFonts w:ascii="Times New Roman" w:hAnsi="Times New Roman" w:cs="Times New Roman"/>
-          <w:lang w:val="es-ES"/>
-        </w:rPr>
-      </w:pPr>
-    </w:p>
-    <w:p>
-      <w:pPr>
         <w:pStyle w:val="Heading1"/>
         <w:spacing w:line="360" w:lineRule="auto"/>
         <w:jc w:val="both"/>
@@ -21201,7 +22847,6 @@
           <w:lang w:val="es-ES"/>
         </w:rPr>
       </w:pPr>
-      <w:bookmarkStart w:id="17" w:name="_Toc189846489"/>
       <w:r>
         <w:rPr>
           <w:rFonts w:ascii="Times New Roman" w:hAnsi="Times New Roman" w:cs="Times New Roman"/>
@@ -21211,9 +22856,1615 @@
           <w:szCs w:val="32"/>
           <w:lang w:val="es-ES"/>
         </w:rPr>
-        <w:t>A</w:t>
-      </w:r>
-      <w:r>
+        <w:lastRenderedPageBreak/>
+        <w:t>Conclusiones</w:t>
+      </w:r>
+    </w:p>
+    <w:p>
+      <w:pPr>
+        <w:spacing w:line="360" w:lineRule="auto"/>
+        <w:jc w:val="both"/>
+        <w:rPr>
+          <w:rFonts w:ascii="Times New Roman" w:hAnsi="Times New Roman" w:cs="Times New Roman"/>
+          <w:lang w:val="es-ES"/>
+        </w:rPr>
+      </w:pPr>
+      <w:r>
+        <w:rPr>
+          <w:rFonts w:ascii="Times New Roman" w:hAnsi="Times New Roman" w:cs="Times New Roman"/>
+          <w:lang w:val="es-ES"/>
+        </w:rPr>
+        <w:t xml:space="preserve">El desarrollo de este proyecto ha permitido la creación de una plataforma integral para la gestión de un campamento infantil, optimizando los </w:t>
+      </w:r>
+      <w:r>
+        <w:rPr>
+          <w:rFonts w:ascii="Times New Roman" w:hAnsi="Times New Roman" w:cs="Times New Roman"/>
+          <w:lang w:val="es-ES"/>
+        </w:rPr>
+        <w:t>procesos</w:t>
+      </w:r>
+      <w:r>
+        <w:rPr>
+          <w:rFonts w:ascii="Times New Roman" w:hAnsi="Times New Roman" w:cs="Times New Roman"/>
+          <w:lang w:val="es-ES"/>
+        </w:rPr>
+        <w:t xml:space="preserve"> administrativos y mejorando el flujo de trabajo </w:t>
+      </w:r>
+      <w:r>
+        <w:rPr>
+          <w:rFonts w:ascii="Times New Roman" w:hAnsi="Times New Roman" w:cs="Times New Roman"/>
+          <w:lang w:val="es-ES"/>
+        </w:rPr>
+        <w:t>cuando los clientes utilicen la aplicación.</w:t>
+      </w:r>
+    </w:p>
+    <w:p>
+      <w:pPr>
+        <w:spacing w:line="360" w:lineRule="auto"/>
+        <w:jc w:val="both"/>
+        <w:rPr>
+          <w:rFonts w:ascii="Times New Roman" w:hAnsi="Times New Roman" w:cs="Times New Roman"/>
+          <w:lang w:val="es-ES"/>
+        </w:rPr>
+      </w:pPr>
+    </w:p>
+    <w:p>
+      <w:pPr>
+        <w:spacing w:line="360" w:lineRule="auto"/>
+        <w:jc w:val="both"/>
+        <w:rPr>
+          <w:rFonts w:ascii="Times New Roman" w:hAnsi="Times New Roman" w:cs="Times New Roman"/>
+          <w:lang w:val="es-ES"/>
+        </w:rPr>
+      </w:pPr>
+      <w:r>
+        <w:rPr>
+          <w:rFonts w:ascii="Times New Roman" w:hAnsi="Times New Roman" w:cs="Times New Roman"/>
+          <w:lang w:val="es-ES"/>
+        </w:rPr>
+        <w:t>A lo largo del desarrollo, se han aplicado numerosos lenguajes y herramientas aprendidas durante el curso de Técnico de Desarrollo de Aplicaciones Web, como por ejemplo PHP y Git.</w:t>
+      </w:r>
+    </w:p>
+    <w:p>
+      <w:pPr>
+        <w:spacing w:line="360" w:lineRule="auto"/>
+        <w:jc w:val="both"/>
+        <w:rPr>
+          <w:rFonts w:ascii="Times New Roman" w:hAnsi="Times New Roman" w:cs="Times New Roman"/>
+          <w:lang w:val="es-ES"/>
+        </w:rPr>
+      </w:pPr>
+    </w:p>
+    <w:p>
+      <w:pPr>
+        <w:pStyle w:val="Heading2"/>
+        <w:spacing w:line="360" w:lineRule="auto"/>
+        <w:jc w:val="both"/>
+        <w:rPr>
+          <w:rFonts w:ascii="Times New Roman" w:hAnsi="Times New Roman" w:cs="Times New Roman"/>
+          <w:b/>
+          <w:bCs/>
+          <w:sz w:val="28"/>
+          <w:szCs w:val="28"/>
+          <w:lang w:val="es-ES"/>
+        </w:rPr>
+      </w:pPr>
+      <w:r>
+        <w:rPr>
+          <w:rFonts w:ascii="Times New Roman" w:hAnsi="Times New Roman" w:cs="Times New Roman"/>
+          <w:b/>
+          <w:bCs/>
+          <w:sz w:val="28"/>
+          <w:szCs w:val="28"/>
+          <w:lang w:val="es-ES"/>
+        </w:rPr>
+        <w:t>Logros alcanzados</w:t>
+      </w:r>
+    </w:p>
+    <w:p>
+      <w:pPr>
+        <w:pStyle w:val="ListParagraph"/>
+        <w:numPr>
+          <w:ilvl w:val="0"/>
+          <w:numId w:val="33"/>
+        </w:numPr>
+        <w:spacing w:line="360" w:lineRule="auto"/>
+        <w:jc w:val="both"/>
+        <w:rPr>
+          <w:rFonts w:ascii="Times New Roman" w:hAnsi="Times New Roman" w:cs="Times New Roman"/>
+          <w:lang w:val="es-ES"/>
+        </w:rPr>
+      </w:pPr>
+      <w:r>
+        <w:rPr>
+          <w:rFonts w:ascii="Times New Roman" w:hAnsi="Times New Roman" w:cs="Times New Roman"/>
+          <w:b/>
+          <w:bCs/>
+          <w:lang w:val="es-ES"/>
+        </w:rPr>
+        <w:t>Arquitectura sistematizada y optimizada:</w:t>
+      </w:r>
+      <w:r>
+        <w:rPr>
+          <w:rFonts w:ascii="Times New Roman" w:hAnsi="Times New Roman" w:cs="Times New Roman"/>
+          <w:lang w:val="es-ES"/>
+        </w:rPr>
+        <w:t xml:space="preserve"> Se ha implementado un sistema basado en el patrón </w:t>
+      </w:r>
+      <w:r>
+        <w:rPr>
+          <w:rFonts w:ascii="Times New Roman" w:hAnsi="Times New Roman" w:cs="Times New Roman"/>
+          <w:b/>
+          <w:bCs/>
+          <w:lang w:val="es-ES"/>
+        </w:rPr>
+        <w:t>Modelo-Vista-Controlador</w:t>
+      </w:r>
+      <w:r>
+        <w:rPr>
+          <w:rFonts w:ascii="Times New Roman" w:hAnsi="Times New Roman" w:cs="Times New Roman"/>
+          <w:lang w:val="es-ES"/>
+        </w:rPr>
+        <w:t xml:space="preserve"> con Polaris, lo que ha permitido un desarrollo más eficiente y organizado que de la manera convencional.</w:t>
+      </w:r>
+    </w:p>
+    <w:p>
+      <w:pPr>
+        <w:pStyle w:val="ListParagraph"/>
+        <w:spacing w:line="360" w:lineRule="auto"/>
+        <w:jc w:val="both"/>
+        <w:rPr>
+          <w:rFonts w:ascii="Times New Roman" w:hAnsi="Times New Roman" w:cs="Times New Roman"/>
+          <w:lang w:val="es-ES"/>
+        </w:rPr>
+      </w:pPr>
+    </w:p>
+    <w:p>
+      <w:pPr>
+        <w:pStyle w:val="ListParagraph"/>
+        <w:numPr>
+          <w:ilvl w:val="0"/>
+          <w:numId w:val="33"/>
+        </w:numPr>
+        <w:spacing w:line="360" w:lineRule="auto"/>
+        <w:jc w:val="both"/>
+        <w:rPr>
+          <w:rFonts w:ascii="Times New Roman" w:hAnsi="Times New Roman" w:cs="Times New Roman"/>
+          <w:lang w:val="es-ES"/>
+        </w:rPr>
+      </w:pPr>
+      <w:r>
+        <w:rPr>
+          <w:rFonts w:ascii="Times New Roman" w:hAnsi="Times New Roman" w:cs="Times New Roman"/>
+          <w:b/>
+          <w:bCs/>
+          <w:lang w:val="es-ES"/>
+        </w:rPr>
+        <w:t>Interfaz dirigida al usuario:</w:t>
+      </w:r>
+      <w:r>
+        <w:rPr>
+          <w:rFonts w:ascii="Times New Roman" w:hAnsi="Times New Roman" w:cs="Times New Roman"/>
+          <w:lang w:val="es-ES"/>
+        </w:rPr>
+        <w:t xml:space="preserve"> Se ha diseñado una plataforma accesible y adaptada a los diferentes dispositivos, utilizando principalmente </w:t>
+      </w:r>
+      <w:proofErr w:type="spellStart"/>
+      <w:r>
+        <w:rPr>
+          <w:rFonts w:ascii="Times New Roman" w:hAnsi="Times New Roman" w:cs="Times New Roman"/>
+          <w:b/>
+          <w:bCs/>
+          <w:lang w:val="es-ES"/>
+        </w:rPr>
+        <w:t>TailwindCSS</w:t>
+      </w:r>
+      <w:proofErr w:type="spellEnd"/>
+      <w:r>
+        <w:rPr>
+          <w:rFonts w:ascii="Times New Roman" w:hAnsi="Times New Roman" w:cs="Times New Roman"/>
+          <w:lang w:val="es-ES"/>
+        </w:rPr>
+        <w:t xml:space="preserve"> para maquetar de una manera más rápida.</w:t>
+      </w:r>
+    </w:p>
+    <w:p>
+      <w:pPr>
+        <w:pStyle w:val="ListParagraph"/>
+        <w:jc w:val="both"/>
+        <w:rPr>
+          <w:rFonts w:ascii="Times New Roman" w:hAnsi="Times New Roman" w:cs="Times New Roman"/>
+          <w:lang w:val="es-ES"/>
+        </w:rPr>
+      </w:pPr>
+    </w:p>
+    <w:p>
+      <w:pPr>
+        <w:pStyle w:val="ListParagraph"/>
+        <w:numPr>
+          <w:ilvl w:val="0"/>
+          <w:numId w:val="33"/>
+        </w:numPr>
+        <w:spacing w:line="360" w:lineRule="auto"/>
+        <w:jc w:val="both"/>
+        <w:rPr>
+          <w:rFonts w:ascii="Times New Roman" w:hAnsi="Times New Roman" w:cs="Times New Roman"/>
+          <w:lang w:val="es-ES"/>
+        </w:rPr>
+      </w:pPr>
+      <w:r>
+        <w:rPr>
+          <w:rFonts w:ascii="Times New Roman" w:hAnsi="Times New Roman" w:cs="Times New Roman"/>
+          <w:b/>
+          <w:bCs/>
+          <w:lang w:val="es-ES"/>
+        </w:rPr>
+        <w:t>Gestión de usuarios:</w:t>
+      </w:r>
+      <w:r>
+        <w:rPr>
+          <w:rFonts w:ascii="Times New Roman" w:hAnsi="Times New Roman" w:cs="Times New Roman"/>
+          <w:lang w:val="es-ES"/>
+        </w:rPr>
+        <w:t xml:space="preserve"> Se han desarrollado paneles diferentes según el rol del usuario para tutores, administradores y monitores, asegurando la seguridad de los datos de los participantes y tutores.</w:t>
+      </w:r>
+    </w:p>
+    <w:p>
+      <w:pPr>
+        <w:pStyle w:val="ListParagraph"/>
+        <w:jc w:val="both"/>
+        <w:rPr>
+          <w:rFonts w:ascii="Times New Roman" w:hAnsi="Times New Roman" w:cs="Times New Roman"/>
+          <w:lang w:val="es-ES"/>
+        </w:rPr>
+      </w:pPr>
+    </w:p>
+    <w:p>
+      <w:pPr>
+        <w:pStyle w:val="ListParagraph"/>
+        <w:numPr>
+          <w:ilvl w:val="0"/>
+          <w:numId w:val="33"/>
+        </w:numPr>
+        <w:spacing w:line="360" w:lineRule="auto"/>
+        <w:jc w:val="both"/>
+        <w:rPr>
+          <w:rFonts w:ascii="Times New Roman" w:hAnsi="Times New Roman" w:cs="Times New Roman"/>
+          <w:lang w:val="es-ES"/>
+        </w:rPr>
+      </w:pPr>
+      <w:r>
+        <w:rPr>
+          <w:rFonts w:ascii="Times New Roman" w:hAnsi="Times New Roman" w:cs="Times New Roman"/>
+          <w:b/>
+          <w:bCs/>
+          <w:lang w:val="es-ES"/>
+        </w:rPr>
+        <w:t xml:space="preserve">Automatización de procesos: </w:t>
+      </w:r>
+      <w:r>
+        <w:rPr>
+          <w:rFonts w:ascii="Times New Roman" w:hAnsi="Times New Roman" w:cs="Times New Roman"/>
+          <w:lang w:val="es-ES"/>
+        </w:rPr>
+        <w:t>Se han desarrollado sistemas de optimización de procesos para facilitar la labor del cliente dentro del panel. Por ejemplo, se ha automatizado el envío de emails configurados a tutores para pedir pagos pendientes.</w:t>
+      </w:r>
+    </w:p>
+    <w:p>
+      <w:pPr>
+        <w:pStyle w:val="ListParagraph"/>
+        <w:jc w:val="both"/>
+        <w:rPr>
+          <w:rFonts w:ascii="Times New Roman" w:hAnsi="Times New Roman" w:cs="Times New Roman"/>
+          <w:lang w:val="es-ES"/>
+        </w:rPr>
+      </w:pPr>
+    </w:p>
+    <w:p>
+      <w:pPr>
+        <w:pStyle w:val="ListParagraph"/>
+        <w:numPr>
+          <w:ilvl w:val="0"/>
+          <w:numId w:val="33"/>
+        </w:numPr>
+        <w:spacing w:line="360" w:lineRule="auto"/>
+        <w:jc w:val="both"/>
+        <w:rPr>
+          <w:rFonts w:ascii="Times New Roman" w:hAnsi="Times New Roman" w:cs="Times New Roman"/>
+          <w:lang w:val="es-ES"/>
+        </w:rPr>
+      </w:pPr>
+      <w:r>
+        <w:rPr>
+          <w:rFonts w:ascii="Times New Roman" w:hAnsi="Times New Roman" w:cs="Times New Roman"/>
+          <w:b/>
+          <w:bCs/>
+          <w:lang w:val="es-ES"/>
+        </w:rPr>
+        <w:t>Gestión centralizada de peticiones:</w:t>
+      </w:r>
+      <w:r>
+        <w:rPr>
+          <w:rFonts w:ascii="Times New Roman" w:hAnsi="Times New Roman" w:cs="Times New Roman"/>
+          <w:lang w:val="es-ES"/>
+        </w:rPr>
+        <w:t xml:space="preserve"> Usando Polaris, se ha utilizado un </w:t>
+      </w:r>
+      <w:proofErr w:type="spellStart"/>
+      <w:r>
+        <w:rPr>
+          <w:rFonts w:ascii="Times New Roman" w:hAnsi="Times New Roman" w:cs="Times New Roman"/>
+          <w:b/>
+          <w:bCs/>
+          <w:lang w:val="es-ES"/>
+        </w:rPr>
+        <w:t>Kernel</w:t>
+      </w:r>
+      <w:proofErr w:type="spellEnd"/>
+      <w:r>
+        <w:rPr>
+          <w:rFonts w:ascii="Times New Roman" w:hAnsi="Times New Roman" w:cs="Times New Roman"/>
+          <w:lang w:val="es-ES"/>
+        </w:rPr>
+        <w:t xml:space="preserve"> para centralizar las peticiones AJAX y GET, renderizando plantillas y ejecutando métodos AJAX de una manera más eficiente.</w:t>
+      </w:r>
+    </w:p>
+    <w:p>
+      <w:pPr>
+        <w:pStyle w:val="ListParagraph"/>
+        <w:jc w:val="both"/>
+        <w:rPr>
+          <w:rFonts w:ascii="Times New Roman" w:hAnsi="Times New Roman" w:cs="Times New Roman"/>
+          <w:lang w:val="es-ES"/>
+        </w:rPr>
+      </w:pPr>
+    </w:p>
+    <w:p>
+      <w:pPr>
+        <w:pStyle w:val="ListParagraph"/>
+        <w:numPr>
+          <w:ilvl w:val="0"/>
+          <w:numId w:val="33"/>
+        </w:numPr>
+        <w:spacing w:line="360" w:lineRule="auto"/>
+        <w:jc w:val="both"/>
+        <w:rPr>
+          <w:rFonts w:ascii="Times New Roman" w:hAnsi="Times New Roman" w:cs="Times New Roman"/>
+          <w:lang w:val="es-ES"/>
+        </w:rPr>
+      </w:pPr>
+      <w:r>
+        <w:rPr>
+          <w:rFonts w:ascii="Times New Roman" w:hAnsi="Times New Roman" w:cs="Times New Roman"/>
+          <w:b/>
+          <w:bCs/>
+          <w:lang w:val="es-ES"/>
+        </w:rPr>
+        <w:t>Mejoras respecto a la competencia:</w:t>
+      </w:r>
+      <w:r>
+        <w:rPr>
+          <w:rFonts w:ascii="Times New Roman" w:hAnsi="Times New Roman" w:cs="Times New Roman"/>
+          <w:lang w:val="es-ES"/>
+        </w:rPr>
+        <w:t xml:space="preserve"> Se han corregido deficiencias detectadas en otras páginas y sistemas de campamentos, como la optimización para móviles.</w:t>
+      </w:r>
+    </w:p>
+    <w:p>
+      <w:pPr>
+        <w:spacing w:line="360" w:lineRule="auto"/>
+        <w:jc w:val="both"/>
+        <w:rPr>
+          <w:rFonts w:ascii="Times New Roman" w:hAnsi="Times New Roman" w:cs="Times New Roman"/>
+          <w:lang w:val="es-ES"/>
+        </w:rPr>
+      </w:pPr>
+    </w:p>
+    <w:p>
+      <w:pPr>
+        <w:pStyle w:val="Heading2"/>
+        <w:spacing w:line="360" w:lineRule="auto"/>
+        <w:jc w:val="both"/>
+        <w:rPr>
+          <w:rFonts w:ascii="Times New Roman" w:hAnsi="Times New Roman" w:cs="Times New Roman"/>
+          <w:b/>
+          <w:bCs/>
+          <w:sz w:val="28"/>
+          <w:szCs w:val="28"/>
+          <w:lang w:val="es-ES"/>
+        </w:rPr>
+      </w:pPr>
+      <w:r>
+        <w:rPr>
+          <w:rFonts w:ascii="Times New Roman" w:hAnsi="Times New Roman" w:cs="Times New Roman"/>
+          <w:b/>
+          <w:bCs/>
+          <w:sz w:val="28"/>
+          <w:szCs w:val="28"/>
+          <w:lang w:val="es-ES"/>
+        </w:rPr>
+        <w:lastRenderedPageBreak/>
+        <w:t>Dificultades durante el desarrollo</w:t>
+      </w:r>
+    </w:p>
+    <w:p>
+      <w:pPr>
+        <w:spacing w:line="360" w:lineRule="auto"/>
+        <w:jc w:val="both"/>
+        <w:rPr>
+          <w:rFonts w:ascii="Times New Roman" w:hAnsi="Times New Roman" w:cs="Times New Roman"/>
+          <w:lang w:val="es-ES"/>
+        </w:rPr>
+      </w:pPr>
+      <w:r>
+        <w:rPr>
+          <w:rFonts w:ascii="Times New Roman" w:hAnsi="Times New Roman" w:cs="Times New Roman"/>
+          <w:lang w:val="es-ES"/>
+        </w:rPr>
+        <w:t>Durante el desarrollo del proyecto, han surgido distintos problemas que han sido solucionados de una manera efectiva.</w:t>
+      </w:r>
+    </w:p>
+    <w:p>
+      <w:pPr>
+        <w:spacing w:line="360" w:lineRule="auto"/>
+        <w:jc w:val="both"/>
+        <w:rPr>
+          <w:rFonts w:ascii="Times New Roman" w:hAnsi="Times New Roman" w:cs="Times New Roman"/>
+          <w:lang w:val="es-ES"/>
+        </w:rPr>
+      </w:pPr>
+    </w:p>
+    <w:tbl>
+      <w:tblPr>
+        <w:tblW w:w="5000" w:type="pct"/>
+        <w:tblCellMar>
+          <w:left w:w="0" w:type="dxa"/>
+          <w:right w:w="0" w:type="dxa"/>
+        </w:tblCellMar>
+        <w:tblLook w:val="04A0" w:firstRow="1" w:lastRow="0" w:firstColumn="1" w:lastColumn="0" w:noHBand="0" w:noVBand="1"/>
+      </w:tblPr>
+      <w:tblGrid>
+        <w:gridCol w:w="2043"/>
+        <w:gridCol w:w="3069"/>
+        <w:gridCol w:w="3374"/>
+      </w:tblGrid>
+      <w:tr>
+        <w:trPr>
+          <w:trHeight w:val="165"/>
+        </w:trPr>
+        <w:tc>
+          <w:tcPr>
+            <w:tcW w:w="1204" w:type="pct"/>
+            <w:tcBorders>
+              <w:top w:val="single" w:sz="6" w:space="0" w:color="000000"/>
+              <w:left w:val="single" w:sz="6" w:space="0" w:color="000000"/>
+              <w:bottom w:val="single" w:sz="6" w:space="0" w:color="000000"/>
+              <w:right w:val="single" w:sz="6" w:space="0" w:color="000000"/>
+            </w:tcBorders>
+            <w:shd w:val="clear" w:color="auto" w:fill="B0B3B2"/>
+            <w:tcMar>
+              <w:top w:w="60" w:type="dxa"/>
+              <w:left w:w="60" w:type="dxa"/>
+              <w:bottom w:w="60" w:type="dxa"/>
+              <w:right w:w="60" w:type="dxa"/>
+            </w:tcMar>
+            <w:hideMark/>
+          </w:tcPr>
+          <w:p>
+            <w:pPr>
+              <w:spacing w:line="360" w:lineRule="auto"/>
+              <w:jc w:val="both"/>
+              <w:rPr>
+                <w:rFonts w:ascii="Times New Roman" w:hAnsi="Times New Roman" w:cs="Times New Roman"/>
+                <w:b/>
+                <w:bCs/>
+                <w:sz w:val="20"/>
+                <w:szCs w:val="20"/>
+              </w:rPr>
+            </w:pPr>
+            <w:proofErr w:type="spellStart"/>
+            <w:r>
+              <w:rPr>
+                <w:rFonts w:ascii="Times New Roman" w:hAnsi="Times New Roman" w:cs="Times New Roman"/>
+                <w:b/>
+                <w:bCs/>
+                <w:sz w:val="20"/>
+                <w:szCs w:val="20"/>
+              </w:rPr>
+              <w:t>Dificultad</w:t>
+            </w:r>
+            <w:proofErr w:type="spellEnd"/>
+          </w:p>
+        </w:tc>
+        <w:tc>
+          <w:tcPr>
+            <w:tcW w:w="1808" w:type="pct"/>
+            <w:tcBorders>
+              <w:top w:val="single" w:sz="6" w:space="0" w:color="000000"/>
+              <w:left w:val="single" w:sz="6" w:space="0" w:color="000000"/>
+              <w:bottom w:val="single" w:sz="6" w:space="0" w:color="000000"/>
+              <w:right w:val="single" w:sz="6" w:space="0" w:color="000000"/>
+            </w:tcBorders>
+            <w:shd w:val="clear" w:color="auto" w:fill="B0B3B2"/>
+            <w:tcMar>
+              <w:top w:w="60" w:type="dxa"/>
+              <w:left w:w="60" w:type="dxa"/>
+              <w:bottom w:w="60" w:type="dxa"/>
+              <w:right w:w="60" w:type="dxa"/>
+            </w:tcMar>
+            <w:hideMark/>
+          </w:tcPr>
+          <w:p>
+            <w:pPr>
+              <w:spacing w:line="360" w:lineRule="auto"/>
+              <w:jc w:val="both"/>
+              <w:rPr>
+                <w:rFonts w:ascii="Times New Roman" w:hAnsi="Times New Roman" w:cs="Times New Roman"/>
+                <w:b/>
+                <w:bCs/>
+                <w:sz w:val="20"/>
+                <w:szCs w:val="20"/>
+              </w:rPr>
+            </w:pPr>
+            <w:proofErr w:type="spellStart"/>
+            <w:r>
+              <w:rPr>
+                <w:rFonts w:ascii="Times New Roman" w:hAnsi="Times New Roman" w:cs="Times New Roman"/>
+                <w:b/>
+                <w:bCs/>
+                <w:sz w:val="20"/>
+                <w:szCs w:val="20"/>
+              </w:rPr>
+              <w:t>Problema</w:t>
+            </w:r>
+            <w:proofErr w:type="spellEnd"/>
+          </w:p>
+        </w:tc>
+        <w:tc>
+          <w:tcPr>
+            <w:tcW w:w="1988" w:type="pct"/>
+            <w:tcBorders>
+              <w:top w:val="single" w:sz="6" w:space="0" w:color="000000"/>
+              <w:left w:val="single" w:sz="6" w:space="0" w:color="000000"/>
+              <w:bottom w:val="single" w:sz="6" w:space="0" w:color="000000"/>
+              <w:right w:val="single" w:sz="6" w:space="0" w:color="000000"/>
+            </w:tcBorders>
+            <w:shd w:val="clear" w:color="auto" w:fill="B0B3B2"/>
+            <w:tcMar>
+              <w:top w:w="60" w:type="dxa"/>
+              <w:left w:w="60" w:type="dxa"/>
+              <w:bottom w:w="60" w:type="dxa"/>
+              <w:right w:w="60" w:type="dxa"/>
+            </w:tcMar>
+            <w:hideMark/>
+          </w:tcPr>
+          <w:p>
+            <w:pPr>
+              <w:spacing w:line="360" w:lineRule="auto"/>
+              <w:jc w:val="both"/>
+              <w:rPr>
+                <w:rFonts w:ascii="Times New Roman" w:hAnsi="Times New Roman" w:cs="Times New Roman"/>
+                <w:b/>
+                <w:bCs/>
+                <w:sz w:val="20"/>
+                <w:szCs w:val="20"/>
+              </w:rPr>
+            </w:pPr>
+            <w:proofErr w:type="spellStart"/>
+            <w:r>
+              <w:rPr>
+                <w:rFonts w:ascii="Times New Roman" w:hAnsi="Times New Roman" w:cs="Times New Roman"/>
+                <w:b/>
+                <w:bCs/>
+                <w:sz w:val="20"/>
+                <w:szCs w:val="20"/>
+              </w:rPr>
+              <w:t>Solución</w:t>
+            </w:r>
+            <w:proofErr w:type="spellEnd"/>
+          </w:p>
+        </w:tc>
+      </w:tr>
+      <w:tr>
+        <w:trPr>
+          <w:trHeight w:val="180"/>
+        </w:trPr>
+        <w:tc>
+          <w:tcPr>
+            <w:tcW w:w="1204" w:type="pct"/>
+            <w:tcBorders>
+              <w:top w:val="single" w:sz="6" w:space="0" w:color="000000"/>
+              <w:left w:val="single" w:sz="6" w:space="0" w:color="000000"/>
+              <w:bottom w:val="single" w:sz="6" w:space="0" w:color="000000"/>
+              <w:right w:val="single" w:sz="6" w:space="0" w:color="000000"/>
+            </w:tcBorders>
+            <w:shd w:val="clear" w:color="auto" w:fill="D4D4D4"/>
+            <w:tcMar>
+              <w:top w:w="60" w:type="dxa"/>
+              <w:left w:w="60" w:type="dxa"/>
+              <w:bottom w:w="60" w:type="dxa"/>
+              <w:right w:w="60" w:type="dxa"/>
+            </w:tcMar>
+            <w:hideMark/>
+          </w:tcPr>
+          <w:p>
+            <w:pPr>
+              <w:spacing w:line="360" w:lineRule="auto"/>
+              <w:jc w:val="both"/>
+              <w:rPr>
+                <w:rFonts w:ascii="Times New Roman" w:hAnsi="Times New Roman" w:cs="Times New Roman"/>
+                <w:sz w:val="20"/>
+                <w:szCs w:val="20"/>
+                <w:lang w:val="es-ES"/>
+              </w:rPr>
+            </w:pPr>
+            <w:r>
+              <w:rPr>
+                <w:rFonts w:ascii="Times New Roman" w:hAnsi="Times New Roman" w:cs="Times New Roman"/>
+                <w:b/>
+                <w:bCs/>
+                <w:sz w:val="20"/>
+                <w:szCs w:val="20"/>
+                <w:lang w:val="es-ES"/>
+              </w:rPr>
+              <w:t>Gestión de rutas y peticiones AJAX</w:t>
+            </w:r>
+          </w:p>
+        </w:tc>
+        <w:tc>
+          <w:tcPr>
+            <w:tcW w:w="1808" w:type="pct"/>
+            <w:tcBorders>
+              <w:top w:val="single" w:sz="6" w:space="0" w:color="000000"/>
+              <w:left w:val="single" w:sz="6" w:space="0" w:color="000000"/>
+              <w:bottom w:val="single" w:sz="6" w:space="0" w:color="000000"/>
+              <w:right w:val="single" w:sz="6" w:space="0" w:color="000000"/>
+            </w:tcBorders>
+            <w:tcMar>
+              <w:top w:w="60" w:type="dxa"/>
+              <w:left w:w="60" w:type="dxa"/>
+              <w:bottom w:w="60" w:type="dxa"/>
+              <w:right w:w="60" w:type="dxa"/>
+            </w:tcMar>
+            <w:hideMark/>
+          </w:tcPr>
+          <w:p>
+            <w:pPr>
+              <w:spacing w:line="360" w:lineRule="auto"/>
+              <w:jc w:val="both"/>
+              <w:rPr>
+                <w:rFonts w:ascii="Times New Roman" w:hAnsi="Times New Roman" w:cs="Times New Roman"/>
+                <w:sz w:val="20"/>
+                <w:szCs w:val="20"/>
+                <w:lang w:val="es-ES"/>
+              </w:rPr>
+            </w:pPr>
+            <w:r>
+              <w:rPr>
+                <w:rFonts w:ascii="Times New Roman" w:hAnsi="Times New Roman" w:cs="Times New Roman"/>
+                <w:sz w:val="20"/>
+                <w:szCs w:val="20"/>
+                <w:lang w:val="es-ES"/>
+              </w:rPr>
+              <w:t xml:space="preserve">Inicialmente, la estructura de rutas </w:t>
+            </w:r>
+            <w:r>
+              <w:rPr>
+                <w:rFonts w:ascii="Times New Roman" w:hAnsi="Times New Roman" w:cs="Times New Roman"/>
+                <w:sz w:val="20"/>
+                <w:szCs w:val="20"/>
+                <w:lang w:val="es-ES"/>
+              </w:rPr>
+              <w:t>era bastante compleja al tener un archivo PHP por cada petición AJAX.</w:t>
+            </w:r>
+          </w:p>
+        </w:tc>
+        <w:tc>
+          <w:tcPr>
+            <w:tcW w:w="1988" w:type="pct"/>
+            <w:tcBorders>
+              <w:top w:val="single" w:sz="6" w:space="0" w:color="000000"/>
+              <w:left w:val="single" w:sz="6" w:space="0" w:color="000000"/>
+              <w:bottom w:val="single" w:sz="6" w:space="0" w:color="000000"/>
+              <w:right w:val="single" w:sz="6" w:space="0" w:color="000000"/>
+            </w:tcBorders>
+            <w:tcMar>
+              <w:top w:w="60" w:type="dxa"/>
+              <w:left w:w="60" w:type="dxa"/>
+              <w:bottom w:w="60" w:type="dxa"/>
+              <w:right w:w="60" w:type="dxa"/>
+            </w:tcMar>
+            <w:hideMark/>
+          </w:tcPr>
+          <w:p>
+            <w:pPr>
+              <w:spacing w:line="360" w:lineRule="auto"/>
+              <w:jc w:val="both"/>
+              <w:rPr>
+                <w:rFonts w:ascii="Times New Roman" w:hAnsi="Times New Roman" w:cs="Times New Roman"/>
+                <w:sz w:val="20"/>
+                <w:szCs w:val="20"/>
+                <w:lang w:val="es-ES"/>
+              </w:rPr>
+            </w:pPr>
+            <w:r>
+              <w:rPr>
+                <w:rFonts w:ascii="Times New Roman" w:hAnsi="Times New Roman" w:cs="Times New Roman"/>
+                <w:sz w:val="20"/>
+                <w:szCs w:val="20"/>
+                <w:lang w:val="es-ES"/>
+              </w:rPr>
+              <w:t xml:space="preserve">Se utilizó </w:t>
+            </w:r>
+            <w:r>
+              <w:rPr>
+                <w:rFonts w:ascii="Times New Roman" w:hAnsi="Times New Roman" w:cs="Times New Roman"/>
+                <w:b/>
+                <w:bCs/>
+                <w:sz w:val="20"/>
+                <w:szCs w:val="20"/>
+                <w:lang w:val="es-ES"/>
+              </w:rPr>
+              <w:t>Polaris</w:t>
+            </w:r>
+            <w:r>
+              <w:rPr>
+                <w:rFonts w:ascii="Times New Roman" w:hAnsi="Times New Roman" w:cs="Times New Roman"/>
+                <w:sz w:val="20"/>
+                <w:szCs w:val="20"/>
+                <w:lang w:val="es-ES"/>
+              </w:rPr>
+              <w:t xml:space="preserve"> y se centralizaron las peticiones en un único enrutador.</w:t>
+            </w:r>
+          </w:p>
+        </w:tc>
+      </w:tr>
+      <w:tr>
+        <w:trPr>
+          <w:trHeight w:val="165"/>
+        </w:trPr>
+        <w:tc>
+          <w:tcPr>
+            <w:tcW w:w="1204" w:type="pct"/>
+            <w:tcBorders>
+              <w:top w:val="single" w:sz="6" w:space="0" w:color="000000"/>
+              <w:left w:val="single" w:sz="6" w:space="0" w:color="000000"/>
+              <w:bottom w:val="single" w:sz="6" w:space="0" w:color="000000"/>
+              <w:right w:val="single" w:sz="6" w:space="0" w:color="000000"/>
+            </w:tcBorders>
+            <w:shd w:val="clear" w:color="auto" w:fill="D4D4D4"/>
+            <w:tcMar>
+              <w:top w:w="60" w:type="dxa"/>
+              <w:left w:w="60" w:type="dxa"/>
+              <w:bottom w:w="60" w:type="dxa"/>
+              <w:right w:w="60" w:type="dxa"/>
+            </w:tcMar>
+            <w:hideMark/>
+          </w:tcPr>
+          <w:p>
+            <w:pPr>
+              <w:spacing w:line="360" w:lineRule="auto"/>
+              <w:jc w:val="both"/>
+              <w:rPr>
+                <w:rFonts w:ascii="Times New Roman" w:hAnsi="Times New Roman" w:cs="Times New Roman"/>
+                <w:sz w:val="20"/>
+                <w:szCs w:val="20"/>
+                <w:lang w:val="es-ES"/>
+              </w:rPr>
+            </w:pPr>
+            <w:r>
+              <w:rPr>
+                <w:rFonts w:ascii="Times New Roman" w:hAnsi="Times New Roman" w:cs="Times New Roman"/>
+                <w:b/>
+                <w:bCs/>
+                <w:sz w:val="20"/>
+                <w:szCs w:val="20"/>
+                <w:lang w:val="es-ES"/>
+              </w:rPr>
+              <w:t>Implementación del entorno de desarrollo</w:t>
+            </w:r>
+          </w:p>
+        </w:tc>
+        <w:tc>
+          <w:tcPr>
+            <w:tcW w:w="1808" w:type="pct"/>
+            <w:tcBorders>
+              <w:top w:val="single" w:sz="6" w:space="0" w:color="000000"/>
+              <w:left w:val="single" w:sz="6" w:space="0" w:color="000000"/>
+              <w:bottom w:val="single" w:sz="6" w:space="0" w:color="000000"/>
+              <w:right w:val="single" w:sz="6" w:space="0" w:color="000000"/>
+            </w:tcBorders>
+            <w:tcMar>
+              <w:top w:w="60" w:type="dxa"/>
+              <w:left w:w="60" w:type="dxa"/>
+              <w:bottom w:w="60" w:type="dxa"/>
+              <w:right w:w="60" w:type="dxa"/>
+            </w:tcMar>
+            <w:hideMark/>
+          </w:tcPr>
+          <w:p>
+            <w:pPr>
+              <w:spacing w:line="360" w:lineRule="auto"/>
+              <w:jc w:val="both"/>
+              <w:rPr>
+                <w:rFonts w:ascii="Times New Roman" w:hAnsi="Times New Roman" w:cs="Times New Roman"/>
+                <w:sz w:val="20"/>
+                <w:szCs w:val="20"/>
+                <w:lang w:val="es-ES"/>
+              </w:rPr>
+            </w:pPr>
+            <w:r>
+              <w:rPr>
+                <w:rFonts w:ascii="Times New Roman" w:hAnsi="Times New Roman" w:cs="Times New Roman"/>
+                <w:sz w:val="20"/>
+                <w:szCs w:val="20"/>
+                <w:lang w:val="es-ES"/>
+              </w:rPr>
+              <w:t>XAMMP presentaba numerosos problemas en MacOS.</w:t>
+            </w:r>
+          </w:p>
+        </w:tc>
+        <w:tc>
+          <w:tcPr>
+            <w:tcW w:w="1988" w:type="pct"/>
+            <w:tcBorders>
+              <w:top w:val="single" w:sz="6" w:space="0" w:color="000000"/>
+              <w:left w:val="single" w:sz="6" w:space="0" w:color="000000"/>
+              <w:bottom w:val="single" w:sz="6" w:space="0" w:color="000000"/>
+              <w:right w:val="single" w:sz="6" w:space="0" w:color="000000"/>
+            </w:tcBorders>
+            <w:tcMar>
+              <w:top w:w="60" w:type="dxa"/>
+              <w:left w:w="60" w:type="dxa"/>
+              <w:bottom w:w="60" w:type="dxa"/>
+              <w:right w:w="60" w:type="dxa"/>
+            </w:tcMar>
+            <w:hideMark/>
+          </w:tcPr>
+          <w:p>
+            <w:pPr>
+              <w:spacing w:line="360" w:lineRule="auto"/>
+              <w:jc w:val="both"/>
+              <w:rPr>
+                <w:rFonts w:ascii="Times New Roman" w:hAnsi="Times New Roman" w:cs="Times New Roman"/>
+                <w:sz w:val="20"/>
+                <w:szCs w:val="20"/>
+                <w:lang w:val="es-ES"/>
+              </w:rPr>
+            </w:pPr>
+            <w:r>
+              <w:rPr>
+                <w:rFonts w:ascii="Times New Roman" w:hAnsi="Times New Roman" w:cs="Times New Roman"/>
+                <w:sz w:val="20"/>
+                <w:szCs w:val="20"/>
+                <w:lang w:val="es-ES"/>
+              </w:rPr>
+              <w:t xml:space="preserve">Se optó por </w:t>
+            </w:r>
+            <w:r>
+              <w:rPr>
+                <w:rFonts w:ascii="Times New Roman" w:hAnsi="Times New Roman" w:cs="Times New Roman"/>
+                <w:b/>
+                <w:bCs/>
+                <w:sz w:val="20"/>
+                <w:szCs w:val="20"/>
+                <w:lang w:val="es-ES"/>
+              </w:rPr>
+              <w:t>Docker</w:t>
+            </w:r>
+            <w:r>
+              <w:rPr>
+                <w:rFonts w:ascii="Times New Roman" w:hAnsi="Times New Roman" w:cs="Times New Roman"/>
+                <w:sz w:val="20"/>
+                <w:szCs w:val="20"/>
+                <w:lang w:val="es-ES"/>
+              </w:rPr>
+              <w:t xml:space="preserve"> para garantizar una configuración uniforme en distintos entornos.</w:t>
+            </w:r>
+          </w:p>
+        </w:tc>
+      </w:tr>
+      <w:tr>
+        <w:trPr>
+          <w:trHeight w:val="165"/>
+        </w:trPr>
+        <w:tc>
+          <w:tcPr>
+            <w:tcW w:w="1204" w:type="pct"/>
+            <w:tcBorders>
+              <w:top w:val="single" w:sz="6" w:space="0" w:color="000000"/>
+              <w:left w:val="single" w:sz="6" w:space="0" w:color="000000"/>
+              <w:bottom w:val="single" w:sz="6" w:space="0" w:color="000000"/>
+              <w:right w:val="single" w:sz="6" w:space="0" w:color="000000"/>
+            </w:tcBorders>
+            <w:shd w:val="clear" w:color="auto" w:fill="D4D4D4"/>
+            <w:tcMar>
+              <w:top w:w="60" w:type="dxa"/>
+              <w:left w:w="60" w:type="dxa"/>
+              <w:bottom w:w="60" w:type="dxa"/>
+              <w:right w:w="60" w:type="dxa"/>
+            </w:tcMar>
+            <w:hideMark/>
+          </w:tcPr>
+          <w:p>
+            <w:pPr>
+              <w:spacing w:line="360" w:lineRule="auto"/>
+              <w:jc w:val="both"/>
+              <w:rPr>
+                <w:rFonts w:ascii="Times New Roman" w:hAnsi="Times New Roman" w:cs="Times New Roman"/>
+                <w:sz w:val="20"/>
+                <w:szCs w:val="20"/>
+              </w:rPr>
+            </w:pPr>
+            <w:r>
+              <w:rPr>
+                <w:rFonts w:ascii="Times New Roman" w:hAnsi="Times New Roman" w:cs="Times New Roman"/>
+                <w:b/>
+                <w:bCs/>
+                <w:sz w:val="20"/>
+                <w:szCs w:val="20"/>
+              </w:rPr>
+              <w:t xml:space="preserve">Sistema de </w:t>
+            </w:r>
+            <w:proofErr w:type="spellStart"/>
+            <w:r>
+              <w:rPr>
+                <w:rFonts w:ascii="Times New Roman" w:hAnsi="Times New Roman" w:cs="Times New Roman"/>
+                <w:b/>
+                <w:bCs/>
+                <w:sz w:val="20"/>
+                <w:szCs w:val="20"/>
+              </w:rPr>
+              <w:t>pagos</w:t>
+            </w:r>
+            <w:proofErr w:type="spellEnd"/>
+          </w:p>
+        </w:tc>
+        <w:tc>
+          <w:tcPr>
+            <w:tcW w:w="1808" w:type="pct"/>
+            <w:tcBorders>
+              <w:top w:val="single" w:sz="6" w:space="0" w:color="000000"/>
+              <w:left w:val="single" w:sz="6" w:space="0" w:color="000000"/>
+              <w:bottom w:val="single" w:sz="6" w:space="0" w:color="000000"/>
+              <w:right w:val="single" w:sz="6" w:space="0" w:color="000000"/>
+            </w:tcBorders>
+            <w:tcMar>
+              <w:top w:w="60" w:type="dxa"/>
+              <w:left w:w="60" w:type="dxa"/>
+              <w:bottom w:w="60" w:type="dxa"/>
+              <w:right w:w="60" w:type="dxa"/>
+            </w:tcMar>
+            <w:hideMark/>
+          </w:tcPr>
+          <w:p>
+            <w:pPr>
+              <w:spacing w:line="360" w:lineRule="auto"/>
+              <w:jc w:val="both"/>
+              <w:rPr>
+                <w:rFonts w:ascii="Times New Roman" w:hAnsi="Times New Roman" w:cs="Times New Roman"/>
+                <w:sz w:val="20"/>
+                <w:szCs w:val="20"/>
+                <w:lang w:val="es-ES"/>
+              </w:rPr>
+            </w:pPr>
+            <w:r>
+              <w:rPr>
+                <w:rFonts w:ascii="Times New Roman" w:hAnsi="Times New Roman" w:cs="Times New Roman"/>
+                <w:sz w:val="20"/>
+                <w:szCs w:val="20"/>
+                <w:lang w:val="es-ES"/>
+              </w:rPr>
+              <w:t>No se implementó un sistema de pago dentro de la plataforma</w:t>
+            </w:r>
+            <w:r>
+              <w:rPr>
+                <w:rFonts w:ascii="Times New Roman" w:hAnsi="Times New Roman" w:cs="Times New Roman"/>
+                <w:sz w:val="20"/>
+                <w:szCs w:val="20"/>
+                <w:lang w:val="es-ES"/>
+              </w:rPr>
+              <w:t>.</w:t>
+            </w:r>
+          </w:p>
+        </w:tc>
+        <w:tc>
+          <w:tcPr>
+            <w:tcW w:w="1988" w:type="pct"/>
+            <w:tcBorders>
+              <w:top w:val="single" w:sz="6" w:space="0" w:color="000000"/>
+              <w:left w:val="single" w:sz="6" w:space="0" w:color="000000"/>
+              <w:bottom w:val="single" w:sz="6" w:space="0" w:color="000000"/>
+              <w:right w:val="single" w:sz="6" w:space="0" w:color="000000"/>
+            </w:tcBorders>
+            <w:tcMar>
+              <w:top w:w="60" w:type="dxa"/>
+              <w:left w:w="60" w:type="dxa"/>
+              <w:bottom w:w="60" w:type="dxa"/>
+              <w:right w:w="60" w:type="dxa"/>
+            </w:tcMar>
+            <w:hideMark/>
+          </w:tcPr>
+          <w:p>
+            <w:pPr>
+              <w:spacing w:line="360" w:lineRule="auto"/>
+              <w:jc w:val="both"/>
+              <w:rPr>
+                <w:rFonts w:ascii="Times New Roman" w:hAnsi="Times New Roman" w:cs="Times New Roman"/>
+                <w:sz w:val="20"/>
+                <w:szCs w:val="20"/>
+                <w:lang w:val="es-ES"/>
+              </w:rPr>
+            </w:pPr>
+            <w:r>
+              <w:rPr>
+                <w:rFonts w:ascii="Times New Roman" w:hAnsi="Times New Roman" w:cs="Times New Roman"/>
+                <w:sz w:val="20"/>
+                <w:szCs w:val="20"/>
+                <w:lang w:val="es-ES"/>
+              </w:rPr>
+              <w:t>Se desarrolló un sistema de recordatorio por correo electrónico, notificando a los tutores sobre los pagos pendientes.</w:t>
+            </w:r>
+          </w:p>
+        </w:tc>
+      </w:tr>
+    </w:tbl>
+    <w:p>
+      <w:pPr>
+        <w:spacing w:line="360" w:lineRule="auto"/>
+        <w:jc w:val="both"/>
+        <w:rPr>
+          <w:rFonts w:ascii="Times New Roman" w:hAnsi="Times New Roman" w:cs="Times New Roman"/>
+          <w:lang w:val="es-ES"/>
+        </w:rPr>
+      </w:pPr>
+    </w:p>
+    <w:p>
+      <w:pPr>
+        <w:pStyle w:val="Heading2"/>
+        <w:spacing w:line="360" w:lineRule="auto"/>
+        <w:jc w:val="both"/>
+        <w:rPr>
+          <w:rFonts w:ascii="Times New Roman" w:hAnsi="Times New Roman" w:cs="Times New Roman"/>
+          <w:b/>
+          <w:bCs/>
+          <w:sz w:val="28"/>
+          <w:szCs w:val="28"/>
+          <w:lang w:val="es-ES"/>
+        </w:rPr>
+      </w:pPr>
+      <w:r>
+        <w:rPr>
+          <w:rFonts w:ascii="Times New Roman" w:hAnsi="Times New Roman" w:cs="Times New Roman"/>
+          <w:b/>
+          <w:bCs/>
+          <w:sz w:val="28"/>
+          <w:szCs w:val="28"/>
+          <w:lang w:val="es-ES"/>
+        </w:rPr>
+        <w:t>Impacto y futuro del proyecto</w:t>
+      </w:r>
+    </w:p>
+    <w:p>
+      <w:pPr>
+        <w:spacing w:line="360" w:lineRule="auto"/>
+        <w:jc w:val="both"/>
+        <w:rPr>
+          <w:rFonts w:ascii="Times New Roman" w:hAnsi="Times New Roman" w:cs="Times New Roman"/>
+          <w:lang w:val="es-ES"/>
+        </w:rPr>
+      </w:pPr>
+      <w:r>
+        <w:rPr>
+          <w:rFonts w:ascii="Times New Roman" w:hAnsi="Times New Roman" w:cs="Times New Roman"/>
+          <w:lang w:val="es-ES"/>
+        </w:rPr>
+        <w:t>Esta plataforma supone numerosas mejoras en la digitalización de la gestión de campamentos infantiles, proporcionando una herramienta útil y escalable para diferentes empresas.</w:t>
+      </w:r>
+    </w:p>
+    <w:p>
+      <w:pPr>
+        <w:spacing w:line="360" w:lineRule="auto"/>
+        <w:jc w:val="both"/>
+        <w:rPr>
+          <w:rFonts w:ascii="Times New Roman" w:hAnsi="Times New Roman" w:cs="Times New Roman"/>
+          <w:lang w:val="es-ES"/>
+        </w:rPr>
+      </w:pPr>
+    </w:p>
+    <w:tbl>
+      <w:tblPr>
+        <w:tblW w:w="5000" w:type="pct"/>
+        <w:tblCellMar>
+          <w:left w:w="0" w:type="dxa"/>
+          <w:right w:w="0" w:type="dxa"/>
+        </w:tblCellMar>
+        <w:tblLook w:val="04A0" w:firstRow="1" w:lastRow="0" w:firstColumn="1" w:lastColumn="0" w:noHBand="0" w:noVBand="1"/>
+      </w:tblPr>
+      <w:tblGrid>
+        <w:gridCol w:w="3391"/>
+        <w:gridCol w:w="5095"/>
+      </w:tblGrid>
+      <w:tr>
+        <w:trPr>
+          <w:trHeight w:val="165"/>
+        </w:trPr>
+        <w:tc>
+          <w:tcPr>
+            <w:tcW w:w="1998" w:type="pct"/>
+            <w:tcBorders>
+              <w:top w:val="single" w:sz="6" w:space="0" w:color="000000"/>
+              <w:left w:val="single" w:sz="6" w:space="0" w:color="000000"/>
+              <w:bottom w:val="single" w:sz="6" w:space="0" w:color="000000"/>
+              <w:right w:val="single" w:sz="6" w:space="0" w:color="000000"/>
+            </w:tcBorders>
+            <w:shd w:val="clear" w:color="auto" w:fill="B0B3B2"/>
+            <w:tcMar>
+              <w:top w:w="60" w:type="dxa"/>
+              <w:left w:w="60" w:type="dxa"/>
+              <w:bottom w:w="60" w:type="dxa"/>
+              <w:right w:w="60" w:type="dxa"/>
+            </w:tcMar>
+            <w:hideMark/>
+          </w:tcPr>
+          <w:p>
+            <w:pPr>
+              <w:spacing w:line="360" w:lineRule="auto"/>
+              <w:jc w:val="both"/>
+              <w:rPr>
+                <w:rFonts w:ascii="Times New Roman" w:hAnsi="Times New Roman" w:cs="Times New Roman"/>
+                <w:b/>
+                <w:bCs/>
+                <w:sz w:val="20"/>
+                <w:szCs w:val="20"/>
+              </w:rPr>
+            </w:pPr>
+            <w:proofErr w:type="spellStart"/>
+            <w:r>
+              <w:rPr>
+                <w:rFonts w:ascii="Times New Roman" w:hAnsi="Times New Roman" w:cs="Times New Roman"/>
+                <w:b/>
+                <w:bCs/>
+                <w:sz w:val="20"/>
+                <w:szCs w:val="20"/>
+              </w:rPr>
+              <w:t>Mejora</w:t>
+            </w:r>
+            <w:proofErr w:type="spellEnd"/>
+          </w:p>
+        </w:tc>
+        <w:tc>
+          <w:tcPr>
+            <w:tcW w:w="3002" w:type="pct"/>
+            <w:tcBorders>
+              <w:top w:val="single" w:sz="6" w:space="0" w:color="000000"/>
+              <w:left w:val="single" w:sz="6" w:space="0" w:color="000000"/>
+              <w:bottom w:val="single" w:sz="6" w:space="0" w:color="000000"/>
+              <w:right w:val="single" w:sz="6" w:space="0" w:color="000000"/>
+            </w:tcBorders>
+            <w:shd w:val="clear" w:color="auto" w:fill="B0B3B2"/>
+            <w:tcMar>
+              <w:top w:w="60" w:type="dxa"/>
+              <w:left w:w="60" w:type="dxa"/>
+              <w:bottom w:w="60" w:type="dxa"/>
+              <w:right w:w="60" w:type="dxa"/>
+            </w:tcMar>
+            <w:hideMark/>
+          </w:tcPr>
+          <w:p>
+            <w:pPr>
+              <w:spacing w:line="360" w:lineRule="auto"/>
+              <w:jc w:val="both"/>
+              <w:rPr>
+                <w:rFonts w:ascii="Times New Roman" w:hAnsi="Times New Roman" w:cs="Times New Roman"/>
+                <w:b/>
+                <w:bCs/>
+                <w:sz w:val="20"/>
+                <w:szCs w:val="20"/>
+              </w:rPr>
+            </w:pPr>
+            <w:proofErr w:type="spellStart"/>
+            <w:r>
+              <w:rPr>
+                <w:rFonts w:ascii="Times New Roman" w:hAnsi="Times New Roman" w:cs="Times New Roman"/>
+                <w:b/>
+                <w:bCs/>
+                <w:sz w:val="20"/>
+                <w:szCs w:val="20"/>
+              </w:rPr>
+              <w:t>Descripción</w:t>
+            </w:r>
+            <w:proofErr w:type="spellEnd"/>
+          </w:p>
+        </w:tc>
+      </w:tr>
+      <w:tr>
+        <w:trPr>
+          <w:trHeight w:val="180"/>
+        </w:trPr>
+        <w:tc>
+          <w:tcPr>
+            <w:tcW w:w="1998" w:type="pct"/>
+            <w:tcBorders>
+              <w:top w:val="single" w:sz="6" w:space="0" w:color="000000"/>
+              <w:left w:val="single" w:sz="6" w:space="0" w:color="000000"/>
+              <w:bottom w:val="single" w:sz="6" w:space="0" w:color="000000"/>
+              <w:right w:val="single" w:sz="6" w:space="0" w:color="000000"/>
+            </w:tcBorders>
+            <w:shd w:val="clear" w:color="auto" w:fill="D4D4D4"/>
+            <w:tcMar>
+              <w:top w:w="60" w:type="dxa"/>
+              <w:left w:w="60" w:type="dxa"/>
+              <w:bottom w:w="60" w:type="dxa"/>
+              <w:right w:w="60" w:type="dxa"/>
+            </w:tcMar>
+            <w:hideMark/>
+          </w:tcPr>
+          <w:p>
+            <w:pPr>
+              <w:spacing w:line="360" w:lineRule="auto"/>
+              <w:jc w:val="both"/>
+              <w:rPr>
+                <w:rFonts w:ascii="Times New Roman" w:hAnsi="Times New Roman" w:cs="Times New Roman"/>
+                <w:sz w:val="20"/>
+                <w:szCs w:val="20"/>
+                <w:lang w:val="es-ES"/>
+              </w:rPr>
+            </w:pPr>
+            <w:r>
+              <w:rPr>
+                <w:rFonts w:ascii="Times New Roman" w:hAnsi="Times New Roman" w:cs="Times New Roman"/>
+                <w:b/>
+                <w:bCs/>
+                <w:sz w:val="20"/>
+                <w:szCs w:val="20"/>
+                <w:lang w:val="es-ES"/>
+              </w:rPr>
+              <w:t xml:space="preserve">Aplicación de escritorio con </w:t>
+            </w:r>
+            <w:proofErr w:type="spellStart"/>
+            <w:r>
+              <w:rPr>
+                <w:rFonts w:ascii="Times New Roman" w:hAnsi="Times New Roman" w:cs="Times New Roman"/>
+                <w:b/>
+                <w:bCs/>
+                <w:sz w:val="20"/>
+                <w:szCs w:val="20"/>
+                <w:lang w:val="es-ES"/>
+              </w:rPr>
+              <w:t>Electron</w:t>
+            </w:r>
+            <w:proofErr w:type="spellEnd"/>
+          </w:p>
+        </w:tc>
+        <w:tc>
+          <w:tcPr>
+            <w:tcW w:w="3002" w:type="pct"/>
+            <w:tcBorders>
+              <w:top w:val="single" w:sz="6" w:space="0" w:color="000000"/>
+              <w:left w:val="single" w:sz="6" w:space="0" w:color="000000"/>
+              <w:bottom w:val="single" w:sz="6" w:space="0" w:color="000000"/>
+              <w:right w:val="single" w:sz="6" w:space="0" w:color="000000"/>
+            </w:tcBorders>
+            <w:tcMar>
+              <w:top w:w="60" w:type="dxa"/>
+              <w:left w:w="60" w:type="dxa"/>
+              <w:bottom w:w="60" w:type="dxa"/>
+              <w:right w:w="60" w:type="dxa"/>
+            </w:tcMar>
+            <w:hideMark/>
+          </w:tcPr>
+          <w:p>
+            <w:pPr>
+              <w:spacing w:line="360" w:lineRule="auto"/>
+              <w:jc w:val="both"/>
+              <w:rPr>
+                <w:rFonts w:ascii="Times New Roman" w:hAnsi="Times New Roman" w:cs="Times New Roman"/>
+                <w:sz w:val="20"/>
+                <w:szCs w:val="20"/>
+                <w:lang w:val="es-ES"/>
+              </w:rPr>
+            </w:pPr>
+            <w:r>
+              <w:rPr>
+                <w:rFonts w:ascii="Times New Roman" w:hAnsi="Times New Roman" w:cs="Times New Roman"/>
+                <w:sz w:val="20"/>
+                <w:szCs w:val="20"/>
+                <w:lang w:val="es-ES"/>
+              </w:rPr>
+              <w:t xml:space="preserve">Se desarrollará una versión de escritorio de la aplicación utilizando </w:t>
+            </w:r>
+            <w:proofErr w:type="spellStart"/>
+            <w:r>
+              <w:rPr>
+                <w:rFonts w:ascii="Times New Roman" w:hAnsi="Times New Roman" w:cs="Times New Roman"/>
+                <w:b/>
+                <w:bCs/>
+                <w:sz w:val="20"/>
+                <w:szCs w:val="20"/>
+                <w:lang w:val="es-ES"/>
+              </w:rPr>
+              <w:t>Electron</w:t>
+            </w:r>
+            <w:proofErr w:type="spellEnd"/>
+            <w:r>
+              <w:rPr>
+                <w:rFonts w:ascii="Times New Roman" w:hAnsi="Times New Roman" w:cs="Times New Roman"/>
+                <w:sz w:val="20"/>
+                <w:szCs w:val="20"/>
+                <w:lang w:val="es-ES"/>
+              </w:rPr>
+              <w:t>.</w:t>
+            </w:r>
+          </w:p>
+        </w:tc>
+      </w:tr>
+      <w:tr>
+        <w:trPr>
+          <w:trHeight w:val="165"/>
+        </w:trPr>
+        <w:tc>
+          <w:tcPr>
+            <w:tcW w:w="1998" w:type="pct"/>
+            <w:tcBorders>
+              <w:top w:val="single" w:sz="6" w:space="0" w:color="000000"/>
+              <w:left w:val="single" w:sz="6" w:space="0" w:color="000000"/>
+              <w:bottom w:val="single" w:sz="6" w:space="0" w:color="000000"/>
+              <w:right w:val="single" w:sz="6" w:space="0" w:color="000000"/>
+            </w:tcBorders>
+            <w:shd w:val="clear" w:color="auto" w:fill="D4D4D4"/>
+            <w:tcMar>
+              <w:top w:w="60" w:type="dxa"/>
+              <w:left w:w="60" w:type="dxa"/>
+              <w:bottom w:w="60" w:type="dxa"/>
+              <w:right w:w="60" w:type="dxa"/>
+            </w:tcMar>
+            <w:hideMark/>
+          </w:tcPr>
+          <w:p>
+            <w:pPr>
+              <w:spacing w:line="360" w:lineRule="auto"/>
+              <w:jc w:val="both"/>
+              <w:rPr>
+                <w:rFonts w:ascii="Times New Roman" w:hAnsi="Times New Roman" w:cs="Times New Roman"/>
+                <w:sz w:val="20"/>
+                <w:szCs w:val="20"/>
+                <w:lang w:val="es-ES"/>
+              </w:rPr>
+            </w:pPr>
+            <w:r>
+              <w:rPr>
+                <w:rFonts w:ascii="Times New Roman" w:hAnsi="Times New Roman" w:cs="Times New Roman"/>
+                <w:b/>
+                <w:bCs/>
+                <w:sz w:val="20"/>
+                <w:szCs w:val="20"/>
+                <w:lang w:val="es-ES"/>
+              </w:rPr>
+              <w:t xml:space="preserve">Notificaciones </w:t>
+            </w:r>
+            <w:proofErr w:type="spellStart"/>
+            <w:r>
+              <w:rPr>
+                <w:rFonts w:ascii="Times New Roman" w:hAnsi="Times New Roman" w:cs="Times New Roman"/>
+                <w:b/>
+                <w:bCs/>
+                <w:sz w:val="20"/>
+                <w:szCs w:val="20"/>
+                <w:lang w:val="es-ES"/>
+              </w:rPr>
+              <w:t>Push</w:t>
+            </w:r>
+            <w:proofErr w:type="spellEnd"/>
+            <w:r>
+              <w:rPr>
+                <w:rFonts w:ascii="Times New Roman" w:hAnsi="Times New Roman" w:cs="Times New Roman"/>
+                <w:b/>
+                <w:bCs/>
+                <w:sz w:val="20"/>
+                <w:szCs w:val="20"/>
+                <w:lang w:val="es-ES"/>
+              </w:rPr>
+              <w:t xml:space="preserve"> con </w:t>
+            </w:r>
+            <w:proofErr w:type="spellStart"/>
+            <w:r>
+              <w:rPr>
+                <w:rFonts w:ascii="Times New Roman" w:hAnsi="Times New Roman" w:cs="Times New Roman"/>
+                <w:b/>
+                <w:bCs/>
+                <w:sz w:val="20"/>
+                <w:szCs w:val="20"/>
+                <w:lang w:val="es-ES"/>
+              </w:rPr>
+              <w:t>Firebase</w:t>
+            </w:r>
+            <w:proofErr w:type="spellEnd"/>
+          </w:p>
+        </w:tc>
+        <w:tc>
+          <w:tcPr>
+            <w:tcW w:w="3002" w:type="pct"/>
+            <w:tcBorders>
+              <w:top w:val="single" w:sz="6" w:space="0" w:color="000000"/>
+              <w:left w:val="single" w:sz="6" w:space="0" w:color="000000"/>
+              <w:bottom w:val="single" w:sz="6" w:space="0" w:color="000000"/>
+              <w:right w:val="single" w:sz="6" w:space="0" w:color="000000"/>
+            </w:tcBorders>
+            <w:tcMar>
+              <w:top w:w="60" w:type="dxa"/>
+              <w:left w:w="60" w:type="dxa"/>
+              <w:bottom w:w="60" w:type="dxa"/>
+              <w:right w:w="60" w:type="dxa"/>
+            </w:tcMar>
+            <w:hideMark/>
+          </w:tcPr>
+          <w:p>
+            <w:pPr>
+              <w:spacing w:line="360" w:lineRule="auto"/>
+              <w:jc w:val="both"/>
+              <w:rPr>
+                <w:rFonts w:ascii="Times New Roman" w:hAnsi="Times New Roman" w:cs="Times New Roman"/>
+                <w:sz w:val="20"/>
+                <w:szCs w:val="20"/>
+                <w:lang w:val="es-ES"/>
+              </w:rPr>
+            </w:pPr>
+            <w:r>
+              <w:rPr>
+                <w:rFonts w:ascii="Times New Roman" w:hAnsi="Times New Roman" w:cs="Times New Roman"/>
+                <w:sz w:val="20"/>
+                <w:szCs w:val="20"/>
+                <w:lang w:val="es-ES"/>
+              </w:rPr>
+              <w:t xml:space="preserve">Se implementará un sistema de notificaciones vinculadas a los dispositivos de los usuarios utilizando </w:t>
+            </w:r>
+            <w:proofErr w:type="spellStart"/>
+            <w:r>
+              <w:rPr>
+                <w:rFonts w:ascii="Times New Roman" w:hAnsi="Times New Roman" w:cs="Times New Roman"/>
+                <w:b/>
+                <w:bCs/>
+                <w:sz w:val="20"/>
+                <w:szCs w:val="20"/>
+                <w:lang w:val="es-ES"/>
+              </w:rPr>
+              <w:t>Firebase</w:t>
+            </w:r>
+            <w:proofErr w:type="spellEnd"/>
+            <w:r>
+              <w:rPr>
+                <w:rFonts w:ascii="Times New Roman" w:hAnsi="Times New Roman" w:cs="Times New Roman"/>
+                <w:sz w:val="20"/>
+                <w:szCs w:val="20"/>
+                <w:lang w:val="es-ES"/>
+              </w:rPr>
+              <w:t>.</w:t>
+            </w:r>
+          </w:p>
+        </w:tc>
+      </w:tr>
+    </w:tbl>
+    <w:p>
+      <w:pPr>
+        <w:spacing w:line="360" w:lineRule="auto"/>
+        <w:jc w:val="both"/>
+        <w:rPr>
+          <w:rFonts w:ascii="Times New Roman" w:hAnsi="Times New Roman" w:cs="Times New Roman"/>
+          <w:lang w:val="es-ES"/>
+        </w:rPr>
+      </w:pPr>
+    </w:p>
+    <w:p>
+      <w:pPr>
+        <w:spacing w:line="360" w:lineRule="auto"/>
+        <w:jc w:val="both"/>
+        <w:rPr>
+          <w:rFonts w:ascii="Times New Roman" w:hAnsi="Times New Roman" w:cs="Times New Roman"/>
+          <w:lang w:val="es-ES"/>
+        </w:rPr>
+      </w:pPr>
+      <w:r>
+        <w:rPr>
+          <w:rFonts w:ascii="Times New Roman" w:hAnsi="Times New Roman" w:cs="Times New Roman"/>
+          <w:lang w:val="es-ES"/>
+        </w:rPr>
+        <w:t>En definitiva, este proyecto ha sido una experiencia bastante beneficioso y lucrativo para el desarrollo de habilidades tan relevantes dentro del mercado del desarrollo web como PHP, MVC o JS.  Por otra parte, el haber desarrollado una aplicación en un entorno real, ha sido bastante interesante.</w:t>
+      </w:r>
+    </w:p>
+    <w:p>
+      <w:pPr>
+        <w:spacing w:line="360" w:lineRule="auto"/>
+        <w:jc w:val="both"/>
+        <w:rPr>
+          <w:rFonts w:ascii="Times New Roman" w:hAnsi="Times New Roman" w:cs="Times New Roman"/>
+          <w:lang w:val="es-ES"/>
+        </w:rPr>
+      </w:pPr>
+    </w:p>
+    <w:p>
+      <w:pPr>
+        <w:spacing w:line="360" w:lineRule="auto"/>
+        <w:jc w:val="both"/>
+        <w:rPr>
+          <w:rFonts w:ascii="Times New Roman" w:hAnsi="Times New Roman" w:cs="Times New Roman"/>
+          <w:lang w:val="es-ES"/>
+        </w:rPr>
+      </w:pPr>
+      <w:r>
+        <w:rPr>
+          <w:rFonts w:ascii="Times New Roman" w:hAnsi="Times New Roman" w:cs="Times New Roman"/>
+          <w:lang w:val="es-ES"/>
+        </w:rPr>
+        <w:lastRenderedPageBreak/>
+        <w:t>Con esta plataforma, se ha conseguido desarrollar un plataforma eficiente y sencilla para la gestión de campamentos infantiles.</w:t>
+      </w:r>
+    </w:p>
+    <w:p>
+      <w:pPr>
+        <w:spacing w:line="360" w:lineRule="auto"/>
+        <w:jc w:val="both"/>
+        <w:rPr>
+          <w:rFonts w:ascii="Times New Roman" w:hAnsi="Times New Roman" w:cs="Times New Roman"/>
+          <w:lang w:val="es-ES"/>
+        </w:rPr>
+      </w:pPr>
+    </w:p>
+    <w:p>
+      <w:pPr>
+        <w:spacing w:line="360" w:lineRule="auto"/>
+        <w:jc w:val="both"/>
+        <w:rPr>
+          <w:rFonts w:ascii="Times New Roman" w:hAnsi="Times New Roman" w:cs="Times New Roman"/>
+          <w:lang w:val="es-ES"/>
+        </w:rPr>
+      </w:pPr>
+    </w:p>
+    <w:p>
+      <w:pPr>
+        <w:spacing w:line="360" w:lineRule="auto"/>
+        <w:jc w:val="both"/>
+        <w:rPr>
+          <w:rFonts w:ascii="Times New Roman" w:hAnsi="Times New Roman" w:cs="Times New Roman"/>
+          <w:lang w:val="es-ES"/>
+        </w:rPr>
+      </w:pPr>
+    </w:p>
+    <w:p>
+      <w:pPr>
+        <w:spacing w:line="360" w:lineRule="auto"/>
+        <w:jc w:val="both"/>
+        <w:rPr>
+          <w:rFonts w:ascii="Times New Roman" w:hAnsi="Times New Roman" w:cs="Times New Roman"/>
+          <w:lang w:val="es-ES"/>
+        </w:rPr>
+      </w:pPr>
+    </w:p>
+    <w:p>
+      <w:pPr>
+        <w:spacing w:line="360" w:lineRule="auto"/>
+        <w:jc w:val="both"/>
+        <w:rPr>
+          <w:rFonts w:ascii="Times New Roman" w:hAnsi="Times New Roman" w:cs="Times New Roman"/>
+          <w:lang w:val="es-ES"/>
+        </w:rPr>
+      </w:pPr>
+    </w:p>
+    <w:p>
+      <w:pPr>
+        <w:spacing w:line="360" w:lineRule="auto"/>
+        <w:jc w:val="both"/>
+        <w:rPr>
+          <w:rFonts w:ascii="Times New Roman" w:hAnsi="Times New Roman" w:cs="Times New Roman"/>
+          <w:lang w:val="es-ES"/>
+        </w:rPr>
+      </w:pPr>
+    </w:p>
+    <w:p>
+      <w:pPr>
+        <w:pStyle w:val="Heading1"/>
+        <w:spacing w:line="360" w:lineRule="auto"/>
+        <w:jc w:val="both"/>
         <w:rPr>
           <w:rFonts w:ascii="Times New Roman" w:hAnsi="Times New Roman" w:cs="Times New Roman"/>
           <w:b/>
@@ -21222,6 +24473,178 @@
           <w:szCs w:val="32"/>
           <w:lang w:val="es-ES"/>
         </w:rPr>
+      </w:pPr>
+      <w:bookmarkStart w:id="17" w:name="_Toc189846489"/>
+    </w:p>
+    <w:p>
+      <w:pPr>
+        <w:pStyle w:val="Heading1"/>
+        <w:spacing w:line="360" w:lineRule="auto"/>
+        <w:jc w:val="both"/>
+        <w:rPr>
+          <w:rFonts w:ascii="Times New Roman" w:hAnsi="Times New Roman" w:cs="Times New Roman"/>
+          <w:b/>
+          <w:bCs/>
+          <w:sz w:val="32"/>
+          <w:szCs w:val="32"/>
+          <w:lang w:val="es-ES"/>
+        </w:rPr>
+      </w:pPr>
+    </w:p>
+    <w:p>
+      <w:pPr>
+        <w:pStyle w:val="Heading1"/>
+        <w:spacing w:line="360" w:lineRule="auto"/>
+        <w:jc w:val="both"/>
+        <w:rPr>
+          <w:rFonts w:ascii="Times New Roman" w:hAnsi="Times New Roman" w:cs="Times New Roman"/>
+          <w:b/>
+          <w:bCs/>
+          <w:sz w:val="32"/>
+          <w:szCs w:val="32"/>
+          <w:lang w:val="es-ES"/>
+        </w:rPr>
+      </w:pPr>
+    </w:p>
+    <w:p>
+      <w:pPr>
+        <w:pStyle w:val="Heading1"/>
+        <w:spacing w:line="360" w:lineRule="auto"/>
+        <w:jc w:val="both"/>
+        <w:rPr>
+          <w:rFonts w:ascii="Times New Roman" w:hAnsi="Times New Roman" w:cs="Times New Roman"/>
+          <w:b/>
+          <w:bCs/>
+          <w:sz w:val="32"/>
+          <w:szCs w:val="32"/>
+          <w:lang w:val="es-ES"/>
+        </w:rPr>
+      </w:pPr>
+    </w:p>
+    <w:p>
+      <w:pPr>
+        <w:pStyle w:val="Heading1"/>
+        <w:spacing w:line="360" w:lineRule="auto"/>
+        <w:jc w:val="both"/>
+        <w:rPr>
+          <w:rFonts w:ascii="Times New Roman" w:hAnsi="Times New Roman" w:cs="Times New Roman"/>
+          <w:b/>
+          <w:bCs/>
+          <w:sz w:val="32"/>
+          <w:szCs w:val="32"/>
+          <w:lang w:val="es-ES"/>
+        </w:rPr>
+      </w:pPr>
+    </w:p>
+    <w:p>
+      <w:pPr>
+        <w:pStyle w:val="Heading1"/>
+        <w:spacing w:line="360" w:lineRule="auto"/>
+        <w:jc w:val="both"/>
+        <w:rPr>
+          <w:rFonts w:ascii="Times New Roman" w:hAnsi="Times New Roman" w:cs="Times New Roman"/>
+          <w:b/>
+          <w:bCs/>
+          <w:sz w:val="32"/>
+          <w:szCs w:val="32"/>
+          <w:lang w:val="es-ES"/>
+        </w:rPr>
+      </w:pPr>
+    </w:p>
+    <w:p>
+      <w:pPr>
+        <w:pStyle w:val="Heading1"/>
+        <w:spacing w:line="360" w:lineRule="auto"/>
+        <w:jc w:val="both"/>
+        <w:rPr>
+          <w:rFonts w:ascii="Times New Roman" w:hAnsi="Times New Roman" w:cs="Times New Roman"/>
+          <w:b/>
+          <w:bCs/>
+          <w:sz w:val="32"/>
+          <w:szCs w:val="32"/>
+          <w:lang w:val="es-ES"/>
+        </w:rPr>
+      </w:pPr>
+    </w:p>
+    <w:p>
+      <w:pPr>
+        <w:pStyle w:val="Heading1"/>
+        <w:spacing w:line="360" w:lineRule="auto"/>
+        <w:jc w:val="both"/>
+        <w:rPr>
+          <w:rFonts w:ascii="Times New Roman" w:hAnsi="Times New Roman" w:cs="Times New Roman"/>
+          <w:b/>
+          <w:bCs/>
+          <w:sz w:val="32"/>
+          <w:szCs w:val="32"/>
+          <w:lang w:val="es-ES"/>
+        </w:rPr>
+      </w:pPr>
+    </w:p>
+    <w:p>
+      <w:pPr>
+        <w:pStyle w:val="Heading1"/>
+        <w:spacing w:line="360" w:lineRule="auto"/>
+        <w:jc w:val="both"/>
+        <w:rPr>
+          <w:rFonts w:ascii="Times New Roman" w:hAnsi="Times New Roman" w:cs="Times New Roman"/>
+          <w:b/>
+          <w:bCs/>
+          <w:sz w:val="32"/>
+          <w:szCs w:val="32"/>
+          <w:lang w:val="es-ES"/>
+        </w:rPr>
+      </w:pPr>
+    </w:p>
+    <w:p>
+      <w:pPr>
+        <w:rPr>
+          <w:lang w:val="es-ES"/>
+        </w:rPr>
+      </w:pPr>
+    </w:p>
+    <w:p>
+      <w:pPr>
+        <w:rPr>
+          <w:lang w:val="es-ES"/>
+        </w:rPr>
+      </w:pPr>
+    </w:p>
+    <w:p>
+      <w:pPr>
+        <w:pStyle w:val="Heading1"/>
+        <w:spacing w:line="360" w:lineRule="auto"/>
+        <w:jc w:val="both"/>
+        <w:rPr>
+          <w:rFonts w:ascii="Times New Roman" w:hAnsi="Times New Roman" w:cs="Times New Roman"/>
+          <w:b/>
+          <w:bCs/>
+          <w:sz w:val="32"/>
+          <w:szCs w:val="32"/>
+          <w:lang w:val="es-ES"/>
+        </w:rPr>
+      </w:pPr>
+      <w:r>
+        <w:rPr>
+          <w:rFonts w:ascii="Times New Roman" w:hAnsi="Times New Roman" w:cs="Times New Roman"/>
+          <w:b/>
+          <w:bCs/>
+          <w:sz w:val="32"/>
+          <w:szCs w:val="32"/>
+          <w:lang w:val="es-ES"/>
+        </w:rPr>
+        <w:lastRenderedPageBreak/>
+        <w:t>A</w:t>
+      </w:r>
+      <w:r>
+        <w:rPr>
+          <w:rFonts w:ascii="Times New Roman" w:hAnsi="Times New Roman" w:cs="Times New Roman"/>
+          <w:b/>
+          <w:bCs/>
+          <w:sz w:val="32"/>
+          <w:szCs w:val="32"/>
+          <w:lang w:val="es-ES"/>
+        </w:rPr>
         <w:t>nexos</w:t>
       </w:r>
       <w:bookmarkStart w:id="18" w:name="_Toc189846490"/>
@@ -21332,15 +24755,7 @@
           <w:rFonts w:ascii="Times New Roman" w:hAnsi="Times New Roman" w:cs="Times New Roman"/>
           <w:lang w:val="es-ES"/>
         </w:rPr>
-        <w:t xml:space="preserve">Por </w:t>
-      </w:r>
-      <w:r>
-        <w:rPr>
-          <w:rFonts w:ascii="Times New Roman" w:hAnsi="Times New Roman" w:cs="Times New Roman"/>
-          <w:lang w:val="es-ES"/>
-        </w:rPr>
-        <w:lastRenderedPageBreak/>
-        <w:t>otra parte, han sido insertados varios .</w:t>
+        <w:t>Por otra parte, han sido insertados varios .</w:t>
       </w:r>
       <w:proofErr w:type="spellStart"/>
       <w:r>
@@ -21449,7 +24864,7 @@
           <w:lang w:val="es-ES"/>
         </w:rPr>
         <w:drawing>
-          <wp:inline distT="0" distB="0" distL="0" distR="0" wp14:anchorId="56EC2BF2" wp14:editId="4B5F853C">
+          <wp:inline distT="0" distB="0" distL="0" distR="0" wp14:anchorId="56EC2BF2" wp14:editId="3E19A89F">
             <wp:extent cx="5739483" cy="2834640"/>
             <wp:effectExtent l="0" t="0" r="1270" b="0"/>
             <wp:docPr id="1521730561" name="Picture 1" descr="A screenshot of a computer program&#10;&#10;Description automatically generated"/>
@@ -21581,6 +24996,7 @@
           <w:bCs/>
           <w:lang w:val="es-ES"/>
         </w:rPr>
+        <w:lastRenderedPageBreak/>
         <w:t>DirectoryIndex</w:t>
       </w:r>
       <w:proofErr w:type="spellEnd"/>
@@ -21762,7 +25178,6 @@
           <w:bCs/>
           <w:lang w:val="es-ES"/>
         </w:rPr>
-        <w:lastRenderedPageBreak/>
         <w:t>ErrorDocument</w:t>
       </w:r>
       <w:proofErr w:type="spellEnd"/>
@@ -21961,7 +25376,7 @@
           <w:lang w:val="es-ES"/>
         </w:rPr>
         <w:drawing>
-          <wp:inline distT="0" distB="0" distL="0" distR="0" wp14:anchorId="33ECE28B" wp14:editId="75D01917">
+          <wp:inline distT="0" distB="0" distL="0" distR="0" wp14:anchorId="33ECE28B" wp14:editId="024221DC">
             <wp:extent cx="5398770" cy="1061085"/>
             <wp:effectExtent l="0" t="0" r="0" b="5715"/>
             <wp:docPr id="1224674290" name="Picture 2" descr="A computer screen with white text&#10;&#10;Description automatically generated"/>
@@ -22097,7 +25512,7 @@
           <w:lang w:val="es-ES"/>
         </w:rPr>
         <w:drawing>
-          <wp:inline distT="0" distB="0" distL="0" distR="0" wp14:anchorId="369DCB05" wp14:editId="4C5F0F05">
+          <wp:inline distT="0" distB="0" distL="0" distR="0" wp14:anchorId="369DCB05" wp14:editId="3F06C862">
             <wp:extent cx="5398770" cy="643890"/>
             <wp:effectExtent l="0" t="0" r="0" b="3810"/>
             <wp:docPr id="1058945197" name="Picture 3"/>
@@ -22163,6 +25578,7 @@
           <w:rFonts w:ascii="Times New Roman" w:hAnsi="Times New Roman" w:cs="Times New Roman"/>
           <w:lang w:val="es-ES"/>
         </w:rPr>
+        <w:lastRenderedPageBreak/>
         <w:t>Después</w:t>
       </w:r>
       <w:r>
@@ -22298,7 +25714,6 @@
           <w:rFonts w:ascii="Times New Roman" w:hAnsi="Times New Roman" w:cs="Times New Roman"/>
           <w:lang w:val="es-ES"/>
         </w:rPr>
-        <w:lastRenderedPageBreak/>
         <w:t xml:space="preserve">Una vez </w:t>
       </w:r>
       <w:r>
@@ -23821,6 +27236,95 @@
     </w:lvl>
   </w:abstractNum>
   <w:abstractNum w:abstractNumId="12" w15:restartNumberingAfterBreak="0">
+    <w:nsid w:val="2D2340DA"/>
+    <w:multiLevelType w:val="hybridMultilevel"/>
+    <w:tmpl w:val="41ACB8E4"/>
+    <w:lvl w:ilvl="0" w:tplc="0409000F">
+      <w:start w:val="1"/>
+      <w:numFmt w:val="decimal"/>
+      <w:lvlText w:val="%1."/>
+      <w:lvlJc w:val="left"/>
+      <w:pPr>
+        <w:ind w:left="720" w:hanging="360"/>
+      </w:pPr>
+      <w:rPr>
+        <w:rFonts w:hint="default"/>
+      </w:rPr>
+    </w:lvl>
+    <w:lvl w:ilvl="1" w:tplc="04090019" w:tentative="1">
+      <w:start w:val="1"/>
+      <w:numFmt w:val="lowerLetter"/>
+      <w:lvlText w:val="%2."/>
+      <w:lvlJc w:val="left"/>
+      <w:pPr>
+        <w:ind w:left="1440" w:hanging="360"/>
+      </w:pPr>
+    </w:lvl>
+    <w:lvl w:ilvl="2" w:tplc="0409001B" w:tentative="1">
+      <w:start w:val="1"/>
+      <w:numFmt w:val="lowerRoman"/>
+      <w:lvlText w:val="%3."/>
+      <w:lvlJc w:val="right"/>
+      <w:pPr>
+        <w:ind w:left="2160" w:hanging="180"/>
+      </w:pPr>
+    </w:lvl>
+    <w:lvl w:ilvl="3" w:tplc="0409000F" w:tentative="1">
+      <w:start w:val="1"/>
+      <w:numFmt w:val="decimal"/>
+      <w:lvlText w:val="%4."/>
+      <w:lvlJc w:val="left"/>
+      <w:pPr>
+        <w:ind w:left="2880" w:hanging="360"/>
+      </w:pPr>
+    </w:lvl>
+    <w:lvl w:ilvl="4" w:tplc="04090019" w:tentative="1">
+      <w:start w:val="1"/>
+      <w:numFmt w:val="lowerLetter"/>
+      <w:lvlText w:val="%5."/>
+      <w:lvlJc w:val="left"/>
+      <w:pPr>
+        <w:ind w:left="3600" w:hanging="360"/>
+      </w:pPr>
+    </w:lvl>
+    <w:lvl w:ilvl="5" w:tplc="0409001B" w:tentative="1">
+      <w:start w:val="1"/>
+      <w:numFmt w:val="lowerRoman"/>
+      <w:lvlText w:val="%6."/>
+      <w:lvlJc w:val="right"/>
+      <w:pPr>
+        <w:ind w:left="4320" w:hanging="180"/>
+      </w:pPr>
+    </w:lvl>
+    <w:lvl w:ilvl="6" w:tplc="0409000F" w:tentative="1">
+      <w:start w:val="1"/>
+      <w:numFmt w:val="decimal"/>
+      <w:lvlText w:val="%7."/>
+      <w:lvlJc w:val="left"/>
+      <w:pPr>
+        <w:ind w:left="5040" w:hanging="360"/>
+      </w:pPr>
+    </w:lvl>
+    <w:lvl w:ilvl="7" w:tplc="04090019" w:tentative="1">
+      <w:start w:val="1"/>
+      <w:numFmt w:val="lowerLetter"/>
+      <w:lvlText w:val="%8."/>
+      <w:lvlJc w:val="left"/>
+      <w:pPr>
+        <w:ind w:left="5760" w:hanging="360"/>
+      </w:pPr>
+    </w:lvl>
+    <w:lvl w:ilvl="8" w:tplc="0409001B" w:tentative="1">
+      <w:start w:val="1"/>
+      <w:numFmt w:val="lowerRoman"/>
+      <w:lvlText w:val="%9."/>
+      <w:lvlJc w:val="right"/>
+      <w:pPr>
+        <w:ind w:left="6480" w:hanging="180"/>
+      </w:pPr>
+    </w:lvl>
+  </w:abstractNum>
+  <w:abstractNum w:abstractNumId="13" w15:restartNumberingAfterBreak="0">
     <w:nsid w:val="2EF36D4A"/>
     <w:multiLevelType w:val="hybridMultilevel"/>
     <w:tmpl w:val="18D63482"/>
@@ -23933,7 +27437,7 @@
       </w:rPr>
     </w:lvl>
   </w:abstractNum>
-  <w:abstractNum w:abstractNumId="13" w15:restartNumberingAfterBreak="0">
+  <w:abstractNum w:abstractNumId="14" w15:restartNumberingAfterBreak="0">
     <w:nsid w:val="318A3266"/>
     <w:multiLevelType w:val="multilevel"/>
     <w:tmpl w:val="C522259E"/>
@@ -24077,7 +27581,7 @@
       </w:rPr>
     </w:lvl>
   </w:abstractNum>
-  <w:abstractNum w:abstractNumId="14" w15:restartNumberingAfterBreak="0">
+  <w:abstractNum w:abstractNumId="15" w15:restartNumberingAfterBreak="0">
     <w:nsid w:val="31C6439F"/>
     <w:multiLevelType w:val="multilevel"/>
     <w:tmpl w:val="DEE8ED20"/>
@@ -24226,7 +27730,7 @@
       </w:rPr>
     </w:lvl>
   </w:abstractNum>
-  <w:abstractNum w:abstractNumId="15" w15:restartNumberingAfterBreak="0">
+  <w:abstractNum w:abstractNumId="16" w15:restartNumberingAfterBreak="0">
     <w:nsid w:val="3AFD3C31"/>
     <w:multiLevelType w:val="hybridMultilevel"/>
     <w:tmpl w:val="D8084A10"/>
@@ -24312,7 +27816,7 @@
       </w:pPr>
     </w:lvl>
   </w:abstractNum>
-  <w:abstractNum w:abstractNumId="16" w15:restartNumberingAfterBreak="0">
+  <w:abstractNum w:abstractNumId="17" w15:restartNumberingAfterBreak="0">
     <w:nsid w:val="40257C4A"/>
     <w:multiLevelType w:val="multilevel"/>
     <w:tmpl w:val="C522259E"/>
@@ -24456,7 +27960,7 @@
       </w:rPr>
     </w:lvl>
   </w:abstractNum>
-  <w:abstractNum w:abstractNumId="17" w15:restartNumberingAfterBreak="0">
+  <w:abstractNum w:abstractNumId="18" w15:restartNumberingAfterBreak="0">
     <w:nsid w:val="4090202B"/>
     <w:multiLevelType w:val="hybridMultilevel"/>
     <w:tmpl w:val="82F21156"/>
@@ -24569,7 +28073,7 @@
       </w:rPr>
     </w:lvl>
   </w:abstractNum>
-  <w:abstractNum w:abstractNumId="18" w15:restartNumberingAfterBreak="0">
+  <w:abstractNum w:abstractNumId="19" w15:restartNumberingAfterBreak="0">
     <w:nsid w:val="4A7E09AA"/>
     <w:multiLevelType w:val="hybridMultilevel"/>
     <w:tmpl w:val="01380ABE"/>
@@ -24682,7 +28186,7 @@
       </w:rPr>
     </w:lvl>
   </w:abstractNum>
-  <w:abstractNum w:abstractNumId="19" w15:restartNumberingAfterBreak="0">
+  <w:abstractNum w:abstractNumId="20" w15:restartNumberingAfterBreak="0">
     <w:nsid w:val="4E671848"/>
     <w:multiLevelType w:val="hybridMultilevel"/>
     <w:tmpl w:val="73D4FF80"/>
@@ -24795,7 +28299,7 @@
       </w:rPr>
     </w:lvl>
   </w:abstractNum>
-  <w:abstractNum w:abstractNumId="20" w15:restartNumberingAfterBreak="0">
+  <w:abstractNum w:abstractNumId="21" w15:restartNumberingAfterBreak="0">
     <w:nsid w:val="4EB706F5"/>
     <w:multiLevelType w:val="multilevel"/>
     <w:tmpl w:val="06D8D820"/>
@@ -24944,7 +28448,7 @@
       </w:rPr>
     </w:lvl>
   </w:abstractNum>
-  <w:abstractNum w:abstractNumId="21" w15:restartNumberingAfterBreak="0">
+  <w:abstractNum w:abstractNumId="22" w15:restartNumberingAfterBreak="0">
     <w:nsid w:val="54DB25FA"/>
     <w:multiLevelType w:val="hybridMultilevel"/>
     <w:tmpl w:val="866691F0"/>
@@ -25056,7 +28560,7 @@
       </w:rPr>
     </w:lvl>
   </w:abstractNum>
-  <w:abstractNum w:abstractNumId="22" w15:restartNumberingAfterBreak="0">
+  <w:abstractNum w:abstractNumId="23" w15:restartNumberingAfterBreak="0">
     <w:nsid w:val="57AF1F24"/>
     <w:multiLevelType w:val="hybridMultilevel"/>
     <w:tmpl w:val="BFDA9F36"/>
@@ -25169,7 +28673,7 @@
       </w:rPr>
     </w:lvl>
   </w:abstractNum>
-  <w:abstractNum w:abstractNumId="23" w15:restartNumberingAfterBreak="0">
+  <w:abstractNum w:abstractNumId="24" w15:restartNumberingAfterBreak="0">
     <w:nsid w:val="58393CFD"/>
     <w:multiLevelType w:val="multilevel"/>
     <w:tmpl w:val="C522259E"/>
@@ -25313,7 +28817,7 @@
       </w:rPr>
     </w:lvl>
   </w:abstractNum>
-  <w:abstractNum w:abstractNumId="24" w15:restartNumberingAfterBreak="0">
+  <w:abstractNum w:abstractNumId="25" w15:restartNumberingAfterBreak="0">
     <w:nsid w:val="5CC417F7"/>
     <w:multiLevelType w:val="hybridMultilevel"/>
     <w:tmpl w:val="06AAEAA4"/>
@@ -25399,7 +28903,7 @@
       </w:pPr>
     </w:lvl>
   </w:abstractNum>
-  <w:abstractNum w:abstractNumId="25" w15:restartNumberingAfterBreak="0">
+  <w:abstractNum w:abstractNumId="26" w15:restartNumberingAfterBreak="0">
     <w:nsid w:val="62812C2F"/>
     <w:multiLevelType w:val="hybridMultilevel"/>
     <w:tmpl w:val="81C00E5C"/>
@@ -25512,7 +29016,7 @@
       </w:rPr>
     </w:lvl>
   </w:abstractNum>
-  <w:abstractNum w:abstractNumId="26" w15:restartNumberingAfterBreak="0">
+  <w:abstractNum w:abstractNumId="27" w15:restartNumberingAfterBreak="0">
     <w:nsid w:val="64E27D10"/>
     <w:multiLevelType w:val="hybridMultilevel"/>
     <w:tmpl w:val="55F032D0"/>
@@ -25625,7 +29129,7 @@
       </w:rPr>
     </w:lvl>
   </w:abstractNum>
-  <w:abstractNum w:abstractNumId="27" w15:restartNumberingAfterBreak="0">
+  <w:abstractNum w:abstractNumId="28" w15:restartNumberingAfterBreak="0">
     <w:nsid w:val="656F2A6D"/>
     <w:multiLevelType w:val="hybridMultilevel"/>
     <w:tmpl w:val="8A66FB76"/>
@@ -25738,7 +29242,7 @@
       </w:rPr>
     </w:lvl>
   </w:abstractNum>
-  <w:abstractNum w:abstractNumId="28" w15:restartNumberingAfterBreak="0">
+  <w:abstractNum w:abstractNumId="29" w15:restartNumberingAfterBreak="0">
     <w:nsid w:val="69342E79"/>
     <w:multiLevelType w:val="hybridMultilevel"/>
     <w:tmpl w:val="1CDEFB2C"/>
@@ -25851,7 +29355,7 @@
       </w:rPr>
     </w:lvl>
   </w:abstractNum>
-  <w:abstractNum w:abstractNumId="29" w15:restartNumberingAfterBreak="0">
+  <w:abstractNum w:abstractNumId="30" w15:restartNumberingAfterBreak="0">
     <w:nsid w:val="6C280225"/>
     <w:multiLevelType w:val="multilevel"/>
     <w:tmpl w:val="C522259E"/>
@@ -25995,7 +29499,7 @@
       </w:rPr>
     </w:lvl>
   </w:abstractNum>
-  <w:abstractNum w:abstractNumId="30" w15:restartNumberingAfterBreak="0">
+  <w:abstractNum w:abstractNumId="31" w15:restartNumberingAfterBreak="0">
     <w:nsid w:val="75EA506C"/>
     <w:multiLevelType w:val="hybridMultilevel"/>
     <w:tmpl w:val="144CE920"/>
@@ -26108,7 +29612,7 @@
       </w:rPr>
     </w:lvl>
   </w:abstractNum>
-  <w:abstractNum w:abstractNumId="31" w15:restartNumberingAfterBreak="0">
+  <w:abstractNum w:abstractNumId="32" w15:restartNumberingAfterBreak="0">
     <w:nsid w:val="762F48D7"/>
     <w:multiLevelType w:val="hybridMultilevel"/>
     <w:tmpl w:val="5ABE8EF8"/>
@@ -26199,10 +29703,10 @@
     </w:lvl>
   </w:abstractNum>
   <w:num w:numId="1" w16cid:durableId="1447772579">
-    <w:abstractNumId w:val="14"/>
+    <w:abstractNumId w:val="15"/>
   </w:num>
   <w:num w:numId="2" w16cid:durableId="1629169022">
-    <w:abstractNumId w:val="20"/>
+    <w:abstractNumId w:val="21"/>
   </w:num>
   <w:num w:numId="3" w16cid:durableId="2115899246">
     <w:abstractNumId w:val="7"/>
@@ -26214,43 +29718,43 @@
     <w:abstractNumId w:val="11"/>
   </w:num>
   <w:num w:numId="6" w16cid:durableId="2051296251">
-    <w:abstractNumId w:val="21"/>
+    <w:abstractNumId w:val="22"/>
   </w:num>
   <w:num w:numId="7" w16cid:durableId="1455363945">
-    <w:abstractNumId w:val="16"/>
+    <w:abstractNumId w:val="17"/>
   </w:num>
   <w:num w:numId="8" w16cid:durableId="931157716">
-    <w:abstractNumId w:val="23"/>
+    <w:abstractNumId w:val="24"/>
   </w:num>
   <w:num w:numId="9" w16cid:durableId="1011033584">
     <w:abstractNumId w:val="5"/>
   </w:num>
   <w:num w:numId="10" w16cid:durableId="697849409">
-    <w:abstractNumId w:val="13"/>
+    <w:abstractNumId w:val="14"/>
   </w:num>
   <w:num w:numId="11" w16cid:durableId="1212041316">
-    <w:abstractNumId w:val="29"/>
+    <w:abstractNumId w:val="30"/>
   </w:num>
   <w:num w:numId="12" w16cid:durableId="333266316">
-    <w:abstractNumId w:val="25"/>
+    <w:abstractNumId w:val="26"/>
   </w:num>
   <w:num w:numId="13" w16cid:durableId="1283806426">
+    <w:abstractNumId w:val="28"/>
+  </w:num>
+  <w:num w:numId="14" w16cid:durableId="795412518">
+    <w:abstractNumId w:val="23"/>
+  </w:num>
+  <w:num w:numId="15" w16cid:durableId="442309502">
     <w:abstractNumId w:val="27"/>
   </w:num>
-  <w:num w:numId="14" w16cid:durableId="795412518">
-    <w:abstractNumId w:val="22"/>
-  </w:num>
-  <w:num w:numId="15" w16cid:durableId="442309502">
-    <w:abstractNumId w:val="26"/>
-  </w:num>
   <w:num w:numId="16" w16cid:durableId="898899577">
-    <w:abstractNumId w:val="15"/>
+    <w:abstractNumId w:val="16"/>
   </w:num>
   <w:num w:numId="17" w16cid:durableId="780881516">
     <w:abstractNumId w:val="10"/>
   </w:num>
   <w:num w:numId="18" w16cid:durableId="1569612492">
-    <w:abstractNumId w:val="28"/>
+    <w:abstractNumId w:val="29"/>
   </w:num>
   <w:num w:numId="19" w16cid:durableId="1580022003">
     <w:abstractNumId w:val="3"/>
@@ -26259,19 +29763,19 @@
     <w:abstractNumId w:val="8"/>
   </w:num>
   <w:num w:numId="21" w16cid:durableId="1844931329">
-    <w:abstractNumId w:val="24"/>
+    <w:abstractNumId w:val="25"/>
   </w:num>
   <w:num w:numId="22" w16cid:durableId="1006833237">
     <w:abstractNumId w:val="9"/>
   </w:num>
   <w:num w:numId="23" w16cid:durableId="802307545">
-    <w:abstractNumId w:val="30"/>
+    <w:abstractNumId w:val="31"/>
   </w:num>
   <w:num w:numId="24" w16cid:durableId="1021854729">
-    <w:abstractNumId w:val="19"/>
+    <w:abstractNumId w:val="20"/>
   </w:num>
   <w:num w:numId="25" w16cid:durableId="212155476">
-    <w:abstractNumId w:val="12"/>
+    <w:abstractNumId w:val="13"/>
   </w:num>
   <w:num w:numId="26" w16cid:durableId="16809948">
     <w:abstractNumId w:val="1"/>
@@ -26280,7 +29784,7 @@
     <w:abstractNumId w:val="2"/>
   </w:num>
   <w:num w:numId="28" w16cid:durableId="1441221667">
-    <w:abstractNumId w:val="31"/>
+    <w:abstractNumId w:val="32"/>
   </w:num>
   <w:num w:numId="29" w16cid:durableId="404227670">
     <w:abstractNumId w:val="4"/>
@@ -26289,10 +29793,13 @@
     <w:abstractNumId w:val="0"/>
   </w:num>
   <w:num w:numId="31" w16cid:durableId="1919484872">
+    <w:abstractNumId w:val="19"/>
+  </w:num>
+  <w:num w:numId="32" w16cid:durableId="460736381">
     <w:abstractNumId w:val="18"/>
   </w:num>
-  <w:num w:numId="32" w16cid:durableId="460736381">
-    <w:abstractNumId w:val="17"/>
+  <w:num w:numId="33" w16cid:durableId="697004146">
+    <w:abstractNumId w:val="12"/>
   </w:num>
 </w:numbering>
 </file>
@@ -26894,7 +30401,6 @@
   <w:style w:type="character" w:default="1" w:styleId="DefaultParagraphFont">
     <w:name w:val="Default Paragraph Font"/>
     <w:uiPriority w:val="1"/>
-    <w:semiHidden/>
     <w:unhideWhenUsed/>
   </w:style>
   <w:style w:type="table" w:default="1" w:styleId="TableNormal">

</xml_diff>

<commit_message>
Bugfix: Descripción de tabla Schedule corregida
</commit_message>
<xml_diff>
--- a/documentacion/memoria_pi_danielcorreavilla.docx
+++ b/documentacion/memoria_pi_danielcorreavilla.docx
@@ -15826,6 +15826,15 @@
         </w:rPr>
         <w:t>SCHEDULE</w:t>
       </w:r>
+      <w:r>
+        <w:rPr>
+          <w:rFonts w:ascii="Times New Roman" w:hAnsi="Times New Roman" w:cs="Times New Roman"/>
+          <w:b/>
+          <w:bCs/>
+          <w:lang w:val="es-ES"/>
+        </w:rPr>
+        <w:t>_PARTICIPANTS / SCHEDULE_MONITORS</w:t>
+      </w:r>
     </w:p>
     <w:tbl>
       <w:tblPr>
@@ -15837,10 +15846,10 @@
         <w:tblLook w:val="04A0" w:firstRow="1" w:lastRow="0" w:firstColumn="1" w:lastColumn="0" w:noHBand="0" w:noVBand="1"/>
       </w:tblPr>
       <w:tblGrid>
-        <w:gridCol w:w="1756"/>
-        <w:gridCol w:w="1864"/>
-        <w:gridCol w:w="3240"/>
-        <w:gridCol w:w="1626"/>
+        <w:gridCol w:w="2354"/>
+        <w:gridCol w:w="1664"/>
+        <w:gridCol w:w="3041"/>
+        <w:gridCol w:w="1427"/>
       </w:tblGrid>
       <w:tr>
         <w:trPr>
@@ -16439,6 +16448,28 @@
                 <w:szCs w:val="20"/>
               </w:rPr>
               <w:t>participant_id</w:t>
+            </w:r>
+            <w:proofErr w:type="spellEnd"/>
+            <w:r>
+              <w:rPr>
+                <w:rFonts w:ascii="Times New Roman" w:hAnsi="Times New Roman" w:cs="Times New Roman"/>
+                <w:b/>
+                <w:bCs/>
+                <w:sz w:val="20"/>
+                <w:szCs w:val="20"/>
+              </w:rPr>
+              <w:t>/</w:t>
+            </w:r>
+            <w:proofErr w:type="spellStart"/>
+            <w:r>
+              <w:rPr>
+                <w:rFonts w:ascii="Times New Roman" w:hAnsi="Times New Roman" w:cs="Times New Roman"/>
+                <w:b/>
+                <w:bCs/>
+                <w:sz w:val="20"/>
+                <w:szCs w:val="20"/>
+              </w:rPr>
+              <w:t>monitor_id</w:t>
             </w:r>
             <w:proofErr w:type="spellEnd"/>
           </w:p>
@@ -18238,7 +18269,6 @@
           <w:bCs/>
           <w:lang w:val="es-ES"/>
         </w:rPr>
-        <w:lastRenderedPageBreak/>
         <w:t>Gestión de contenidos (</w:t>
       </w:r>
       <w:proofErr w:type="spellStart"/>
@@ -19569,7 +19599,6 @@
           <w:szCs w:val="32"/>
           <w:lang w:val="es-ES"/>
         </w:rPr>
-        <w:lastRenderedPageBreak/>
         <w:t>Desarrollo de la aplicación</w:t>
       </w:r>
       <w:bookmarkEnd w:id="10"/>
@@ -19992,6 +20021,7 @@
           <w:rFonts w:ascii="Times New Roman" w:hAnsi="Times New Roman" w:cs="Times New Roman"/>
           <w:lang w:val="es-ES"/>
         </w:rPr>
+        <w:lastRenderedPageBreak/>
         <w:t>Mantener un código más limpio y estructurado, mejorando la escalabilidad y el mantenimiento.</w:t>
       </w:r>
     </w:p>
@@ -20019,7 +20049,6 @@
           <w:szCs w:val="28"/>
           <w:lang w:val="es-ES"/>
         </w:rPr>
-        <w:lastRenderedPageBreak/>
         <w:t xml:space="preserve">Entorno de </w:t>
       </w:r>
       <w:r>
@@ -20367,7 +20396,6 @@
           <w:szCs w:val="28"/>
           <w:lang w:val="es-ES"/>
         </w:rPr>
-        <w:lastRenderedPageBreak/>
         <w:t>Gestión de roles en la aplicación</w:t>
       </w:r>
     </w:p>
@@ -22098,7 +22126,6 @@
           <w:szCs w:val="32"/>
           <w:lang w:val="es-ES"/>
         </w:rPr>
-        <w:lastRenderedPageBreak/>
         <w:t>Desarrollo e implementación</w:t>
       </w:r>
       <w:bookmarkEnd w:id="14"/>
@@ -22207,6 +22234,7 @@
           <w:noProof/>
           <w:lang w:val="es-ES"/>
         </w:rPr>
+        <w:lastRenderedPageBreak/>
         <w:drawing>
           <wp:anchor distT="0" distB="0" distL="114300" distR="114300" simplePos="0" relativeHeight="251659264" behindDoc="0" locked="0" layoutInCell="1" allowOverlap="1" wp14:anchorId="660C2B27" wp14:editId="7AD060FD">
             <wp:simplePos x="0" y="0"/>
@@ -22288,7 +22316,6 @@
           <w:szCs w:val="28"/>
           <w:lang w:val="es-ES"/>
         </w:rPr>
-        <w:lastRenderedPageBreak/>
         <w:t>Diagrama de modelo relacional</w:t>
       </w:r>
       <w:bookmarkEnd w:id="16"/>
@@ -22345,6 +22372,7 @@
           <w:szCs w:val="32"/>
           <w:lang w:val="es-ES"/>
         </w:rPr>
+        <w:lastRenderedPageBreak/>
         <w:drawing>
           <wp:anchor distT="0" distB="0" distL="114300" distR="114300" simplePos="0" relativeHeight="251664384" behindDoc="0" locked="0" layoutInCell="1" allowOverlap="1" wp14:anchorId="0CA256E6" wp14:editId="262E4AF6">
             <wp:simplePos x="0" y="0"/>
@@ -22479,7 +22507,6 @@
           <w:szCs w:val="28"/>
           <w:lang w:val="es-ES"/>
         </w:rPr>
-        <w:lastRenderedPageBreak/>
         <w:t xml:space="preserve">Diagrama de </w:t>
       </w:r>
       <w:r>

</xml_diff>